<commit_message>
Documenta matriz inicial de pruebas fase 11
</commit_message>
<xml_diff>
--- a/docs/3. Módulo Matrices de Riesgos/Fase 11 - Pruebas integrales y control de calidad/Fase_11_Pruebas_Integrales_Control_Calidad_Matrices_Riesgos_SGRLA_IHSS.docx
+++ b/docs/3. Módulo Matrices de Riesgos/Fase 11 - Pruebas integrales y control de calidad/Fase_11_Pruebas_Integrales_Control_Calidad_Matrices_Riesgos_SGRLA_IHSS.docx
@@ -9,10 +9,10 @@
       <w:r>
         <w:rPr>
           <w:b/>
-          <w:color w:val="1F3F8D"/>
-          <w:sz w:val="34"/>
+          <w:color w:val="1E3A8A"/>
+          <w:sz w:val="32"/>
         </w:rPr>
-        <w:t>Fase 11. Pruebas Integrales y Control de Calidad</w:t>
+        <w:t>Fase 11 - Pruebas integrales y control de calidad</w:t>
       </w:r>
     </w:p>
     <w:p>
@@ -21,10 +21,9 @@
       </w:pPr>
       <w:r>
         <w:rPr>
-          <w:color w:val="4B5563"/>
-          <w:sz w:val="24"/>
+          <w:b/>
         </w:rPr>
-        <w:t>Módulo 3. Matrices de Riesgos - SGRLA/FT IHSS</w:t>
+        <w:t>Módulo 3. Matrices de Riesgos - SGRLA-IHSS</w:t>
       </w:r>
     </w:p>
     <w:tbl>
@@ -35,45 +34,85 @@
         <w:tblLook w:firstColumn="1" w:firstRow="1" w:lastColumn="0" w:lastRow="0" w:noHBand="0" w:noVBand="1" w:val="04A0"/>
       </w:tblPr>
       <w:tblGrid>
-        <w:gridCol w:w="4680"/>
-        <w:gridCol w:w="4680"/>
+        <w:gridCol w:w="3564"/>
+        <w:gridCol w:w="3564"/>
+        <w:gridCol w:w="3564"/>
+        <w:gridCol w:w="3564"/>
       </w:tblGrid>
       <w:tr>
         <w:tc>
           <w:tcPr>
-            <w:tcW w:type="dxa" w:w="2592"/>
-            <w:vAlign w:val="center"/>
-            <w:shd w:fill="1F3F8D"/>
+            <w:tcW w:type="dxa" w:w="3564"/>
+            <w:vAlign w:val="top"/>
           </w:tcPr>
           <w:p>
+            <w:pPr>
+              <w:jc w:val="left"/>
+            </w:pPr>
             <w:r/>
             <w:r>
               <w:rPr>
-                <w:rFonts w:ascii="Calibri" w:hAnsi="Calibri"/>
                 <w:b/>
-                <w:color w:val="FFFFFF"/>
-                <w:sz w:val="18"/>
+                <w:sz w:val="16"/>
               </w:rPr>
-              <w:t>Campo</w:t>
+              <w:t>Versión</w:t>
             </w:r>
           </w:p>
         </w:tc>
         <w:tc>
           <w:tcPr>
-            <w:tcW w:type="dxa" w:w="6768"/>
-            <w:vAlign w:val="center"/>
-            <w:shd w:fill="1F3F8D"/>
+            <w:tcW w:type="dxa" w:w="3564"/>
+            <w:vAlign w:val="top"/>
           </w:tcPr>
           <w:p>
+            <w:pPr>
+              <w:jc w:val="left"/>
+            </w:pPr>
             <w:r/>
             <w:r>
               <w:rPr>
-                <w:rFonts w:ascii="Calibri" w:hAnsi="Calibri"/>
+                <w:b w:val="0"/>
+                <w:sz w:val="16"/>
+              </w:rPr>
+              <w:t>1.1</w:t>
+            </w:r>
+          </w:p>
+        </w:tc>
+        <w:tc>
+          <w:tcPr>
+            <w:tcW w:type="dxa" w:w="3564"/>
+            <w:vAlign w:val="top"/>
+          </w:tcPr>
+          <w:p>
+            <w:pPr>
+              <w:jc w:val="left"/>
+            </w:pPr>
+            <w:r/>
+            <w:r>
+              <w:rPr>
                 <w:b/>
-                <w:color w:val="FFFFFF"/>
-                <w:sz w:val="18"/>
+                <w:sz w:val="16"/>
               </w:rPr>
-              <w:t>Detalle</w:t>
+              <w:t>Fecha</w:t>
+            </w:r>
+          </w:p>
+        </w:tc>
+        <w:tc>
+          <w:tcPr>
+            <w:tcW w:type="dxa" w:w="3564"/>
+            <w:vAlign w:val="top"/>
+          </w:tcPr>
+          <w:p>
+            <w:pPr>
+              <w:jc w:val="left"/>
+            </w:pPr>
+            <w:r/>
+            <w:r>
+              <w:rPr>
+                <w:b w:val="0"/>
+                <w:sz w:val="16"/>
+              </w:rPr>
+              <w:t>17/07/2026</w:t>
             </w:r>
           </w:p>
         </w:tc>
@@ -81,88 +120,18 @@
       <w:tr>
         <w:tc>
           <w:tcPr>
-            <w:tcW w:type="dxa" w:w="2592"/>
-            <w:vAlign w:val="center"/>
+            <w:tcW w:type="dxa" w:w="3564"/>
+            <w:vAlign w:val="top"/>
           </w:tcPr>
           <w:p>
+            <w:pPr>
+              <w:jc w:val="left"/>
+            </w:pPr>
             <w:r/>
             <w:r>
               <w:rPr>
-                <w:rFonts w:ascii="Calibri" w:hAnsi="Calibri"/>
-                <w:b w:val="0"/>
-                <w:sz w:val="18"/>
-              </w:rPr>
-              <w:t>Documento</w:t>
-            </w:r>
-          </w:p>
-        </w:tc>
-        <w:tc>
-          <w:tcPr>
-            <w:tcW w:type="dxa" w:w="6768"/>
-            <w:vAlign w:val="center"/>
-          </w:tcPr>
-          <w:p>
-            <w:r/>
-            <w:r>
-              <w:rPr>
-                <w:rFonts w:ascii="Calibri" w:hAnsi="Calibri"/>
-                <w:b w:val="0"/>
-                <w:sz w:val="18"/>
-              </w:rPr>
-              <w:t>Acta técnica de inicio y validación inicial de Fase 11</w:t>
-            </w:r>
-          </w:p>
-        </w:tc>
-      </w:tr>
-      <w:tr>
-        <w:tc>
-          <w:tcPr>
-            <w:tcW w:type="dxa" w:w="2592"/>
-            <w:vAlign w:val="center"/>
-          </w:tcPr>
-          <w:p>
-            <w:r/>
-            <w:r>
-              <w:rPr>
-                <w:rFonts w:ascii="Calibri" w:hAnsi="Calibri"/>
-                <w:b w:val="0"/>
-                <w:sz w:val="18"/>
-              </w:rPr>
-              <w:t>Versión</w:t>
-            </w:r>
-          </w:p>
-        </w:tc>
-        <w:tc>
-          <w:tcPr>
-            <w:tcW w:type="dxa" w:w="6768"/>
-            <w:vAlign w:val="center"/>
-          </w:tcPr>
-          <w:p>
-            <w:r/>
-            <w:r>
-              <w:rPr>
-                <w:rFonts w:ascii="Calibri" w:hAnsi="Calibri"/>
-                <w:b w:val="0"/>
-                <w:sz w:val="18"/>
-              </w:rPr>
-              <w:t>1.0</w:t>
-            </w:r>
-          </w:p>
-        </w:tc>
-      </w:tr>
-      <w:tr>
-        <w:tc>
-          <w:tcPr>
-            <w:tcW w:type="dxa" w:w="2592"/>
-            <w:vAlign w:val="center"/>
-          </w:tcPr>
-          <w:p>
-            <w:r/>
-            <w:r>
-              <w:rPr>
-                <w:rFonts w:ascii="Calibri" w:hAnsi="Calibri"/>
-                <w:b w:val="0"/>
-                <w:sz w:val="18"/>
+                <w:b/>
+                <w:sz w:val="16"/>
               </w:rPr>
               <w:t>Estado</w:t>
             </w:r>
@@ -170,35 +139,37 @@
         </w:tc>
         <w:tc>
           <w:tcPr>
-            <w:tcW w:type="dxa" w:w="6768"/>
-            <w:vAlign w:val="center"/>
+            <w:tcW w:type="dxa" w:w="3564"/>
+            <w:vAlign w:val="top"/>
           </w:tcPr>
           <w:p>
+            <w:pPr>
+              <w:jc w:val="left"/>
+            </w:pPr>
             <w:r/>
             <w:r>
               <w:rPr>
-                <w:rFonts w:ascii="Calibri" w:hAnsi="Calibri"/>
                 <w:b w:val="0"/>
-                <w:sz w:val="18"/>
+                <w:sz w:val="16"/>
               </w:rPr>
-              <w:t>Fase 11 iniciada; validación inicial de quality gates aprobada</w:t>
+              <w:t>Matriz inicial de pruebas ejecutada</w:t>
             </w:r>
           </w:p>
         </w:tc>
-      </w:tr>
-      <w:tr>
         <w:tc>
           <w:tcPr>
-            <w:tcW w:type="dxa" w:w="2592"/>
-            <w:vAlign w:val="center"/>
+            <w:tcW w:type="dxa" w:w="3564"/>
+            <w:vAlign w:val="top"/>
           </w:tcPr>
           <w:p>
+            <w:pPr>
+              <w:jc w:val="left"/>
+            </w:pPr>
             <w:r/>
             <w:r>
               <w:rPr>
-                <w:rFonts w:ascii="Calibri" w:hAnsi="Calibri"/>
-                <w:b w:val="0"/>
-                <w:sz w:val="18"/>
+                <w:b/>
+                <w:sz w:val="16"/>
               </w:rPr>
               <w:t>Responsable</w:t>
             </w:r>
@@ -206,16 +177,18 @@
         </w:tc>
         <w:tc>
           <w:tcPr>
-            <w:tcW w:type="dxa" w:w="6768"/>
-            <w:vAlign w:val="center"/>
+            <w:tcW w:type="dxa" w:w="3564"/>
+            <w:vAlign w:val="top"/>
           </w:tcPr>
           <w:p>
+            <w:pPr>
+              <w:jc w:val="left"/>
+            </w:pPr>
             <w:r/>
             <w:r>
               <w:rPr>
-                <w:rFonts w:ascii="Calibri" w:hAnsi="Calibri"/>
                 <w:b w:val="0"/>
-                <w:sz w:val="18"/>
+                <w:sz w:val="16"/>
               </w:rPr>
               <w:t>Javier Mejía</w:t>
             </w:r>
@@ -225,35 +198,77 @@
       <w:tr>
         <w:tc>
           <w:tcPr>
-            <w:tcW w:type="dxa" w:w="2592"/>
-            <w:vAlign w:val="center"/>
+            <w:tcW w:type="dxa" w:w="3564"/>
+            <w:vAlign w:val="top"/>
           </w:tcPr>
           <w:p>
+            <w:pPr>
+              <w:jc w:val="left"/>
+            </w:pPr>
             <w:r/>
             <w:r>
               <w:rPr>
-                <w:rFonts w:ascii="Calibri" w:hAnsi="Calibri"/>
-                <w:b w:val="0"/>
-                <w:sz w:val="18"/>
+                <w:b/>
+                <w:sz w:val="16"/>
               </w:rPr>
-              <w:t>Fecha</w:t>
+              <w:t>Documento</w:t>
             </w:r>
           </w:p>
         </w:tc>
         <w:tc>
           <w:tcPr>
-            <w:tcW w:type="dxa" w:w="6768"/>
-            <w:vAlign w:val="center"/>
+            <w:tcW w:type="dxa" w:w="3564"/>
+            <w:vAlign w:val="top"/>
           </w:tcPr>
           <w:p>
+            <w:pPr>
+              <w:jc w:val="left"/>
+            </w:pPr>
             <w:r/>
             <w:r>
               <w:rPr>
-                <w:rFonts w:ascii="Calibri" w:hAnsi="Calibri"/>
                 <w:b w:val="0"/>
-                <w:sz w:val="18"/>
+                <w:sz w:val="16"/>
               </w:rPr>
-              <w:t>17/07/2026</w:t>
+              <w:t>Control técnico de Fase 11</w:t>
+            </w:r>
+          </w:p>
+        </w:tc>
+        <w:tc>
+          <w:tcPr>
+            <w:tcW w:type="dxa" w:w="3564"/>
+            <w:vAlign w:val="top"/>
+          </w:tcPr>
+          <w:p>
+            <w:pPr>
+              <w:jc w:val="left"/>
+            </w:pPr>
+            <w:r/>
+            <w:r>
+              <w:rPr>
+                <w:b/>
+                <w:sz w:val="16"/>
+              </w:rPr>
+              <w:t>Repositorio</w:t>
+            </w:r>
+          </w:p>
+        </w:tc>
+        <w:tc>
+          <w:tcPr>
+            <w:tcW w:type="dxa" w:w="3564"/>
+            <w:vAlign w:val="top"/>
+          </w:tcPr>
+          <w:p>
+            <w:pPr>
+              <w:jc w:val="left"/>
+            </w:pPr>
+            <w:r/>
+            <w:r>
+              <w:rPr>
+                <w:b w:val="0"/>
+                <w:sz w:val="16"/>
+              </w:rPr>
+              <w:t>main / origin/main</w:t>
             </w:r>
           </w:p>
         </w:tc>
@@ -261,90 +276,171 @@
       <w:tr>
         <w:tc>
           <w:tcPr>
-            <w:tcW w:type="dxa" w:w="2592"/>
-            <w:vAlign w:val="center"/>
+            <w:tcW w:type="dxa" w:w="3564"/>
+            <w:vAlign w:val="top"/>
           </w:tcPr>
           <w:p>
+            <w:pPr>
+              <w:jc w:val="left"/>
+            </w:pPr>
             <w:r/>
             <w:r>
               <w:rPr>
-                <w:rFonts w:ascii="Calibri" w:hAnsi="Calibri"/>
-                <w:b w:val="0"/>
-                <w:sz w:val="18"/>
+                <w:b/>
+                <w:sz w:val="16"/>
               </w:rPr>
-              <w:t>Base documental</w:t>
+              <w:t>Base técnica</w:t>
             </w:r>
           </w:p>
         </w:tc>
         <w:tc>
           <w:tcPr>
-            <w:tcW w:type="dxa" w:w="6768"/>
-            <w:vAlign w:val="center"/>
+            <w:tcW w:type="dxa" w:w="3564"/>
+            <w:vAlign w:val="top"/>
           </w:tcPr>
           <w:p>
+            <w:pPr>
+              <w:jc w:val="left"/>
+            </w:pPr>
             <w:r/>
             <w:r>
               <w:rPr>
-                <w:rFonts w:ascii="Calibri" w:hAnsi="Calibri"/>
                 <w:b w:val="0"/>
-                <w:sz w:val="18"/>
+                <w:sz w:val="16"/>
               </w:rPr>
-              <w:t>Fases 1 a 10 aprobadas/cerradas y plan vigente del módulo</w:t>
+              <w:t>Fases 1 a 10 aprobadas y cerradas</w:t>
+            </w:r>
+          </w:p>
+        </w:tc>
+        <w:tc>
+          <w:tcPr>
+            <w:tcW w:type="dxa" w:w="3564"/>
+            <w:vAlign w:val="top"/>
+          </w:tcPr>
+          <w:p>
+            <w:pPr>
+              <w:jc w:val="left"/>
+            </w:pPr>
+            <w:r/>
+            <w:r>
+              <w:rPr>
+                <w:b/>
+                <w:sz w:val="16"/>
+              </w:rPr>
+              <w:t>Módulo</w:t>
+            </w:r>
+          </w:p>
+        </w:tc>
+        <w:tc>
+          <w:tcPr>
+            <w:tcW w:type="dxa" w:w="3564"/>
+            <w:vAlign w:val="top"/>
+          </w:tcPr>
+          <w:p>
+            <w:pPr>
+              <w:jc w:val="left"/>
+            </w:pPr>
+            <w:r/>
+            <w:r>
+              <w:rPr>
+                <w:b w:val="0"/>
+                <w:sz w:val="16"/>
+              </w:rPr>
+              <w:t>Matrices de Riesgos</w:t>
+            </w:r>
+          </w:p>
+        </w:tc>
+      </w:tr>
+      <w:tr>
+        <w:tc>
+          <w:tcPr>
+            <w:tcW w:type="dxa" w:w="3564"/>
+            <w:vAlign w:val="top"/>
+          </w:tcPr>
+          <w:p>
+            <w:pPr>
+              <w:jc w:val="left"/>
+            </w:pPr>
+            <w:r/>
+            <w:r>
+              <w:rPr>
+                <w:b/>
+                <w:sz w:val="16"/>
+              </w:rPr>
+              <w:t>Alcance</w:t>
+            </w:r>
+          </w:p>
+        </w:tc>
+        <w:tc>
+          <w:tcPr>
+            <w:tcW w:type="dxa" w:w="3564"/>
+            <w:vAlign w:val="top"/>
+          </w:tcPr>
+          <w:p>
+            <w:pPr>
+              <w:jc w:val="left"/>
+            </w:pPr>
+            <w:r/>
+            <w:r>
+              <w:rPr>
+                <w:b w:val="0"/>
+                <w:sz w:val="16"/>
+              </w:rPr>
+              <w:t>Pruebas integrales iniciales F11-01 a F11-10</w:t>
+            </w:r>
+          </w:p>
+        </w:tc>
+        <w:tc>
+          <w:tcPr>
+            <w:tcW w:type="dxa" w:w="3564"/>
+            <w:vAlign w:val="top"/>
+          </w:tcPr>
+          <w:p>
+            <w:pPr>
+              <w:jc w:val="left"/>
+            </w:pPr>
+            <w:r/>
+            <w:r>
+              <w:rPr>
+                <w:b/>
+                <w:sz w:val="16"/>
+              </w:rPr>
+              <w:t>Resultado</w:t>
+            </w:r>
+          </w:p>
+        </w:tc>
+        <w:tc>
+          <w:tcPr>
+            <w:tcW w:type="dxa" w:w="3564"/>
+            <w:vAlign w:val="top"/>
+          </w:tcPr>
+          <w:p>
+            <w:pPr>
+              <w:jc w:val="left"/>
+            </w:pPr>
+            <w:r/>
+            <w:r>
+              <w:rPr>
+                <w:b w:val="0"/>
+                <w:sz w:val="16"/>
+              </w:rPr>
+              <w:t>Correcto con controles pendientes</w:t>
             </w:r>
           </w:p>
         </w:tc>
       </w:tr>
     </w:tbl>
-    <w:p/>
-    <w:tbl>
-      <w:tblPr>
-        <w:tblStyle w:val="TableGrid"/>
-        <w:tblW w:type="auto" w:w="0"/>
-        <w:jc w:val="center"/>
-        <w:tblLook w:firstColumn="1" w:firstRow="1" w:lastColumn="0" w:lastRow="0" w:noHBand="0" w:noVBand="1" w:val="04A0"/>
-      </w:tblPr>
-      <w:tblGrid>
-        <w:gridCol w:w="9360"/>
-      </w:tblGrid>
-      <w:tr>
-        <w:tc>
-          <w:tcPr>
-            <w:tcW w:type="dxa" w:w="9360"/>
-            <w:shd w:fill="E8F5EE"/>
-            <w:vAlign w:val="center"/>
-          </w:tcPr>
-          <w:p>
-            <w:r/>
-            <w:r>
-              <w:rPr>
-                <w:rFonts w:ascii="Calibri" w:hAnsi="Calibri"/>
-                <w:b/>
-                <w:color w:val="0F7A4D"/>
-                <w:sz w:val="20"/>
-              </w:rPr>
-              <w:t>Resultado inicial: las puertas de calidad del repositorio fueron ejecutadas y aprobadas. Esta evidencia no cierra la Fase 11; habilita la continuidad de las pruebas integrales funcionales, DBA, auditoría, seguridad y experiencia de usuario.</w:t>
-            </w:r>
-          </w:p>
-        </w:tc>
-      </w:tr>
-    </w:tbl>
-    <w:p/>
     <w:p>
       <w:pPr>
         <w:pStyle w:val="Heading1"/>
       </w:pPr>
       <w:r>
-        <w:t>1. Objetivo de la Fase 11</w:t>
+        <w:t>1. Objetivo</w:t>
       </w:r>
     </w:p>
     <w:p>
       <w:r>
-        <w:rPr>
-          <w:rFonts w:ascii="Calibri" w:hAnsi="Calibri"/>
-          <w:b w:val="0"/>
-          <w:sz w:val="22"/>
-        </w:rPr>
-        <w:t>Validar funcionamiento, seguridad, consistencia de datos, auditoría, rendimiento básico y experiencia de usuario antes del cierre del módulo Matrices de Riesgos.</w:t>
+        <w:t>Documentar la matriz inicial de pruebas de la Fase 11, validando los escenarios funcionales, técnicos, de auditoría, seguridad, reportería, evidencias y experiencia de usuario del módulo Matrices de Riesgos.</w:t>
       </w:r>
     </w:p>
     <w:p>
@@ -352,7 +448,427 @@
         <w:pStyle w:val="Heading1"/>
       </w:pPr>
       <w:r>
-        <w:t>2. Alcance de pruebas integrales</w:t>
+        <w:t>2. Evidencia técnica ejecutada</w:t>
+      </w:r>
+    </w:p>
+    <w:tbl>
+      <w:tblPr>
+        <w:tblStyle w:val="TableGrid"/>
+        <w:tblW w:type="auto" w:w="0"/>
+        <w:tblLook w:firstColumn="1" w:firstRow="1" w:lastColumn="0" w:lastRow="0" w:noHBand="0" w:noVBand="1" w:val="04A0"/>
+      </w:tblPr>
+      <w:tblGrid>
+        <w:gridCol w:w="2851"/>
+        <w:gridCol w:w="2851"/>
+        <w:gridCol w:w="2851"/>
+        <w:gridCol w:w="2851"/>
+        <w:gridCol w:w="2851"/>
+      </w:tblGrid>
+      <w:tr>
+        <w:tc>
+          <w:tcPr>
+            <w:tcW w:type="dxa" w:w="2851"/>
+            <w:vAlign w:val="top"/>
+            <w:shd w:fill="1E3A8A"/>
+          </w:tcPr>
+          <w:p>
+            <w:pPr>
+              <w:jc w:val="left"/>
+            </w:pPr>
+            <w:r/>
+            <w:r>
+              <w:rPr>
+                <w:b/>
+                <w:color w:val="FFFFFF"/>
+                <w:sz w:val="16"/>
+              </w:rPr>
+              <w:t>Bloque</w:t>
+            </w:r>
+          </w:p>
+        </w:tc>
+        <w:tc>
+          <w:tcPr>
+            <w:tcW w:type="dxa" w:w="2851"/>
+            <w:vAlign w:val="top"/>
+            <w:shd w:fill="1E3A8A"/>
+          </w:tcPr>
+          <w:p>
+            <w:pPr>
+              <w:jc w:val="left"/>
+            </w:pPr>
+            <w:r/>
+            <w:r>
+              <w:rPr>
+                <w:b/>
+                <w:color w:val="FFFFFF"/>
+                <w:sz w:val="16"/>
+              </w:rPr>
+              <w:t>Pruebas</w:t>
+            </w:r>
+          </w:p>
+        </w:tc>
+        <w:tc>
+          <w:tcPr>
+            <w:tcW w:type="dxa" w:w="2851"/>
+            <w:vAlign w:val="top"/>
+            <w:shd w:fill="1E3A8A"/>
+          </w:tcPr>
+          <w:p>
+            <w:pPr>
+              <w:jc w:val="left"/>
+            </w:pPr>
+            <w:r/>
+            <w:r>
+              <w:rPr>
+                <w:b/>
+                <w:color w:val="FFFFFF"/>
+                <w:sz w:val="16"/>
+              </w:rPr>
+              <w:t>Aprobadas</w:t>
+            </w:r>
+          </w:p>
+        </w:tc>
+        <w:tc>
+          <w:tcPr>
+            <w:tcW w:type="dxa" w:w="2851"/>
+            <w:vAlign w:val="top"/>
+            <w:shd w:fill="1E3A8A"/>
+          </w:tcPr>
+          <w:p>
+            <w:pPr>
+              <w:jc w:val="left"/>
+            </w:pPr>
+            <w:r/>
+            <w:r>
+              <w:rPr>
+                <w:b/>
+                <w:color w:val="FFFFFF"/>
+                <w:sz w:val="16"/>
+              </w:rPr>
+              <w:t>Fallidas</w:t>
+            </w:r>
+          </w:p>
+        </w:tc>
+        <w:tc>
+          <w:tcPr>
+            <w:tcW w:type="dxa" w:w="2851"/>
+            <w:vAlign w:val="top"/>
+            <w:shd w:fill="1E3A8A"/>
+          </w:tcPr>
+          <w:p>
+            <w:pPr>
+              <w:jc w:val="left"/>
+            </w:pPr>
+            <w:r/>
+            <w:r>
+              <w:rPr>
+                <w:b/>
+                <w:color w:val="FFFFFF"/>
+                <w:sz w:val="16"/>
+              </w:rPr>
+              <w:t>Cobertura / nota</w:t>
+            </w:r>
+          </w:p>
+        </w:tc>
+      </w:tr>
+      <w:tr>
+        <w:tc>
+          <w:tcPr>
+            <w:tcW w:type="dxa" w:w="2851"/>
+            <w:vAlign w:val="top"/>
+          </w:tcPr>
+          <w:p>
+            <w:pPr>
+              <w:jc w:val="left"/>
+            </w:pPr>
+            <w:r/>
+            <w:r>
+              <w:rPr>
+                <w:b w:val="0"/>
+                <w:sz w:val="16"/>
+              </w:rPr>
+              <w:t>Backend</w:t>
+            </w:r>
+          </w:p>
+        </w:tc>
+        <w:tc>
+          <w:tcPr>
+            <w:tcW w:type="dxa" w:w="2851"/>
+            <w:vAlign w:val="top"/>
+          </w:tcPr>
+          <w:p>
+            <w:pPr>
+              <w:jc w:val="left"/>
+            </w:pPr>
+            <w:r/>
+            <w:r>
+              <w:rPr>
+                <w:b w:val="0"/>
+                <w:sz w:val="16"/>
+              </w:rPr>
+              <w:t>77</w:t>
+            </w:r>
+          </w:p>
+        </w:tc>
+        <w:tc>
+          <w:tcPr>
+            <w:tcW w:type="dxa" w:w="2851"/>
+            <w:vAlign w:val="top"/>
+          </w:tcPr>
+          <w:p>
+            <w:pPr>
+              <w:jc w:val="left"/>
+            </w:pPr>
+            <w:r/>
+            <w:r>
+              <w:rPr>
+                <w:b w:val="0"/>
+                <w:sz w:val="16"/>
+              </w:rPr>
+              <w:t>77</w:t>
+            </w:r>
+          </w:p>
+        </w:tc>
+        <w:tc>
+          <w:tcPr>
+            <w:tcW w:type="dxa" w:w="2851"/>
+            <w:vAlign w:val="top"/>
+          </w:tcPr>
+          <w:p>
+            <w:pPr>
+              <w:jc w:val="left"/>
+            </w:pPr>
+            <w:r/>
+            <w:r>
+              <w:rPr>
+                <w:b w:val="0"/>
+                <w:sz w:val="16"/>
+              </w:rPr>
+              <w:t>0</w:t>
+            </w:r>
+          </w:p>
+        </w:tc>
+        <w:tc>
+          <w:tcPr>
+            <w:tcW w:type="dxa" w:w="2851"/>
+            <w:vAlign w:val="top"/>
+          </w:tcPr>
+          <w:p>
+            <w:pPr>
+              <w:jc w:val="left"/>
+            </w:pPr>
+            <w:r/>
+            <w:r>
+              <w:rPr>
+                <w:b w:val="0"/>
+                <w:sz w:val="16"/>
+              </w:rPr>
+              <w:t>Líneas 15.35%, ramas 16.36%</w:t>
+            </w:r>
+          </w:p>
+        </w:tc>
+      </w:tr>
+      <w:tr>
+        <w:tc>
+          <w:tcPr>
+            <w:tcW w:type="dxa" w:w="2851"/>
+            <w:vAlign w:val="top"/>
+          </w:tcPr>
+          <w:p>
+            <w:pPr>
+              <w:jc w:val="left"/>
+            </w:pPr>
+            <w:r/>
+            <w:r>
+              <w:rPr>
+                <w:b w:val="0"/>
+                <w:sz w:val="16"/>
+              </w:rPr>
+              <w:t>Frontend</w:t>
+            </w:r>
+          </w:p>
+        </w:tc>
+        <w:tc>
+          <w:tcPr>
+            <w:tcW w:type="dxa" w:w="2851"/>
+            <w:vAlign w:val="top"/>
+          </w:tcPr>
+          <w:p>
+            <w:pPr>
+              <w:jc w:val="left"/>
+            </w:pPr>
+            <w:r/>
+            <w:r>
+              <w:rPr>
+                <w:b w:val="0"/>
+                <w:sz w:val="16"/>
+              </w:rPr>
+              <w:t>124</w:t>
+            </w:r>
+          </w:p>
+        </w:tc>
+        <w:tc>
+          <w:tcPr>
+            <w:tcW w:type="dxa" w:w="2851"/>
+            <w:vAlign w:val="top"/>
+          </w:tcPr>
+          <w:p>
+            <w:pPr>
+              <w:jc w:val="left"/>
+            </w:pPr>
+            <w:r/>
+            <w:r>
+              <w:rPr>
+                <w:b w:val="0"/>
+                <w:sz w:val="16"/>
+              </w:rPr>
+              <w:t>124</w:t>
+            </w:r>
+          </w:p>
+        </w:tc>
+        <w:tc>
+          <w:tcPr>
+            <w:tcW w:type="dxa" w:w="2851"/>
+            <w:vAlign w:val="top"/>
+          </w:tcPr>
+          <w:p>
+            <w:pPr>
+              <w:jc w:val="left"/>
+            </w:pPr>
+            <w:r/>
+            <w:r>
+              <w:rPr>
+                <w:b w:val="0"/>
+                <w:sz w:val="16"/>
+              </w:rPr>
+              <w:t>0</w:t>
+            </w:r>
+          </w:p>
+        </w:tc>
+        <w:tc>
+          <w:tcPr>
+            <w:tcW w:type="dxa" w:w="2851"/>
+            <w:vAlign w:val="top"/>
+          </w:tcPr>
+          <w:p>
+            <w:pPr>
+              <w:jc w:val="left"/>
+            </w:pPr>
+            <w:r/>
+            <w:r>
+              <w:rPr>
+                <w:b w:val="0"/>
+                <w:sz w:val="16"/>
+              </w:rPr>
+              <w:t>Sentencias 31.59%, ramas 27.57%, funciones 30.38%, líneas 31.73%</w:t>
+            </w:r>
+          </w:p>
+        </w:tc>
+      </w:tr>
+      <w:tr>
+        <w:tc>
+          <w:tcPr>
+            <w:tcW w:type="dxa" w:w="2851"/>
+            <w:vAlign w:val="top"/>
+          </w:tcPr>
+          <w:p>
+            <w:pPr>
+              <w:jc w:val="left"/>
+            </w:pPr>
+            <w:r/>
+            <w:r>
+              <w:rPr>
+                <w:b w:val="0"/>
+                <w:sz w:val="16"/>
+              </w:rPr>
+              <w:t>E2E</w:t>
+            </w:r>
+          </w:p>
+        </w:tc>
+        <w:tc>
+          <w:tcPr>
+            <w:tcW w:type="dxa" w:w="2851"/>
+            <w:vAlign w:val="top"/>
+          </w:tcPr>
+          <w:p>
+            <w:pPr>
+              <w:jc w:val="left"/>
+            </w:pPr>
+            <w:r/>
+            <w:r>
+              <w:rPr>
+                <w:b w:val="0"/>
+                <w:sz w:val="16"/>
+              </w:rPr>
+              <w:t>6</w:t>
+            </w:r>
+          </w:p>
+        </w:tc>
+        <w:tc>
+          <w:tcPr>
+            <w:tcW w:type="dxa" w:w="2851"/>
+            <w:vAlign w:val="top"/>
+          </w:tcPr>
+          <w:p>
+            <w:pPr>
+              <w:jc w:val="left"/>
+            </w:pPr>
+            <w:r/>
+            <w:r>
+              <w:rPr>
+                <w:b w:val="0"/>
+                <w:sz w:val="16"/>
+              </w:rPr>
+              <w:t>6</w:t>
+            </w:r>
+          </w:p>
+        </w:tc>
+        <w:tc>
+          <w:tcPr>
+            <w:tcW w:type="dxa" w:w="2851"/>
+            <w:vAlign w:val="top"/>
+          </w:tcPr>
+          <w:p>
+            <w:pPr>
+              <w:jc w:val="left"/>
+            </w:pPr>
+            <w:r/>
+            <w:r>
+              <w:rPr>
+                <w:b w:val="0"/>
+                <w:sz w:val="16"/>
+              </w:rPr>
+              <w:t>0</w:t>
+            </w:r>
+          </w:p>
+        </w:tc>
+        <w:tc>
+          <w:tcPr>
+            <w:tcW w:type="dxa" w:w="2851"/>
+            <w:vAlign w:val="top"/>
+          </w:tcPr>
+          <w:p>
+            <w:pPr>
+              <w:jc w:val="left"/>
+            </w:pPr>
+            <w:r/>
+            <w:r>
+              <w:rPr>
+                <w:b w:val="0"/>
+                <w:sz w:val="16"/>
+              </w:rPr>
+              <w:t>Chromium; login, rutas protegidas y Matrices de Riesgos autorizada</w:t>
+            </w:r>
+          </w:p>
+        </w:tc>
+      </w:tr>
+    </w:tbl>
+    <w:p>
+      <w:pPr>
+        <w:pStyle w:val="Heading1"/>
+      </w:pPr>
+      <w:r>
+        <w:t>3. Matriz inicial de pruebas F11</w:t>
       </w:r>
     </w:p>
     <w:tbl>
@@ -363,65 +879,137 @@
         <w:tblLook w:firstColumn="1" w:firstRow="1" w:lastColumn="0" w:lastRow="0" w:noHBand="0" w:noVBand="1" w:val="04A0"/>
       </w:tblPr>
       <w:tblGrid>
-        <w:gridCol w:w="3120"/>
-        <w:gridCol w:w="3120"/>
-        <w:gridCol w:w="3120"/>
+        <w:gridCol w:w="2376"/>
+        <w:gridCol w:w="2376"/>
+        <w:gridCol w:w="2376"/>
+        <w:gridCol w:w="2376"/>
+        <w:gridCol w:w="2376"/>
+        <w:gridCol w:w="2376"/>
       </w:tblGrid>
       <w:tr>
         <w:tc>
           <w:tcPr>
-            <w:tcW w:type="dxa" w:w="1944"/>
-            <w:vAlign w:val="center"/>
-            <w:shd w:fill="1F3F8D"/>
+            <w:tcW w:type="dxa" w:w="2376"/>
+            <w:vAlign w:val="top"/>
+            <w:shd w:fill="1E3A8A"/>
           </w:tcPr>
           <w:p>
+            <w:pPr>
+              <w:jc w:val="left"/>
+            </w:pPr>
             <w:r/>
             <w:r>
               <w:rPr>
-                <w:rFonts w:ascii="Calibri" w:hAnsi="Calibri"/>
                 <w:b/>
                 <w:color w:val="FFFFFF"/>
-                <w:sz w:val="18"/>
+                <w:sz w:val="16"/>
               </w:rPr>
-              <w:t>Área</w:t>
+              <w:t>ID</w:t>
             </w:r>
           </w:p>
         </w:tc>
         <w:tc>
           <w:tcPr>
-            <w:tcW w:type="dxa" w:w="4824"/>
-            <w:vAlign w:val="center"/>
-            <w:shd w:fill="1F3F8D"/>
+            <w:tcW w:type="dxa" w:w="2376"/>
+            <w:vAlign w:val="top"/>
+            <w:shd w:fill="1E3A8A"/>
           </w:tcPr>
           <w:p>
+            <w:pPr>
+              <w:jc w:val="left"/>
+            </w:pPr>
             <w:r/>
             <w:r>
               <w:rPr>
-                <w:rFonts w:ascii="Calibri" w:hAnsi="Calibri"/>
                 <w:b/>
                 <w:color w:val="FFFFFF"/>
-                <w:sz w:val="18"/>
+                <w:sz w:val="16"/>
               </w:rPr>
-              <w:t>Validación esperada</w:t>
+              <w:t>Escenario</w:t>
             </w:r>
           </w:p>
         </w:tc>
         <w:tc>
           <w:tcPr>
-            <w:tcW w:type="dxa" w:w="2592"/>
-            <w:vAlign w:val="center"/>
-            <w:shd w:fill="1F3F8D"/>
+            <w:tcW w:type="dxa" w:w="2376"/>
+            <w:vAlign w:val="top"/>
+            <w:shd w:fill="1E3A8A"/>
           </w:tcPr>
           <w:p>
+            <w:pPr>
+              <w:jc w:val="left"/>
+            </w:pPr>
             <w:r/>
             <w:r>
               <w:rPr>
-                <w:rFonts w:ascii="Calibri" w:hAnsi="Calibri"/>
                 <w:b/>
                 <w:color w:val="FFFFFF"/>
-                <w:sz w:val="18"/>
+                <w:sz w:val="16"/>
               </w:rPr>
-              <w:t>Estado actual</w:t>
+              <w:t>Objetivo</w:t>
+            </w:r>
+          </w:p>
+        </w:tc>
+        <w:tc>
+          <w:tcPr>
+            <w:tcW w:type="dxa" w:w="2376"/>
+            <w:vAlign w:val="top"/>
+            <w:shd w:fill="1E3A8A"/>
+          </w:tcPr>
+          <w:p>
+            <w:pPr>
+              <w:jc w:val="left"/>
+            </w:pPr>
+            <w:r/>
+            <w:r>
+              <w:rPr>
+                <w:b/>
+                <w:color w:val="FFFFFF"/>
+                <w:sz w:val="16"/>
+              </w:rPr>
+              <w:t>Evidencia</w:t>
+            </w:r>
+          </w:p>
+        </w:tc>
+        <w:tc>
+          <w:tcPr>
+            <w:tcW w:type="dxa" w:w="2376"/>
+            <w:vAlign w:val="top"/>
+            <w:shd w:fill="1E3A8A"/>
+          </w:tcPr>
+          <w:p>
+            <w:pPr>
+              <w:jc w:val="left"/>
+            </w:pPr>
+            <w:r/>
+            <w:r>
+              <w:rPr>
+                <w:b/>
+                <w:color w:val="FFFFFF"/>
+                <w:sz w:val="16"/>
+              </w:rPr>
+              <w:t>Resultado</w:t>
+            </w:r>
+          </w:p>
+        </w:tc>
+        <w:tc>
+          <w:tcPr>
+            <w:tcW w:type="dxa" w:w="2376"/>
+            <w:vAlign w:val="top"/>
+            <w:shd w:fill="1E3A8A"/>
+          </w:tcPr>
+          <w:p>
+            <w:pPr>
+              <w:jc w:val="left"/>
+            </w:pPr>
+            <w:r/>
+            <w:r>
+              <w:rPr>
+                <w:b/>
+                <w:color w:val="FFFFFF"/>
+                <w:sz w:val="16"/>
+              </w:rPr>
+              <w:t>Observación</w:t>
             </w:r>
           </w:p>
         </w:tc>
@@ -429,52 +1017,116 @@
       <w:tr>
         <w:tc>
           <w:tcPr>
-            <w:tcW w:type="dxa" w:w="1944"/>
-            <w:vAlign w:val="center"/>
+            <w:tcW w:type="dxa" w:w="2376"/>
+            <w:vAlign w:val="top"/>
           </w:tcPr>
           <w:p>
+            <w:pPr>
+              <w:jc w:val="left"/>
+            </w:pPr>
             <w:r/>
             <w:r>
               <w:rPr>
-                <w:rFonts w:ascii="Calibri" w:hAnsi="Calibri"/>
-                <w:b w:val="0"/>
-                <w:sz w:val="18"/>
+                <w:b/>
+                <w:sz w:val="16"/>
               </w:rPr>
-              <w:t>Backend/API</w:t>
+              <w:t>F11-01</w:t>
             </w:r>
           </w:p>
         </w:tc>
         <w:tc>
           <w:tcPr>
-            <w:tcW w:type="dxa" w:w="4824"/>
-            <w:vAlign w:val="center"/>
+            <w:tcW w:type="dxa" w:w="2376"/>
+            <w:vAlign w:val="top"/>
           </w:tcPr>
           <w:p>
+            <w:pPr>
+              <w:jc w:val="left"/>
+            </w:pPr>
             <w:r/>
             <w:r>
               <w:rPr>
-                <w:rFonts w:ascii="Calibri" w:hAnsi="Calibri"/>
                 <w:b w:val="0"/>
-                <w:sz w:val="18"/>
+                <w:sz w:val="16"/>
               </w:rPr>
-              <w:t>Contratos REST, reglas de negocio, manejo de errores y auditoría.</w:t>
+              <w:t>Autenticación y acceso por módulo</w:t>
             </w:r>
           </w:p>
         </w:tc>
         <w:tc>
           <w:tcPr>
-            <w:tcW w:type="dxa" w:w="2592"/>
-            <w:vAlign w:val="center"/>
+            <w:tcW w:type="dxa" w:w="2376"/>
+            <w:vAlign w:val="top"/>
           </w:tcPr>
           <w:p>
+            <w:pPr>
+              <w:jc w:val="left"/>
+            </w:pPr>
             <w:r/>
             <w:r>
               <w:rPr>
-                <w:rFonts w:ascii="Calibri" w:hAnsi="Calibri"/>
                 <w:b w:val="0"/>
-                <w:sz w:val="18"/>
+                <w:sz w:val="16"/>
               </w:rPr>
-              <w:t>Quality gate inicial aprobado</w:t>
+              <w:t>Confirmar login, rutas protegidas y acceso autorizado al módulo Matrices de Riesgos.</w:t>
+            </w:r>
+          </w:p>
+        </w:tc>
+        <w:tc>
+          <w:tcPr>
+            <w:tcW w:type="dxa" w:w="2376"/>
+            <w:vAlign w:val="top"/>
+          </w:tcPr>
+          <w:p>
+            <w:pPr>
+              <w:jc w:val="left"/>
+            </w:pPr>
+            <w:r/>
+            <w:r>
+              <w:rPr>
+                <w:b w:val="0"/>
+                <w:sz w:val="16"/>
+              </w:rPr>
+              <w:t>E2E login-and-routing.spec.ts: formulario de acceso, campos obligatorios, contraseña visible/no visible, redirección sin sesión y apertura autorizada de Matrices de Riesgos.</w:t>
+            </w:r>
+          </w:p>
+        </w:tc>
+        <w:tc>
+          <w:tcPr>
+            <w:tcW w:type="dxa" w:w="2376"/>
+            <w:vAlign w:val="top"/>
+          </w:tcPr>
+          <w:p>
+            <w:pPr>
+              <w:jc w:val="left"/>
+            </w:pPr>
+            <w:r/>
+            <w:r>
+              <w:rPr>
+                <w:b/>
+                <w:color w:val="008A4C"/>
+                <w:sz w:val="16"/>
+              </w:rPr>
+              <w:t>Aprobado</w:t>
+            </w:r>
+          </w:p>
+        </w:tc>
+        <w:tc>
+          <w:tcPr>
+            <w:tcW w:type="dxa" w:w="2376"/>
+            <w:vAlign w:val="top"/>
+          </w:tcPr>
+          <w:p>
+            <w:pPr>
+              <w:jc w:val="left"/>
+            </w:pPr>
+            <w:r/>
+            <w:r>
+              <w:rPr>
+                <w:b w:val="0"/>
+                <w:sz w:val="16"/>
+              </w:rPr>
+              <w:t>Permisos conservados por módulo mediante sesión autenticada con módulo 10.</w:t>
             </w:r>
           </w:p>
         </w:tc>
@@ -482,52 +1134,116 @@
       <w:tr>
         <w:tc>
           <w:tcPr>
-            <w:tcW w:type="dxa" w:w="1944"/>
-            <w:vAlign w:val="center"/>
+            <w:tcW w:type="dxa" w:w="2376"/>
+            <w:vAlign w:val="top"/>
           </w:tcPr>
           <w:p>
+            <w:pPr>
+              <w:jc w:val="left"/>
+            </w:pPr>
             <w:r/>
             <w:r>
               <w:rPr>
-                <w:rFonts w:ascii="Calibri" w:hAnsi="Calibri"/>
-                <w:b w:val="0"/>
-                <w:sz w:val="18"/>
+                <w:b/>
+                <w:sz w:val="16"/>
               </w:rPr>
-              <w:t>Frontend Angular</w:t>
+              <w:t>F11-02</w:t>
             </w:r>
           </w:p>
         </w:tc>
         <w:tc>
           <w:tcPr>
-            <w:tcW w:type="dxa" w:w="4824"/>
-            <w:vAlign w:val="center"/>
+            <w:tcW w:type="dxa" w:w="2376"/>
+            <w:vAlign w:val="top"/>
           </w:tcPr>
           <w:p>
+            <w:pPr>
+              <w:jc w:val="left"/>
+            </w:pPr>
             <w:r/>
             <w:r>
               <w:rPr>
-                <w:rFonts w:ascii="Calibri" w:hAnsi="Calibri"/>
                 <w:b w:val="0"/>
-                <w:sz w:val="18"/>
+                <w:sz w:val="16"/>
               </w:rPr>
-              <w:t>Interfaz, validaciones visibles, rutas protegidas y flujos de usuario.</w:t>
+              <w:t>Creación y edición de matrices por tipo de sujeto</w:t>
             </w:r>
           </w:p>
         </w:tc>
         <w:tc>
           <w:tcPr>
-            <w:tcW w:type="dxa" w:w="2592"/>
-            <w:vAlign w:val="center"/>
+            <w:tcW w:type="dxa" w:w="2376"/>
+            <w:vAlign w:val="top"/>
           </w:tcPr>
           <w:p>
+            <w:pPr>
+              <w:jc w:val="left"/>
+            </w:pPr>
             <w:r/>
             <w:r>
               <w:rPr>
-                <w:rFonts w:ascii="Calibri" w:hAnsi="Calibri"/>
                 <w:b w:val="0"/>
-                <w:sz w:val="18"/>
+                <w:sz w:val="16"/>
               </w:rPr>
-              <w:t>Quality gate inicial aprobado</w:t>
+              <w:t>Validar captura, bloqueo de duplicados por identificador/documento, edición, actualización y recálculo automático.</w:t>
+            </w:r>
+          </w:p>
+        </w:tc>
+        <w:tc>
+          <w:tcPr>
+            <w:tcW w:type="dxa" w:w="2376"/>
+            <w:vAlign w:val="top"/>
+          </w:tcPr>
+          <w:p>
+            <w:pPr>
+              <w:jc w:val="left"/>
+            </w:pPr>
+            <w:r/>
+            <w:r>
+              <w:rPr>
+                <w:b w:val="0"/>
+                <w:sz w:val="16"/>
+              </w:rPr>
+              <w:t>Pruebas frontend y backend de creación válida, bloqueo de duplicados, reconstrucción de edición, actualización y recálculo.</w:t>
+            </w:r>
+          </w:p>
+        </w:tc>
+        <w:tc>
+          <w:tcPr>
+            <w:tcW w:type="dxa" w:w="2376"/>
+            <w:vAlign w:val="top"/>
+          </w:tcPr>
+          <w:p>
+            <w:pPr>
+              <w:jc w:val="left"/>
+            </w:pPr>
+            <w:r/>
+            <w:r>
+              <w:rPr>
+                <w:b/>
+                <w:color w:val="008A4C"/>
+                <w:sz w:val="16"/>
+              </w:rPr>
+              <w:t>Aprobado</w:t>
+            </w:r>
+          </w:p>
+        </w:tc>
+        <w:tc>
+          <w:tcPr>
+            <w:tcW w:type="dxa" w:w="2376"/>
+            <w:vAlign w:val="top"/>
+          </w:tcPr>
+          <w:p>
+            <w:pPr>
+              <w:jc w:val="left"/>
+            </w:pPr>
+            <w:r/>
+            <w:r>
+              <w:rPr>
+                <w:b w:val="0"/>
+                <w:sz w:val="16"/>
+              </w:rPr>
+              <w:t>La validación de duplicados se aplica en creación; la edición respeta el identificador de la matriz en curso.</w:t>
             </w:r>
           </w:p>
         </w:tc>
@@ -535,52 +1251,116 @@
       <w:tr>
         <w:tc>
           <w:tcPr>
-            <w:tcW w:type="dxa" w:w="1944"/>
-            <w:vAlign w:val="center"/>
+            <w:tcW w:type="dxa" w:w="2376"/>
+            <w:vAlign w:val="top"/>
           </w:tcPr>
           <w:p>
+            <w:pPr>
+              <w:jc w:val="left"/>
+            </w:pPr>
             <w:r/>
             <w:r>
               <w:rPr>
-                <w:rFonts w:ascii="Calibri" w:hAnsi="Calibri"/>
-                <w:b w:val="0"/>
-                <w:sz w:val="18"/>
+                <w:b/>
+                <w:sz w:val="16"/>
               </w:rPr>
-              <w:t>E2E autenticado</w:t>
+              <w:t>F11-03</w:t>
             </w:r>
           </w:p>
         </w:tc>
         <w:tc>
           <w:tcPr>
-            <w:tcW w:type="dxa" w:w="4824"/>
-            <w:vAlign w:val="center"/>
+            <w:tcW w:type="dxa" w:w="2376"/>
+            <w:vAlign w:val="top"/>
           </w:tcPr>
           <w:p>
+            <w:pPr>
+              <w:jc w:val="left"/>
+            </w:pPr>
             <w:r/>
             <w:r>
               <w:rPr>
-                <w:rFonts w:ascii="Calibri" w:hAnsi="Calibri"/>
                 <w:b w:val="0"/>
-                <w:sz w:val="18"/>
+                <w:sz w:val="16"/>
               </w:rPr>
-              <w:t>Acceso, rutas protegidas y apertura del módulo autorizado.</w:t>
+              <w:t>Cálculo por factor e institucional</w:t>
             </w:r>
           </w:p>
         </w:tc>
         <w:tc>
           <w:tcPr>
-            <w:tcW w:type="dxa" w:w="2592"/>
-            <w:vAlign w:val="center"/>
+            <w:tcW w:type="dxa" w:w="2376"/>
+            <w:vAlign w:val="top"/>
           </w:tcPr>
           <w:p>
+            <w:pPr>
+              <w:jc w:val="left"/>
+            </w:pPr>
             <w:r/>
             <w:r>
               <w:rPr>
-                <w:rFonts w:ascii="Calibri" w:hAnsi="Calibri"/>
                 <w:b w:val="0"/>
-                <w:sz w:val="18"/>
+                <w:sz w:val="16"/>
+              </w:rPr>
+              <w:t>Confirmar cálculo por factor para proveedor, cliente/patrono y empleado, y cálculo institucional/global cuando aplique.</w:t>
+            </w:r>
+          </w:p>
+        </w:tc>
+        <w:tc>
+          <w:tcPr>
+            <w:tcW w:type="dxa" w:w="2376"/>
+            <w:vAlign w:val="top"/>
+          </w:tcPr>
+          <w:p>
+            <w:pPr>
+              <w:jc w:val="left"/>
+            </w:pPr>
+            <w:r/>
+            <w:r>
+              <w:rPr>
+                <w:b w:val="0"/>
+                <w:sz w:val="16"/>
+              </w:rPr>
+              <w:t>Pruebas backend MatricesRiesgoService y MatricesRiesgosApplication: motor F6, pesos 50/25/25, variables internas al 100%, mitigación y recálculo.</w:t>
+            </w:r>
+          </w:p>
+        </w:tc>
+        <w:tc>
+          <w:tcPr>
+            <w:tcW w:type="dxa" w:w="2376"/>
+            <w:vAlign w:val="top"/>
+          </w:tcPr>
+          <w:p>
+            <w:pPr>
+              <w:jc w:val="left"/>
+            </w:pPr>
+            <w:r/>
+            <w:r>
+              <w:rPr>
+                <w:b/>
+                <w:color w:val="008A4C"/>
+                <w:sz w:val="16"/>
               </w:rPr>
               <w:t>Aprobado</w:t>
+            </w:r>
+          </w:p>
+        </w:tc>
+        <w:tc>
+          <w:tcPr>
+            <w:tcW w:type="dxa" w:w="2376"/>
+            <w:vAlign w:val="top"/>
+          </w:tcPr>
+          <w:p>
+            <w:pPr>
+              <w:jc w:val="left"/>
+            </w:pPr>
+            <w:r/>
+            <w:r>
+              <w:rPr>
+                <w:b w:val="0"/>
+                <w:sz w:val="16"/>
+              </w:rPr>
+              <w:t>El frontend no calcula ponderaciones, escalas ni nivel de riesgo.</w:t>
             </w:r>
           </w:p>
         </w:tc>
@@ -588,52 +1368,116 @@
       <w:tr>
         <w:tc>
           <w:tcPr>
-            <w:tcW w:type="dxa" w:w="1944"/>
-            <w:vAlign w:val="center"/>
+            <w:tcW w:type="dxa" w:w="2376"/>
+            <w:vAlign w:val="top"/>
           </w:tcPr>
           <w:p>
+            <w:pPr>
+              <w:jc w:val="left"/>
+            </w:pPr>
             <w:r/>
             <w:r>
               <w:rPr>
-                <w:rFonts w:ascii="Calibri" w:hAnsi="Calibri"/>
-                <w:b w:val="0"/>
-                <w:sz w:val="18"/>
+                <w:b/>
+                <w:sz w:val="16"/>
               </w:rPr>
-              <w:t>Base de datos</w:t>
+              <w:t>F11-04</w:t>
             </w:r>
           </w:p>
         </w:tc>
         <w:tc>
           <w:tcPr>
-            <w:tcW w:type="dxa" w:w="4824"/>
-            <w:vAlign w:val="center"/>
+            <w:tcW w:type="dxa" w:w="2376"/>
+            <w:vAlign w:val="top"/>
           </w:tcPr>
           <w:p>
+            <w:pPr>
+              <w:jc w:val="left"/>
+            </w:pPr>
             <w:r/>
             <w:r>
               <w:rPr>
-                <w:rFonts w:ascii="Calibri" w:hAnsi="Calibri"/>
                 <w:b w:val="0"/>
-                <w:sz w:val="18"/>
+                <w:sz w:val="16"/>
               </w:rPr>
-              <w:t>Consistencia RL_MR_*, auditoría, historial y scripts aprobados.</w:t>
+              <w:t>Escenarios de riesgo Muy bajo, Bajo, Medio, Alto y Crítico</w:t>
             </w:r>
           </w:p>
         </w:tc>
         <w:tc>
           <w:tcPr>
-            <w:tcW w:type="dxa" w:w="2592"/>
-            <w:vAlign w:val="center"/>
+            <w:tcW w:type="dxa" w:w="2376"/>
+            <w:vAlign w:val="top"/>
           </w:tcPr>
           <w:p>
+            <w:pPr>
+              <w:jc w:val="left"/>
+            </w:pPr>
             <w:r/>
             <w:r>
               <w:rPr>
-                <w:rFonts w:ascii="Calibri" w:hAnsi="Calibri"/>
                 <w:b w:val="0"/>
-                <w:sz w:val="18"/>
+                <w:sz w:val="16"/>
               </w:rPr>
-              <w:t>Pendiente de validación integral DBA</w:t>
+              <w:t>Validar clasificación de riesgo por rangos aprobados y bandera de plan de acción para Alto/Crítico.</w:t>
+            </w:r>
+          </w:p>
+        </w:tc>
+        <w:tc>
+          <w:tcPr>
+            <w:tcW w:type="dxa" w:w="2376"/>
+            <w:vAlign w:val="top"/>
+          </w:tcPr>
+          <w:p>
+            <w:pPr>
+              <w:jc w:val="left"/>
+            </w:pPr>
+            <w:r/>
+            <w:r>
+              <w:rPr>
+                <w:b w:val="0"/>
+                <w:sz w:val="16"/>
+              </w:rPr>
+              <w:t>Pruebas backend de clasificación, escalas residuales y requerimiento de plan de acción.</w:t>
+            </w:r>
+          </w:p>
+        </w:tc>
+        <w:tc>
+          <w:tcPr>
+            <w:tcW w:type="dxa" w:w="2376"/>
+            <w:vAlign w:val="top"/>
+          </w:tcPr>
+          <w:p>
+            <w:pPr>
+              <w:jc w:val="left"/>
+            </w:pPr>
+            <w:r/>
+            <w:r>
+              <w:rPr>
+                <w:b/>
+                <w:color w:val="008A4C"/>
+                <w:sz w:val="16"/>
+              </w:rPr>
+              <w:t>Aprobado</w:t>
+            </w:r>
+          </w:p>
+        </w:tc>
+        <w:tc>
+          <w:tcPr>
+            <w:tcW w:type="dxa" w:w="2376"/>
+            <w:vAlign w:val="top"/>
+          </w:tcPr>
+          <w:p>
+            <w:pPr>
+              <w:jc w:val="left"/>
+            </w:pPr>
+            <w:r/>
+            <w:r>
+              <w:rPr>
+                <w:b w:val="0"/>
+                <w:sz w:val="16"/>
+              </w:rPr>
+              <w:t>Se mantiene clasificación sobre valor interno y visualización funcional a dos decimales.</w:t>
             </w:r>
           </w:p>
         </w:tc>
@@ -641,52 +1485,116 @@
       <w:tr>
         <w:tc>
           <w:tcPr>
-            <w:tcW w:type="dxa" w:w="1944"/>
-            <w:vAlign w:val="center"/>
+            <w:tcW w:type="dxa" w:w="2376"/>
+            <w:vAlign w:val="top"/>
           </w:tcPr>
           <w:p>
+            <w:pPr>
+              <w:jc w:val="left"/>
+            </w:pPr>
             <w:r/>
             <w:r>
               <w:rPr>
-                <w:rFonts w:ascii="Calibri" w:hAnsi="Calibri"/>
-                <w:b w:val="0"/>
-                <w:sz w:val="18"/>
+                <w:b/>
+                <w:sz w:val="16"/>
               </w:rPr>
-              <w:t>Escenarios de riesgo</w:t>
+              <w:t>F11-05</w:t>
             </w:r>
           </w:p>
         </w:tc>
         <w:tc>
           <w:tcPr>
-            <w:tcW w:type="dxa" w:w="4824"/>
-            <w:vAlign w:val="center"/>
+            <w:tcW w:type="dxa" w:w="2376"/>
+            <w:vAlign w:val="top"/>
           </w:tcPr>
           <w:p>
+            <w:pPr>
+              <w:jc w:val="left"/>
+            </w:pPr>
             <w:r/>
             <w:r>
               <w:rPr>
-                <w:rFonts w:ascii="Calibri" w:hAnsi="Calibri"/>
                 <w:b w:val="0"/>
-                <w:sz w:val="18"/>
+                <w:sz w:val="16"/>
               </w:rPr>
-              <w:t>Casos bajo, medio, alto y crítico conforme metodología.</w:t>
+              <w:t>Planes de acción</w:t>
             </w:r>
           </w:p>
         </w:tc>
         <w:tc>
           <w:tcPr>
-            <w:tcW w:type="dxa" w:w="2592"/>
-            <w:vAlign w:val="center"/>
+            <w:tcW w:type="dxa" w:w="2376"/>
+            <w:vAlign w:val="top"/>
           </w:tcPr>
           <w:p>
+            <w:pPr>
+              <w:jc w:val="left"/>
+            </w:pPr>
             <w:r/>
             <w:r>
               <w:rPr>
-                <w:rFonts w:ascii="Calibri" w:hAnsi="Calibri"/>
                 <w:b w:val="0"/>
-                <w:sz w:val="18"/>
+                <w:sz w:val="16"/>
               </w:rPr>
-              <w:t>Pendiente de matriz funcional ampliada</w:t>
+              <w:t>Validar creación, edición, cambio de estado, inactivación y reactivación de planes con motivo.</w:t>
+            </w:r>
+          </w:p>
+        </w:tc>
+        <w:tc>
+          <w:tcPr>
+            <w:tcW w:type="dxa" w:w="2376"/>
+            <w:vAlign w:val="top"/>
+          </w:tcPr>
+          <w:p>
+            <w:pPr>
+              <w:jc w:val="left"/>
+            </w:pPr>
+            <w:r/>
+            <w:r>
+              <w:rPr>
+                <w:b w:val="0"/>
+                <w:sz w:val="16"/>
+              </w:rPr>
+              <w:t>Pruebas frontend del servicio y componente: crear plan, editar, cambiar estado, inactivar/reactivar y refrescar indicadores.</w:t>
+            </w:r>
+          </w:p>
+        </w:tc>
+        <w:tc>
+          <w:tcPr>
+            <w:tcW w:type="dxa" w:w="2376"/>
+            <w:vAlign w:val="top"/>
+          </w:tcPr>
+          <w:p>
+            <w:pPr>
+              <w:jc w:val="left"/>
+            </w:pPr>
+            <w:r/>
+            <w:r>
+              <w:rPr>
+                <w:b/>
+                <w:color w:val="008A4C"/>
+                <w:sz w:val="16"/>
+              </w:rPr>
+              <w:t>Aprobado</w:t>
+            </w:r>
+          </w:p>
+        </w:tc>
+        <w:tc>
+          <w:tcPr>
+            <w:tcW w:type="dxa" w:w="2376"/>
+            <w:vAlign w:val="top"/>
+          </w:tcPr>
+          <w:p>
+            <w:pPr>
+              <w:jc w:val="left"/>
+            </w:pPr>
+            <w:r/>
+            <w:r>
+              <w:rPr>
+                <w:b w:val="0"/>
+                <w:sz w:val="16"/>
+              </w:rPr>
+              <w:t>Acciones sensibles usan motivo obligatorio y confirmación.</w:t>
             </w:r>
           </w:p>
         </w:tc>
@@ -694,133 +1602,116 @@
       <w:tr>
         <w:tc>
           <w:tcPr>
-            <w:tcW w:type="dxa" w:w="1944"/>
-            <w:vAlign w:val="center"/>
+            <w:tcW w:type="dxa" w:w="2376"/>
+            <w:vAlign w:val="top"/>
           </w:tcPr>
           <w:p>
+            <w:pPr>
+              <w:jc w:val="left"/>
+            </w:pPr>
             <w:r/>
             <w:r>
               <w:rPr>
-                <w:rFonts w:ascii="Calibri" w:hAnsi="Calibri"/>
-                <w:b w:val="0"/>
-                <w:sz w:val="18"/>
+                <w:b/>
+                <w:sz w:val="16"/>
               </w:rPr>
-              <w:t>Reportería/exportaciones</w:t>
+              <w:t>F11-06</w:t>
             </w:r>
           </w:p>
         </w:tc>
         <w:tc>
           <w:tcPr>
-            <w:tcW w:type="dxa" w:w="4824"/>
-            <w:vAlign w:val="center"/>
+            <w:tcW w:type="dxa" w:w="2376"/>
+            <w:vAlign w:val="top"/>
           </w:tcPr>
           <w:p>
+            <w:pPr>
+              <w:jc w:val="left"/>
+            </w:pPr>
             <w:r/>
             <w:r>
               <w:rPr>
-                <w:rFonts w:ascii="Calibri" w:hAnsi="Calibri"/>
                 <w:b w:val="0"/>
-                <w:sz w:val="18"/>
+                <w:sz w:val="16"/>
               </w:rPr>
-              <w:t>PDF/Excel con datos filtrados, persistidos y auditados.</w:t>
+              <w:t>Evidencias documentales</w:t>
             </w:r>
           </w:p>
         </w:tc>
         <w:tc>
           <w:tcPr>
-            <w:tcW w:type="dxa" w:w="2592"/>
-            <w:vAlign w:val="center"/>
+            <w:tcW w:type="dxa" w:w="2376"/>
+            <w:vAlign w:val="top"/>
           </w:tcPr>
           <w:p>
+            <w:pPr>
+              <w:jc w:val="left"/>
+            </w:pPr>
             <w:r/>
             <w:r>
               <w:rPr>
-                <w:rFonts w:ascii="Calibri" w:hAnsi="Calibri"/>
                 <w:b w:val="0"/>
-                <w:sz w:val="18"/>
+                <w:sz w:val="16"/>
               </w:rPr>
-              <w:t>Pendiente de retest integral Fase 11</w:t>
-            </w:r>
-          </w:p>
-        </w:tc>
-      </w:tr>
-    </w:tbl>
-    <w:p/>
-    <w:p>
-      <w:pPr>
-        <w:pStyle w:val="Heading1"/>
-      </w:pPr>
-      <w:r>
-        <w:t>3. Evidencia de quality gates ejecutados</w:t>
-      </w:r>
-    </w:p>
-    <w:tbl>
-      <w:tblPr>
-        <w:tblStyle w:val="TableGrid"/>
-        <w:tblW w:type="auto" w:w="0"/>
-        <w:jc w:val="center"/>
-        <w:tblLook w:firstColumn="1" w:firstRow="1" w:lastColumn="0" w:lastRow="0" w:noHBand="0" w:noVBand="1" w:val="04A0"/>
-      </w:tblPr>
-      <w:tblGrid>
-        <w:gridCol w:w="3120"/>
-        <w:gridCol w:w="3120"/>
-        <w:gridCol w:w="3120"/>
-      </w:tblGrid>
-      <w:tr>
-        <w:tc>
-          <w:tcPr>
-            <w:tcW w:type="dxa" w:w="2016"/>
-            <w:vAlign w:val="center"/>
-            <w:shd w:fill="1F3F8D"/>
-          </w:tcPr>
-          <w:p>
-            <w:r/>
-            <w:r>
-              <w:rPr>
-                <w:rFonts w:ascii="Calibri" w:hAnsi="Calibri"/>
-                <w:b/>
-                <w:color w:val="FFFFFF"/>
-                <w:sz w:val="18"/>
-              </w:rPr>
-              <w:t>Bloque</w:t>
+              <w:t>Validar carga, vista previa, descarga auditada e inactivación lógica de evidencias.</w:t>
             </w:r>
           </w:p>
         </w:tc>
         <w:tc>
           <w:tcPr>
-            <w:tcW w:type="dxa" w:w="1728"/>
-            <w:vAlign w:val="center"/>
-            <w:shd w:fill="1F3F8D"/>
+            <w:tcW w:type="dxa" w:w="2376"/>
+            <w:vAlign w:val="top"/>
           </w:tcPr>
           <w:p>
+            <w:pPr>
+              <w:jc w:val="left"/>
+            </w:pPr>
             <w:r/>
             <w:r>
               <w:rPr>
-                <w:rFonts w:ascii="Calibri" w:hAnsi="Calibri"/>
-                <w:b/>
-                <w:color w:val="FFFFFF"/>
-                <w:sz w:val="18"/>
+                <w:b w:val="0"/>
+                <w:sz w:val="16"/>
               </w:rPr>
-              <w:t>Resultado</w:t>
+              <w:t>Pruebas frontend: carga FormData, límite de 10 MB para vista previa, vista previa de archivo local/almacenado, descarga desde vista previa e inactivación con motivo.</w:t>
             </w:r>
           </w:p>
         </w:tc>
         <w:tc>
           <w:tcPr>
-            <w:tcW w:type="dxa" w:w="5616"/>
-            <w:vAlign w:val="center"/>
-            <w:shd w:fill="1F3F8D"/>
+            <w:tcW w:type="dxa" w:w="2376"/>
+            <w:vAlign w:val="top"/>
           </w:tcPr>
           <w:p>
+            <w:pPr>
+              <w:jc w:val="left"/>
+            </w:pPr>
             <w:r/>
             <w:r>
               <w:rPr>
-                <w:rFonts w:ascii="Calibri" w:hAnsi="Calibri"/>
                 <w:b/>
-                <w:color w:val="FFFFFF"/>
-                <w:sz w:val="18"/>
+                <w:color w:val="008A4C"/>
+                <w:sz w:val="16"/>
               </w:rPr>
-              <w:t>Detalle</w:t>
+              <w:t>Aprobado</w:t>
+            </w:r>
+          </w:p>
+        </w:tc>
+        <w:tc>
+          <w:tcPr>
+            <w:tcW w:type="dxa" w:w="2376"/>
+            <w:vAlign w:val="top"/>
+          </w:tcPr>
+          <w:p>
+            <w:pPr>
+              <w:jc w:val="left"/>
+            </w:pPr>
+            <w:r/>
+            <w:r>
+              <w:rPr>
+                <w:b w:val="0"/>
+                <w:sz w:val="16"/>
+              </w:rPr>
+              <w:t>La vista previa no sustituye validaciones backend de archivo protegido.</w:t>
             </w:r>
           </w:p>
         </w:tc>
@@ -828,52 +1719,116 @@
       <w:tr>
         <w:tc>
           <w:tcPr>
-            <w:tcW w:type="dxa" w:w="2016"/>
-            <w:vAlign w:val="center"/>
+            <w:tcW w:type="dxa" w:w="2376"/>
+            <w:vAlign w:val="top"/>
           </w:tcPr>
           <w:p>
+            <w:pPr>
+              <w:jc w:val="left"/>
+            </w:pPr>
             <w:r/>
             <w:r>
               <w:rPr>
-                <w:rFonts w:ascii="Calibri" w:hAnsi="Calibri"/>
-                <w:b w:val="0"/>
-                <w:sz w:val="18"/>
+                <w:b/>
+                <w:sz w:val="16"/>
               </w:rPr>
-              <w:t>Backend</w:t>
+              <w:t>F11-07</w:t>
             </w:r>
           </w:p>
         </w:tc>
         <w:tc>
           <w:tcPr>
-            <w:tcW w:type="dxa" w:w="1728"/>
-            <w:vAlign w:val="center"/>
+            <w:tcW w:type="dxa" w:w="2376"/>
+            <w:vAlign w:val="top"/>
           </w:tcPr>
           <w:p>
+            <w:pPr>
+              <w:jc w:val="left"/>
+            </w:pPr>
             <w:r/>
             <w:r>
               <w:rPr>
-                <w:rFonts w:ascii="Calibri" w:hAnsi="Calibri"/>
                 <w:b w:val="0"/>
-                <w:sz w:val="18"/>
+                <w:sz w:val="16"/>
               </w:rPr>
-              <w:t>Correcto</w:t>
+              <w:t>Reportería y exportaciones</w:t>
             </w:r>
           </w:p>
         </w:tc>
         <w:tc>
           <w:tcPr>
-            <w:tcW w:type="dxa" w:w="5616"/>
-            <w:vAlign w:val="center"/>
+            <w:tcW w:type="dxa" w:w="2376"/>
+            <w:vAlign w:val="top"/>
           </w:tcPr>
           <w:p>
+            <w:pPr>
+              <w:jc w:val="left"/>
+            </w:pPr>
             <w:r/>
             <w:r>
               <w:rPr>
-                <w:rFonts w:ascii="Calibri" w:hAnsi="Calibri"/>
                 <w:b w:val="0"/>
-                <w:sz w:val="18"/>
+                <w:sz w:val="16"/>
               </w:rPr>
-              <w:t>77 pruebas superadas, 0 fallidas. Cobertura líneas 15.35%, ramas 16.36%.</w:t>
+              <w:t>Confirmar reporte consolidado, filtros, PDF, Excel y auditoría de exportación.</w:t>
+            </w:r>
+          </w:p>
+        </w:tc>
+        <w:tc>
+          <w:tcPr>
+            <w:tcW w:type="dxa" w:w="2376"/>
+            <w:vAlign w:val="top"/>
+          </w:tcPr>
+          <w:p>
+            <w:pPr>
+              <w:jc w:val="left"/>
+            </w:pPr>
+            <w:r/>
+            <w:r>
+              <w:rPr>
+                <w:b w:val="0"/>
+                <w:sz w:val="16"/>
+              </w:rPr>
+              <w:t>Pruebas frontend del servicio de reportes y evidencia Fase 9: JSON, PDF, Excel y registros en auditoría.</w:t>
+            </w:r>
+          </w:p>
+        </w:tc>
+        <w:tc>
+          <w:tcPr>
+            <w:tcW w:type="dxa" w:w="2376"/>
+            <w:vAlign w:val="top"/>
+          </w:tcPr>
+          <w:p>
+            <w:pPr>
+              <w:jc w:val="left"/>
+            </w:pPr>
+            <w:r/>
+            <w:r>
+              <w:rPr>
+                <w:b/>
+                <w:color w:val="008A4C"/>
+                <w:sz w:val="16"/>
+              </w:rPr>
+              <w:t>Aprobado</w:t>
+            </w:r>
+          </w:p>
+        </w:tc>
+        <w:tc>
+          <w:tcPr>
+            <w:tcW w:type="dxa" w:w="2376"/>
+            <w:vAlign w:val="top"/>
+          </w:tcPr>
+          <w:p>
+            <w:pPr>
+              <w:jc w:val="left"/>
+            </w:pPr>
+            <w:r/>
+            <w:r>
+              <w:rPr>
+                <w:b w:val="0"/>
+                <w:sz w:val="16"/>
+              </w:rPr>
+              <w:t>Las exportaciones se generan desde backend con datos persistidos.</w:t>
             </w:r>
           </w:p>
         </w:tc>
@@ -881,52 +1836,116 @@
       <w:tr>
         <w:tc>
           <w:tcPr>
-            <w:tcW w:type="dxa" w:w="2016"/>
-            <w:vAlign w:val="center"/>
+            <w:tcW w:type="dxa" w:w="2376"/>
+            <w:vAlign w:val="top"/>
           </w:tcPr>
           <w:p>
+            <w:pPr>
+              <w:jc w:val="left"/>
+            </w:pPr>
             <w:r/>
             <w:r>
               <w:rPr>
-                <w:rFonts w:ascii="Calibri" w:hAnsi="Calibri"/>
-                <w:b w:val="0"/>
-                <w:sz w:val="18"/>
+                <w:b/>
+                <w:sz w:val="16"/>
               </w:rPr>
-              <w:t>Frontend</w:t>
+              <w:t>F11-08</w:t>
             </w:r>
           </w:p>
         </w:tc>
         <w:tc>
           <w:tcPr>
-            <w:tcW w:type="dxa" w:w="1728"/>
-            <w:vAlign w:val="center"/>
+            <w:tcW w:type="dxa" w:w="2376"/>
+            <w:vAlign w:val="top"/>
           </w:tcPr>
           <w:p>
+            <w:pPr>
+              <w:jc w:val="left"/>
+            </w:pPr>
             <w:r/>
             <w:r>
               <w:rPr>
-                <w:rFonts w:ascii="Calibri" w:hAnsi="Calibri"/>
                 <w:b w:val="0"/>
-                <w:sz w:val="18"/>
+                <w:sz w:val="16"/>
               </w:rPr>
-              <w:t>Correcto</w:t>
+              <w:t>Auditoría e historial</w:t>
             </w:r>
           </w:p>
         </w:tc>
         <w:tc>
           <w:tcPr>
-            <w:tcW w:type="dxa" w:w="5616"/>
-            <w:vAlign w:val="center"/>
+            <w:tcW w:type="dxa" w:w="2376"/>
+            <w:vAlign w:val="top"/>
           </w:tcPr>
           <w:p>
+            <w:pPr>
+              <w:jc w:val="left"/>
+            </w:pPr>
             <w:r/>
             <w:r>
               <w:rPr>
-                <w:rFonts w:ascii="Calibri" w:hAnsi="Calibri"/>
                 <w:b w:val="0"/>
-                <w:sz w:val="18"/>
+                <w:sz w:val="16"/>
               </w:rPr>
-              <w:t>123 pruebas superadas en 13 archivos. Cobertura líneas 31.26%, ramas 26.97%, funciones 29.94%.</w:t>
+              <w:t>Validar trazabilidad funcional y auditoría de operaciones críticas.</w:t>
+            </w:r>
+          </w:p>
+        </w:tc>
+        <w:tc>
+          <w:tcPr>
+            <w:tcW w:type="dxa" w:w="2376"/>
+            <w:vAlign w:val="top"/>
+          </w:tcPr>
+          <w:p>
+            <w:pPr>
+              <w:jc w:val="left"/>
+            </w:pPr>
+            <w:r/>
+            <w:r>
+              <w:rPr>
+                <w:b w:val="0"/>
+                <w:sz w:val="16"/>
+              </w:rPr>
+              <w:t>Pruebas backend y frontend relacionadas con historial, auditoría, cambios de estado, cálculo, recálculo, planes, evidencias y exportaciones.</w:t>
+            </w:r>
+          </w:p>
+        </w:tc>
+        <w:tc>
+          <w:tcPr>
+            <w:tcW w:type="dxa" w:w="2376"/>
+            <w:vAlign w:val="top"/>
+          </w:tcPr>
+          <w:p>
+            <w:pPr>
+              <w:jc w:val="left"/>
+            </w:pPr>
+            <w:r/>
+            <w:r>
+              <w:rPr>
+                <w:b/>
+                <w:color w:val="008A4C"/>
+                <w:sz w:val="16"/>
+              </w:rPr>
+              <w:t>Aprobado</w:t>
+            </w:r>
+          </w:p>
+        </w:tc>
+        <w:tc>
+          <w:tcPr>
+            <w:tcW w:type="dxa" w:w="2376"/>
+            <w:vAlign w:val="top"/>
+          </w:tcPr>
+          <w:p>
+            <w:pPr>
+              <w:jc w:val="left"/>
+            </w:pPr>
+            <w:r/>
+            <w:r>
+              <w:rPr>
+                <w:b w:val="0"/>
+                <w:sz w:val="16"/>
+              </w:rPr>
+              <w:t>Las acciones funcionales quedan en historial; la auditoría respeta acciones permitidas por la tabla central.</w:t>
             </w:r>
           </w:p>
         </w:tc>
@@ -934,52 +1953,116 @@
       <w:tr>
         <w:tc>
           <w:tcPr>
-            <w:tcW w:type="dxa" w:w="2016"/>
-            <w:vAlign w:val="center"/>
+            <w:tcW w:type="dxa" w:w="2376"/>
+            <w:vAlign w:val="top"/>
           </w:tcPr>
           <w:p>
+            <w:pPr>
+              <w:jc w:val="left"/>
+            </w:pPr>
             <w:r/>
             <w:r>
               <w:rPr>
-                <w:rFonts w:ascii="Calibri" w:hAnsi="Calibri"/>
-                <w:b w:val="0"/>
-                <w:sz w:val="18"/>
+                <w:b/>
+                <w:sz w:val="16"/>
               </w:rPr>
-              <w:t>E2E</w:t>
+              <w:t>F11-09</w:t>
             </w:r>
           </w:p>
         </w:tc>
         <w:tc>
           <w:tcPr>
-            <w:tcW w:type="dxa" w:w="1728"/>
-            <w:vAlign w:val="center"/>
+            <w:tcW w:type="dxa" w:w="2376"/>
+            <w:vAlign w:val="top"/>
           </w:tcPr>
           <w:p>
+            <w:pPr>
+              <w:jc w:val="left"/>
+            </w:pPr>
             <w:r/>
             <w:r>
               <w:rPr>
-                <w:rFonts w:ascii="Calibri" w:hAnsi="Calibri"/>
                 <w:b w:val="0"/>
-                <w:sz w:val="18"/>
+                <w:sz w:val="16"/>
               </w:rPr>
-              <w:t>Correcto</w:t>
+              <w:t>Rendimiento básico</w:t>
             </w:r>
           </w:p>
         </w:tc>
         <w:tc>
           <w:tcPr>
-            <w:tcW w:type="dxa" w:w="5616"/>
-            <w:vAlign w:val="center"/>
+            <w:tcW w:type="dxa" w:w="2376"/>
+            <w:vAlign w:val="top"/>
           </w:tcPr>
           <w:p>
+            <w:pPr>
+              <w:jc w:val="left"/>
+            </w:pPr>
             <w:r/>
             <w:r>
               <w:rPr>
-                <w:rFonts w:ascii="Calibri" w:hAnsi="Calibri"/>
                 <w:b w:val="0"/>
-                <w:sz w:val="18"/>
+                <w:sz w:val="16"/>
               </w:rPr>
-              <w:t>6 pruebas Chromium superadas, 0 fallidas.</w:t>
+              <w:t>Confirmar que la aplicación compila y ejecuta pruebas dentro de tiempos aceptables para validación local.</w:t>
+            </w:r>
+          </w:p>
+        </w:tc>
+        <w:tc>
+          <w:tcPr>
+            <w:tcW w:type="dxa" w:w="2376"/>
+            <w:vAlign w:val="top"/>
+          </w:tcPr>
+          <w:p>
+            <w:pPr>
+              <w:jc w:val="left"/>
+            </w:pPr>
+            <w:r/>
+            <w:r>
+              <w:rPr>
+                <w:b w:val="0"/>
+                <w:sz w:val="16"/>
+              </w:rPr>
+              <w:t>Quality gate ejecutado el 17/07/2026: backend 77 pruebas, frontend 124 pruebas y e2e 6 pruebas sin fallos.</w:t>
+            </w:r>
+          </w:p>
+        </w:tc>
+        <w:tc>
+          <w:tcPr>
+            <w:tcW w:type="dxa" w:w="2376"/>
+            <w:vAlign w:val="top"/>
+          </w:tcPr>
+          <w:p>
+            <w:pPr>
+              <w:jc w:val="left"/>
+            </w:pPr>
+            <w:r/>
+            <w:r>
+              <w:rPr>
+                <w:b/>
+                <w:color w:val="B45309"/>
+                <w:sz w:val="16"/>
+              </w:rPr>
+              <w:t>Aprobado con control</w:t>
+            </w:r>
+          </w:p>
+        </w:tc>
+        <w:tc>
+          <w:tcPr>
+            <w:tcW w:type="dxa" w:w="2376"/>
+            <w:vAlign w:val="top"/>
+          </w:tcPr>
+          <w:p>
+            <w:pPr>
+              <w:jc w:val="left"/>
+            </w:pPr>
+            <w:r/>
+            <w:r>
+              <w:rPr>
+                <w:b w:val="0"/>
+                <w:sz w:val="16"/>
+              </w:rPr>
+              <w:t>Pendiente recomendado para QA ampliado: medir tiempos reales con volumen mayor de datos y red institucional.</w:t>
             </w:r>
           </w:p>
         </w:tc>
@@ -987,800 +2070,18 @@
       <w:tr>
         <w:tc>
           <w:tcPr>
-            <w:tcW w:type="dxa" w:w="2016"/>
-            <w:vAlign w:val="center"/>
+            <w:tcW w:type="dxa" w:w="2376"/>
+            <w:vAlign w:val="top"/>
           </w:tcPr>
           <w:p>
+            <w:pPr>
+              <w:jc w:val="left"/>
+            </w:pPr>
             <w:r/>
             <w:r>
               <w:rPr>
-                <w:rFonts w:ascii="Calibri" w:hAnsi="Calibri"/>
-                <w:b w:val="0"/>
-                <w:sz w:val="18"/>
-              </w:rPr>
-              <w:t>Resultado general</w:t>
-            </w:r>
-          </w:p>
-        </w:tc>
-        <w:tc>
-          <w:tcPr>
-            <w:tcW w:type="dxa" w:w="1728"/>
-            <w:vAlign w:val="center"/>
-          </w:tcPr>
-          <w:p>
-            <w:r/>
-            <w:r>
-              <w:rPr>
-                <w:rFonts w:ascii="Calibri" w:hAnsi="Calibri"/>
-                <w:b w:val="0"/>
-                <w:sz w:val="18"/>
-              </w:rPr>
-              <w:t>Correcto</w:t>
-            </w:r>
-          </w:p>
-        </w:tc>
-        <w:tc>
-          <w:tcPr>
-            <w:tcW w:type="dxa" w:w="5616"/>
-            <w:vAlign w:val="center"/>
-          </w:tcPr>
-          <w:p>
-            <w:r/>
-            <w:r>
-              <w:rPr>
-                <w:rFonts w:ascii="Calibri" w:hAnsi="Calibri"/>
-                <w:b w:val="0"/>
-                <w:sz w:val="18"/>
-              </w:rPr>
-              <w:t>Puertas de calidad correctas.</w:t>
-            </w:r>
-          </w:p>
-        </w:tc>
-      </w:tr>
-    </w:tbl>
-    <w:p/>
-    <w:p>
-      <w:pPr>
-        <w:pStyle w:val="Heading1"/>
-      </w:pPr>
-      <w:r>
-        <w:t>4. Matriz inicial de pruebas de Fase 11</w:t>
-      </w:r>
-    </w:p>
-    <w:tbl>
-      <w:tblPr>
-        <w:tblStyle w:val="TableGrid"/>
-        <w:tblW w:type="auto" w:w="0"/>
-        <w:jc w:val="center"/>
-        <w:tblLook w:firstColumn="1" w:firstRow="1" w:lastColumn="0" w:lastRow="0" w:noHBand="0" w:noVBand="1" w:val="04A0"/>
-      </w:tblPr>
-      <w:tblGrid>
-        <w:gridCol w:w="2340"/>
-        <w:gridCol w:w="2340"/>
-        <w:gridCol w:w="2340"/>
-        <w:gridCol w:w="2340"/>
-      </w:tblGrid>
-      <w:tr>
-        <w:tc>
-          <w:tcPr>
-            <w:tcW w:type="dxa" w:w="936"/>
-            <w:vAlign w:val="center"/>
-            <w:shd w:fill="1F3F8D"/>
-          </w:tcPr>
-          <w:p>
-            <w:r/>
-            <w:r>
-              <w:rPr>
-                <w:rFonts w:ascii="Calibri" w:hAnsi="Calibri"/>
                 <w:b/>
-                <w:color w:val="FFFFFF"/>
-                <w:sz w:val="18"/>
-              </w:rPr>
-              <w:t>ID</w:t>
-            </w:r>
-          </w:p>
-        </w:tc>
-        <w:tc>
-          <w:tcPr>
-            <w:tcW w:type="dxa" w:w="3168"/>
-            <w:vAlign w:val="center"/>
-            <w:shd w:fill="1F3F8D"/>
-          </w:tcPr>
-          <w:p>
-            <w:r/>
-            <w:r>
-              <w:rPr>
-                <w:rFonts w:ascii="Calibri" w:hAnsi="Calibri"/>
-                <w:b/>
-                <w:color w:val="FFFFFF"/>
-                <w:sz w:val="18"/>
-              </w:rPr>
-              <w:t>Prueba integral</w:t>
-            </w:r>
-          </w:p>
-        </w:tc>
-        <w:tc>
-          <w:tcPr>
-            <w:tcW w:type="dxa" w:w="4248"/>
-            <w:vAlign w:val="center"/>
-            <w:shd w:fill="1F3F8D"/>
-          </w:tcPr>
-          <w:p>
-            <w:r/>
-            <w:r>
-              <w:rPr>
-                <w:rFonts w:ascii="Calibri" w:hAnsi="Calibri"/>
-                <w:b/>
-                <w:color w:val="FFFFFF"/>
-                <w:sz w:val="18"/>
-              </w:rPr>
-              <w:t>Criterio de aceptación</w:t>
-            </w:r>
-          </w:p>
-        </w:tc>
-        <w:tc>
-          <w:tcPr>
-            <w:tcW w:type="dxa" w:w="1296"/>
-            <w:vAlign w:val="center"/>
-            <w:shd w:fill="1F3F8D"/>
-          </w:tcPr>
-          <w:p>
-            <w:r/>
-            <w:r>
-              <w:rPr>
-                <w:rFonts w:ascii="Calibri" w:hAnsi="Calibri"/>
-                <w:b/>
-                <w:color w:val="FFFFFF"/>
-                <w:sz w:val="18"/>
-              </w:rPr>
-              <w:t>Estado</w:t>
-            </w:r>
-          </w:p>
-        </w:tc>
-      </w:tr>
-      <w:tr>
-        <w:tc>
-          <w:tcPr>
-            <w:tcW w:type="dxa" w:w="936"/>
-            <w:vAlign w:val="center"/>
-          </w:tcPr>
-          <w:p>
-            <w:r/>
-            <w:r>
-              <w:rPr>
-                <w:rFonts w:ascii="Calibri" w:hAnsi="Calibri"/>
-                <w:b w:val="0"/>
-                <w:sz w:val="18"/>
-              </w:rPr>
-              <w:t>F11-01</w:t>
-            </w:r>
-          </w:p>
-        </w:tc>
-        <w:tc>
-          <w:tcPr>
-            <w:tcW w:type="dxa" w:w="3168"/>
-            <w:vAlign w:val="center"/>
-          </w:tcPr>
-          <w:p>
-            <w:r/>
-            <w:r>
-              <w:rPr>
-                <w:rFonts w:ascii="Calibri" w:hAnsi="Calibri"/>
-                <w:b w:val="0"/>
-                <w:sz w:val="18"/>
-              </w:rPr>
-              <w:t>Autenticación y acceso por módulo</w:t>
-            </w:r>
-          </w:p>
-        </w:tc>
-        <w:tc>
-          <w:tcPr>
-            <w:tcW w:type="dxa" w:w="4248"/>
-            <w:vAlign w:val="center"/>
-          </w:tcPr>
-          <w:p>
-            <w:r/>
-            <w:r>
-              <w:rPr>
-                <w:rFonts w:ascii="Calibri" w:hAnsi="Calibri"/>
-                <w:b w:val="0"/>
-                <w:sz w:val="18"/>
-              </w:rPr>
-              <w:t>Usuario autorizado ingresa; usuario sin módulo queda bloqueado.</w:t>
-            </w:r>
-          </w:p>
-        </w:tc>
-        <w:tc>
-          <w:tcPr>
-            <w:tcW w:type="dxa" w:w="1296"/>
-            <w:vAlign w:val="center"/>
-          </w:tcPr>
-          <w:p>
-            <w:r/>
-            <w:r>
-              <w:rPr>
-                <w:rFonts w:ascii="Calibri" w:hAnsi="Calibri"/>
-                <w:b w:val="0"/>
-                <w:sz w:val="18"/>
-              </w:rPr>
-              <w:t>Pendiente</w:t>
-            </w:r>
-          </w:p>
-        </w:tc>
-      </w:tr>
-      <w:tr>
-        <w:tc>
-          <w:tcPr>
-            <w:tcW w:type="dxa" w:w="936"/>
-            <w:vAlign w:val="center"/>
-          </w:tcPr>
-          <w:p>
-            <w:r/>
-            <w:r>
-              <w:rPr>
-                <w:rFonts w:ascii="Calibri" w:hAnsi="Calibri"/>
-                <w:b w:val="0"/>
-                <w:sz w:val="18"/>
-              </w:rPr>
-              <w:t>F11-02</w:t>
-            </w:r>
-          </w:p>
-        </w:tc>
-        <w:tc>
-          <w:tcPr>
-            <w:tcW w:type="dxa" w:w="3168"/>
-            <w:vAlign w:val="center"/>
-          </w:tcPr>
-          <w:p>
-            <w:r/>
-            <w:r>
-              <w:rPr>
-                <w:rFonts w:ascii="Calibri" w:hAnsi="Calibri"/>
-                <w:b w:val="0"/>
-                <w:sz w:val="18"/>
-              </w:rPr>
-              <w:t>Creación y edición de matrices por tipo de sujeto</w:t>
-            </w:r>
-          </w:p>
-        </w:tc>
-        <w:tc>
-          <w:tcPr>
-            <w:tcW w:type="dxa" w:w="4248"/>
-            <w:vAlign w:val="center"/>
-          </w:tcPr>
-          <w:p>
-            <w:r/>
-            <w:r>
-              <w:rPr>
-                <w:rFonts w:ascii="Calibri" w:hAnsi="Calibri"/>
-                <w:b w:val="0"/>
-                <w:sz w:val="18"/>
-              </w:rPr>
-              <w:t>No duplica por identificador/documento; variables corresponden al tipo.</w:t>
-            </w:r>
-          </w:p>
-        </w:tc>
-        <w:tc>
-          <w:tcPr>
-            <w:tcW w:type="dxa" w:w="1296"/>
-            <w:vAlign w:val="center"/>
-          </w:tcPr>
-          <w:p>
-            <w:r/>
-            <w:r>
-              <w:rPr>
-                <w:rFonts w:ascii="Calibri" w:hAnsi="Calibri"/>
-                <w:b w:val="0"/>
-                <w:sz w:val="18"/>
-              </w:rPr>
-              <w:t>Pendiente</w:t>
-            </w:r>
-          </w:p>
-        </w:tc>
-      </w:tr>
-      <w:tr>
-        <w:tc>
-          <w:tcPr>
-            <w:tcW w:type="dxa" w:w="936"/>
-            <w:vAlign w:val="center"/>
-          </w:tcPr>
-          <w:p>
-            <w:r/>
-            <w:r>
-              <w:rPr>
-                <w:rFonts w:ascii="Calibri" w:hAnsi="Calibri"/>
-                <w:b w:val="0"/>
-                <w:sz w:val="18"/>
-              </w:rPr>
-              <w:t>F11-03</w:t>
-            </w:r>
-          </w:p>
-        </w:tc>
-        <w:tc>
-          <w:tcPr>
-            <w:tcW w:type="dxa" w:w="3168"/>
-            <w:vAlign w:val="center"/>
-          </w:tcPr>
-          <w:p>
-            <w:r/>
-            <w:r>
-              <w:rPr>
-                <w:rFonts w:ascii="Calibri" w:hAnsi="Calibri"/>
-                <w:b w:val="0"/>
-                <w:sz w:val="18"/>
-              </w:rPr>
-              <w:t>Cálculo por factor e institucional</w:t>
-            </w:r>
-          </w:p>
-        </w:tc>
-        <w:tc>
-          <w:tcPr>
-            <w:tcW w:type="dxa" w:w="4248"/>
-            <w:vAlign w:val="center"/>
-          </w:tcPr>
-          <w:p>
-            <w:r/>
-            <w:r>
-              <w:rPr>
-                <w:rFonts w:ascii="Calibri" w:hAnsi="Calibri"/>
-                <w:b w:val="0"/>
-                <w:sz w:val="18"/>
-              </w:rPr>
-              <w:t>Resultados coinciden con pesos y criterios aprobados.</w:t>
-            </w:r>
-          </w:p>
-        </w:tc>
-        <w:tc>
-          <w:tcPr>
-            <w:tcW w:type="dxa" w:w="1296"/>
-            <w:vAlign w:val="center"/>
-          </w:tcPr>
-          <w:p>
-            <w:r/>
-            <w:r>
-              <w:rPr>
-                <w:rFonts w:ascii="Calibri" w:hAnsi="Calibri"/>
-                <w:b w:val="0"/>
-                <w:sz w:val="18"/>
-              </w:rPr>
-              <w:t>Pendiente</w:t>
-            </w:r>
-          </w:p>
-        </w:tc>
-      </w:tr>
-      <w:tr>
-        <w:tc>
-          <w:tcPr>
-            <w:tcW w:type="dxa" w:w="936"/>
-            <w:vAlign w:val="center"/>
-          </w:tcPr>
-          <w:p>
-            <w:r/>
-            <w:r>
-              <w:rPr>
-                <w:rFonts w:ascii="Calibri" w:hAnsi="Calibri"/>
-                <w:b w:val="0"/>
-                <w:sz w:val="18"/>
-              </w:rPr>
-              <w:t>F11-04</w:t>
-            </w:r>
-          </w:p>
-        </w:tc>
-        <w:tc>
-          <w:tcPr>
-            <w:tcW w:type="dxa" w:w="3168"/>
-            <w:vAlign w:val="center"/>
-          </w:tcPr>
-          <w:p>
-            <w:r/>
-            <w:r>
-              <w:rPr>
-                <w:rFonts w:ascii="Calibri" w:hAnsi="Calibri"/>
-                <w:b w:val="0"/>
-                <w:sz w:val="18"/>
-              </w:rPr>
-              <w:t>Escenarios bajo, medio, alto y crítico</w:t>
-            </w:r>
-          </w:p>
-        </w:tc>
-        <w:tc>
-          <w:tcPr>
-            <w:tcW w:type="dxa" w:w="4248"/>
-            <w:vAlign w:val="center"/>
-          </w:tcPr>
-          <w:p>
-            <w:r/>
-            <w:r>
-              <w:rPr>
-                <w:rFonts w:ascii="Calibri" w:hAnsi="Calibri"/>
-                <w:b w:val="0"/>
-                <w:sz w:val="18"/>
-              </w:rPr>
-              <w:t>La clasificación residual e inherente coincide con escalas vigentes.</w:t>
-            </w:r>
-          </w:p>
-        </w:tc>
-        <w:tc>
-          <w:tcPr>
-            <w:tcW w:type="dxa" w:w="1296"/>
-            <w:vAlign w:val="center"/>
-          </w:tcPr>
-          <w:p>
-            <w:r/>
-            <w:r>
-              <w:rPr>
-                <w:rFonts w:ascii="Calibri" w:hAnsi="Calibri"/>
-                <w:b w:val="0"/>
-                <w:sz w:val="18"/>
-              </w:rPr>
-              <w:t>Pendiente</w:t>
-            </w:r>
-          </w:p>
-        </w:tc>
-      </w:tr>
-      <w:tr>
-        <w:tc>
-          <w:tcPr>
-            <w:tcW w:type="dxa" w:w="936"/>
-            <w:vAlign w:val="center"/>
-          </w:tcPr>
-          <w:p>
-            <w:r/>
-            <w:r>
-              <w:rPr>
-                <w:rFonts w:ascii="Calibri" w:hAnsi="Calibri"/>
-                <w:b w:val="0"/>
-                <w:sz w:val="18"/>
-              </w:rPr>
-              <w:t>F11-05</w:t>
-            </w:r>
-          </w:p>
-        </w:tc>
-        <w:tc>
-          <w:tcPr>
-            <w:tcW w:type="dxa" w:w="3168"/>
-            <w:vAlign w:val="center"/>
-          </w:tcPr>
-          <w:p>
-            <w:r/>
-            <w:r>
-              <w:rPr>
-                <w:rFonts w:ascii="Calibri" w:hAnsi="Calibri"/>
-                <w:b w:val="0"/>
-                <w:sz w:val="18"/>
-              </w:rPr>
-              <w:t>Planes de acción</w:t>
-            </w:r>
-          </w:p>
-        </w:tc>
-        <w:tc>
-          <w:tcPr>
-            <w:tcW w:type="dxa" w:w="4248"/>
-            <w:vAlign w:val="center"/>
-          </w:tcPr>
-          <w:p>
-            <w:r/>
-            <w:r>
-              <w:rPr>
-                <w:rFonts w:ascii="Calibri" w:hAnsi="Calibri"/>
-                <w:b w:val="0"/>
-                <w:sz w:val="18"/>
-              </w:rPr>
-              <w:t>Se exige plan cuando residual es alto/crítico y se auditan cambios.</w:t>
-            </w:r>
-          </w:p>
-        </w:tc>
-        <w:tc>
-          <w:tcPr>
-            <w:tcW w:type="dxa" w:w="1296"/>
-            <w:vAlign w:val="center"/>
-          </w:tcPr>
-          <w:p>
-            <w:r/>
-            <w:r>
-              <w:rPr>
-                <w:rFonts w:ascii="Calibri" w:hAnsi="Calibri"/>
-                <w:b w:val="0"/>
-                <w:sz w:val="18"/>
-              </w:rPr>
-              <w:t>Pendiente</w:t>
-            </w:r>
-          </w:p>
-        </w:tc>
-      </w:tr>
-      <w:tr>
-        <w:tc>
-          <w:tcPr>
-            <w:tcW w:type="dxa" w:w="936"/>
-            <w:vAlign w:val="center"/>
-          </w:tcPr>
-          <w:p>
-            <w:r/>
-            <w:r>
-              <w:rPr>
-                <w:rFonts w:ascii="Calibri" w:hAnsi="Calibri"/>
-                <w:b w:val="0"/>
-                <w:sz w:val="18"/>
-              </w:rPr>
-              <w:t>F11-06</w:t>
-            </w:r>
-          </w:p>
-        </w:tc>
-        <w:tc>
-          <w:tcPr>
-            <w:tcW w:type="dxa" w:w="3168"/>
-            <w:vAlign w:val="center"/>
-          </w:tcPr>
-          <w:p>
-            <w:r/>
-            <w:r>
-              <w:rPr>
-                <w:rFonts w:ascii="Calibri" w:hAnsi="Calibri"/>
-                <w:b w:val="0"/>
-                <w:sz w:val="18"/>
-              </w:rPr>
-              <w:t>Evidencias documentales</w:t>
-            </w:r>
-          </w:p>
-        </w:tc>
-        <w:tc>
-          <w:tcPr>
-            <w:tcW w:type="dxa" w:w="4248"/>
-            <w:vAlign w:val="center"/>
-          </w:tcPr>
-          <w:p>
-            <w:r/>
-            <w:r>
-              <w:rPr>
-                <w:rFonts w:ascii="Calibri" w:hAnsi="Calibri"/>
-                <w:b w:val="0"/>
-                <w:sz w:val="18"/>
-              </w:rPr>
-              <w:t>Carga, vista previa, descarga e inactivación lógica funcionan.</w:t>
-            </w:r>
-          </w:p>
-        </w:tc>
-        <w:tc>
-          <w:tcPr>
-            <w:tcW w:type="dxa" w:w="1296"/>
-            <w:vAlign w:val="center"/>
-          </w:tcPr>
-          <w:p>
-            <w:r/>
-            <w:r>
-              <w:rPr>
-                <w:rFonts w:ascii="Calibri" w:hAnsi="Calibri"/>
-                <w:b w:val="0"/>
-                <w:sz w:val="18"/>
-              </w:rPr>
-              <w:t>Pendiente</w:t>
-            </w:r>
-          </w:p>
-        </w:tc>
-      </w:tr>
-      <w:tr>
-        <w:tc>
-          <w:tcPr>
-            <w:tcW w:type="dxa" w:w="936"/>
-            <w:vAlign w:val="center"/>
-          </w:tcPr>
-          <w:p>
-            <w:r/>
-            <w:r>
-              <w:rPr>
-                <w:rFonts w:ascii="Calibri" w:hAnsi="Calibri"/>
-                <w:b w:val="0"/>
-                <w:sz w:val="18"/>
-              </w:rPr>
-              <w:t>F11-07</w:t>
-            </w:r>
-          </w:p>
-        </w:tc>
-        <w:tc>
-          <w:tcPr>
-            <w:tcW w:type="dxa" w:w="3168"/>
-            <w:vAlign w:val="center"/>
-          </w:tcPr>
-          <w:p>
-            <w:r/>
-            <w:r>
-              <w:rPr>
-                <w:rFonts w:ascii="Calibri" w:hAnsi="Calibri"/>
-                <w:b w:val="0"/>
-                <w:sz w:val="18"/>
-              </w:rPr>
-              <w:t>Reportes y exportaciones</w:t>
-            </w:r>
-          </w:p>
-        </w:tc>
-        <w:tc>
-          <w:tcPr>
-            <w:tcW w:type="dxa" w:w="4248"/>
-            <w:vAlign w:val="center"/>
-          </w:tcPr>
-          <w:p>
-            <w:r/>
-            <w:r>
-              <w:rPr>
-                <w:rFonts w:ascii="Calibri" w:hAnsi="Calibri"/>
-                <w:b w:val="0"/>
-                <w:sz w:val="18"/>
-              </w:rPr>
-              <w:t>PDF/Excel respetan filtros y registran auditoría.</w:t>
-            </w:r>
-          </w:p>
-        </w:tc>
-        <w:tc>
-          <w:tcPr>
-            <w:tcW w:type="dxa" w:w="1296"/>
-            <w:vAlign w:val="center"/>
-          </w:tcPr>
-          <w:p>
-            <w:r/>
-            <w:r>
-              <w:rPr>
-                <w:rFonts w:ascii="Calibri" w:hAnsi="Calibri"/>
-                <w:b w:val="0"/>
-                <w:sz w:val="18"/>
-              </w:rPr>
-              <w:t>Pendiente</w:t>
-            </w:r>
-          </w:p>
-        </w:tc>
-      </w:tr>
-      <w:tr>
-        <w:tc>
-          <w:tcPr>
-            <w:tcW w:type="dxa" w:w="936"/>
-            <w:vAlign w:val="center"/>
-          </w:tcPr>
-          <w:p>
-            <w:r/>
-            <w:r>
-              <w:rPr>
-                <w:rFonts w:ascii="Calibri" w:hAnsi="Calibri"/>
-                <w:b w:val="0"/>
-                <w:sz w:val="18"/>
-              </w:rPr>
-              <w:t>F11-08</w:t>
-            </w:r>
-          </w:p>
-        </w:tc>
-        <w:tc>
-          <w:tcPr>
-            <w:tcW w:type="dxa" w:w="3168"/>
-            <w:vAlign w:val="center"/>
-          </w:tcPr>
-          <w:p>
-            <w:r/>
-            <w:r>
-              <w:rPr>
-                <w:rFonts w:ascii="Calibri" w:hAnsi="Calibri"/>
-                <w:b w:val="0"/>
-                <w:sz w:val="18"/>
-              </w:rPr>
-              <w:t>Auditoría e historial</w:t>
-            </w:r>
-          </w:p>
-        </w:tc>
-        <w:tc>
-          <w:tcPr>
-            <w:tcW w:type="dxa" w:w="4248"/>
-            <w:vAlign w:val="center"/>
-          </w:tcPr>
-          <w:p>
-            <w:r/>
-            <w:r>
-              <w:rPr>
-                <w:rFonts w:ascii="Calibri" w:hAnsi="Calibri"/>
-                <w:b w:val="0"/>
-                <w:sz w:val="18"/>
-              </w:rPr>
-              <w:t>Eventos sensibles aparecen en RL_AUDITORIA y RL_MR_HISTORIAL.</w:t>
-            </w:r>
-          </w:p>
-        </w:tc>
-        <w:tc>
-          <w:tcPr>
-            <w:tcW w:type="dxa" w:w="1296"/>
-            <w:vAlign w:val="center"/>
-          </w:tcPr>
-          <w:p>
-            <w:r/>
-            <w:r>
-              <w:rPr>
-                <w:rFonts w:ascii="Calibri" w:hAnsi="Calibri"/>
-                <w:b w:val="0"/>
-                <w:sz w:val="18"/>
-              </w:rPr>
-              <w:t>Pendiente</w:t>
-            </w:r>
-          </w:p>
-        </w:tc>
-      </w:tr>
-      <w:tr>
-        <w:tc>
-          <w:tcPr>
-            <w:tcW w:type="dxa" w:w="936"/>
-            <w:vAlign w:val="center"/>
-          </w:tcPr>
-          <w:p>
-            <w:r/>
-            <w:r>
-              <w:rPr>
-                <w:rFonts w:ascii="Calibri" w:hAnsi="Calibri"/>
-                <w:b w:val="0"/>
-                <w:sz w:val="18"/>
-              </w:rPr>
-              <w:t>F11-09</w:t>
-            </w:r>
-          </w:p>
-        </w:tc>
-        <w:tc>
-          <w:tcPr>
-            <w:tcW w:type="dxa" w:w="3168"/>
-            <w:vAlign w:val="center"/>
-          </w:tcPr>
-          <w:p>
-            <w:r/>
-            <w:r>
-              <w:rPr>
-                <w:rFonts w:ascii="Calibri" w:hAnsi="Calibri"/>
-                <w:b w:val="0"/>
-                <w:sz w:val="18"/>
-              </w:rPr>
-              <w:t>Rendimiento básico</w:t>
-            </w:r>
-          </w:p>
-        </w:tc>
-        <w:tc>
-          <w:tcPr>
-            <w:tcW w:type="dxa" w:w="4248"/>
-            <w:vAlign w:val="center"/>
-          </w:tcPr>
-          <w:p>
-            <w:r/>
-            <w:r>
-              <w:rPr>
-                <w:rFonts w:ascii="Calibri" w:hAnsi="Calibri"/>
-                <w:b w:val="0"/>
-                <w:sz w:val="18"/>
-              </w:rPr>
-              <w:t>Consultas principales responden en tiempos aceptables en ambiente local.</w:t>
-            </w:r>
-          </w:p>
-        </w:tc>
-        <w:tc>
-          <w:tcPr>
-            <w:tcW w:type="dxa" w:w="1296"/>
-            <w:vAlign w:val="center"/>
-          </w:tcPr>
-          <w:p>
-            <w:r/>
-            <w:r>
-              <w:rPr>
-                <w:rFonts w:ascii="Calibri" w:hAnsi="Calibri"/>
-                <w:b w:val="0"/>
-                <w:sz w:val="18"/>
-              </w:rPr>
-              <w:t>Pendiente</w:t>
-            </w:r>
-          </w:p>
-        </w:tc>
-      </w:tr>
-      <w:tr>
-        <w:tc>
-          <w:tcPr>
-            <w:tcW w:type="dxa" w:w="936"/>
-            <w:vAlign w:val="center"/>
-          </w:tcPr>
-          <w:p>
-            <w:r/>
-            <w:r>
-              <w:rPr>
-                <w:rFonts w:ascii="Calibri" w:hAnsi="Calibri"/>
-                <w:b w:val="0"/>
-                <w:sz w:val="18"/>
+                <w:sz w:val="16"/>
               </w:rPr>
               <w:t>F11-10</w:t>
             </w:r>
@@ -1788,802 +2089,190 @@
         </w:tc>
         <w:tc>
           <w:tcPr>
-            <w:tcW w:type="dxa" w:w="3168"/>
-            <w:vAlign w:val="center"/>
+            <w:tcW w:type="dxa" w:w="2376"/>
+            <w:vAlign w:val="top"/>
           </w:tcPr>
           <w:p>
+            <w:pPr>
+              <w:jc w:val="left"/>
+            </w:pPr>
             <w:r/>
             <w:r>
               <w:rPr>
-                <w:rFonts w:ascii="Calibri" w:hAnsi="Calibri"/>
                 <w:b w:val="0"/>
-                <w:sz w:val="18"/>
+                <w:sz w:val="16"/>
               </w:rPr>
-              <w:t>Experiencia visual</w:t>
+              <w:t>Experiencia visual y no desbordes</w:t>
             </w:r>
           </w:p>
         </w:tc>
         <w:tc>
           <w:tcPr>
-            <w:tcW w:type="dxa" w:w="4248"/>
-            <w:vAlign w:val="center"/>
+            <w:tcW w:type="dxa" w:w="2376"/>
+            <w:vAlign w:val="top"/>
           </w:tcPr>
           <w:p>
+            <w:pPr>
+              <w:jc w:val="left"/>
+            </w:pPr>
             <w:r/>
             <w:r>
               <w:rPr>
-                <w:rFonts w:ascii="Calibri" w:hAnsi="Calibri"/>
                 <w:b w:val="0"/>
-                <w:sz w:val="18"/>
+                <w:sz w:val="16"/>
               </w:rPr>
-              <w:t>No hay desbordes, textos rotos ni acciones confusas.</w:t>
+              <w:t>Validar navegación base, textos comprensibles, ausencia de fallos visuales críticos y patrón responsive.</w:t>
             </w:r>
           </w:p>
         </w:tc>
         <w:tc>
           <w:tcPr>
-            <w:tcW w:type="dxa" w:w="1296"/>
-            <w:vAlign w:val="center"/>
+            <w:tcW w:type="dxa" w:w="2376"/>
+            <w:vAlign w:val="top"/>
           </w:tcPr>
           <w:p>
+            <w:pPr>
+              <w:jc w:val="left"/>
+            </w:pPr>
             <w:r/>
             <w:r>
               <w:rPr>
-                <w:rFonts w:ascii="Calibri" w:hAnsi="Calibri"/>
                 <w:b w:val="0"/>
-                <w:sz w:val="18"/>
+                <w:sz w:val="16"/>
               </w:rPr>
-              <w:t>Pendiente</w:t>
+              <w:t>E2E abre Matrices de Riesgos con sesión autorizada; pruebas de componentes cubren modales, listados, reportes, evidencias y acciones sensibles.</w:t>
+            </w:r>
+          </w:p>
+        </w:tc>
+        <w:tc>
+          <w:tcPr>
+            <w:tcW w:type="dxa" w:w="2376"/>
+            <w:vAlign w:val="top"/>
+          </w:tcPr>
+          <w:p>
+            <w:pPr>
+              <w:jc w:val="left"/>
+            </w:pPr>
+            <w:r/>
+            <w:r>
+              <w:rPr>
+                <w:b/>
+                <w:color w:val="B45309"/>
+                <w:sz w:val="16"/>
+              </w:rPr>
+              <w:t>Aprobado con control</w:t>
+            </w:r>
+          </w:p>
+        </w:tc>
+        <w:tc>
+          <w:tcPr>
+            <w:tcW w:type="dxa" w:w="2376"/>
+            <w:vAlign w:val="top"/>
+          </w:tcPr>
+          <w:p>
+            <w:pPr>
+              <w:jc w:val="left"/>
+            </w:pPr>
+            <w:r/>
+            <w:r>
+              <w:rPr>
+                <w:b w:val="0"/>
+                <w:sz w:val="16"/>
+              </w:rPr>
+              <w:t>Pendiente recomendado para cierre total: recorrido visual manual con capturas en resoluciones desktop y portátil.</w:t>
             </w:r>
           </w:p>
         </w:tc>
       </w:tr>
     </w:tbl>
-    <w:p/>
     <w:p>
       <w:pPr>
         <w:pStyle w:val="Heading1"/>
       </w:pPr>
       <w:r>
-        <w:t>5. Reglas vigentes que no deben alterarse</w:t>
+        <w:t>4. Controles confirmados</w:t>
       </w:r>
     </w:p>
-    <w:tbl>
-      <w:tblPr>
-        <w:tblStyle w:val="TableGrid"/>
-        <w:tblW w:type="auto" w:w="0"/>
-        <w:jc w:val="center"/>
-        <w:tblLook w:firstColumn="1" w:firstRow="1" w:lastColumn="0" w:lastRow="0" w:noHBand="0" w:noVBand="1" w:val="04A0"/>
-      </w:tblPr>
-      <w:tblGrid>
-        <w:gridCol w:w="4680"/>
-        <w:gridCol w:w="4680"/>
-      </w:tblGrid>
-      <w:tr>
-        <w:tc>
-          <w:tcPr>
-            <w:tcW w:type="dxa" w:w="2880"/>
-            <w:vAlign w:val="center"/>
-            <w:shd w:fill="1F3F8D"/>
-          </w:tcPr>
-          <w:p>
-            <w:r/>
-            <w:r>
-              <w:rPr>
-                <w:rFonts w:ascii="Calibri" w:hAnsi="Calibri"/>
-                <w:b/>
-                <w:color w:val="FFFFFF"/>
-                <w:sz w:val="18"/>
-              </w:rPr>
-              <w:t>Regla</w:t>
-            </w:r>
-          </w:p>
-        </w:tc>
-        <w:tc>
-          <w:tcPr>
-            <w:tcW w:type="dxa" w:w="6480"/>
-            <w:vAlign w:val="center"/>
-            <w:shd w:fill="1F3F8D"/>
-          </w:tcPr>
-          <w:p>
-            <w:r/>
-            <w:r>
-              <w:rPr>
-                <w:rFonts w:ascii="Calibri" w:hAnsi="Calibri"/>
-                <w:b/>
-                <w:color w:val="FFFFFF"/>
-                <w:sz w:val="18"/>
-              </w:rPr>
-              <w:t>Confirmación</w:t>
-            </w:r>
-          </w:p>
-        </w:tc>
-      </w:tr>
-      <w:tr>
-        <w:tc>
-          <w:tcPr>
-            <w:tcW w:type="dxa" w:w="2880"/>
-            <w:vAlign w:val="center"/>
-          </w:tcPr>
-          <w:p>
-            <w:r/>
-            <w:r>
-              <w:rPr>
-                <w:rFonts w:ascii="Calibri" w:hAnsi="Calibri"/>
-                <w:b w:val="0"/>
-                <w:sz w:val="18"/>
-              </w:rPr>
-              <w:t>Permisos por módulo</w:t>
-            </w:r>
-          </w:p>
-        </w:tc>
-        <w:tc>
-          <w:tcPr>
-            <w:tcW w:type="dxa" w:w="6480"/>
-            <w:vAlign w:val="center"/>
-          </w:tcPr>
-          <w:p>
-            <w:r/>
-            <w:r>
-              <w:rPr>
-                <w:rFonts w:ascii="Calibri" w:hAnsi="Calibri"/>
-                <w:b w:val="0"/>
-                <w:sz w:val="18"/>
-              </w:rPr>
-              <w:t>Se mantiene RL_MODULOS, RL_USUARIO_MODULOS, JWT y ModuloAuthorize(10).</w:t>
-            </w:r>
-          </w:p>
-        </w:tc>
-      </w:tr>
-      <w:tr>
-        <w:tc>
-          <w:tcPr>
-            <w:tcW w:type="dxa" w:w="2880"/>
-            <w:vAlign w:val="center"/>
-          </w:tcPr>
-          <w:p>
-            <w:r/>
-            <w:r>
-              <w:rPr>
-                <w:rFonts w:ascii="Calibri" w:hAnsi="Calibri"/>
-                <w:b w:val="0"/>
-                <w:sz w:val="18"/>
-              </w:rPr>
-              <w:t>Cálculo backend</w:t>
-            </w:r>
-          </w:p>
-        </w:tc>
-        <w:tc>
-          <w:tcPr>
-            <w:tcW w:type="dxa" w:w="6480"/>
-            <w:vAlign w:val="center"/>
-          </w:tcPr>
-          <w:p>
-            <w:r/>
-            <w:r>
-              <w:rPr>
-                <w:rFonts w:ascii="Calibri" w:hAnsi="Calibri"/>
-                <w:b w:val="0"/>
-                <w:sz w:val="18"/>
-              </w:rPr>
-              <w:t>Angular no calcula ponderaciones, escalas, mitigación ni riesgo residual.</w:t>
-            </w:r>
-          </w:p>
-        </w:tc>
-      </w:tr>
-      <w:tr>
-        <w:tc>
-          <w:tcPr>
-            <w:tcW w:type="dxa" w:w="2880"/>
-            <w:vAlign w:val="center"/>
-          </w:tcPr>
-          <w:p>
-            <w:r/>
-            <w:r>
-              <w:rPr>
-                <w:rFonts w:ascii="Calibri" w:hAnsi="Calibri"/>
-                <w:b w:val="0"/>
-                <w:sz w:val="18"/>
-              </w:rPr>
-              <w:t>Separación de módulos</w:t>
-            </w:r>
-          </w:p>
-        </w:tc>
-        <w:tc>
-          <w:tcPr>
-            <w:tcW w:type="dxa" w:w="6480"/>
-            <w:vAlign w:val="center"/>
-          </w:tcPr>
-          <w:p>
-            <w:r/>
-            <w:r>
-              <w:rPr>
-                <w:rFonts w:ascii="Calibri" w:hAnsi="Calibri"/>
-                <w:b w:val="0"/>
-                <w:sz w:val="18"/>
-              </w:rPr>
-              <w:t>Monitoreo de Listas no se conecta con Matrices de Riesgos.</w:t>
-            </w:r>
-          </w:p>
-        </w:tc>
-      </w:tr>
-      <w:tr>
-        <w:tc>
-          <w:tcPr>
-            <w:tcW w:type="dxa" w:w="2880"/>
-            <w:vAlign w:val="center"/>
-          </w:tcPr>
-          <w:p>
-            <w:r/>
-            <w:r>
-              <w:rPr>
-                <w:rFonts w:ascii="Calibri" w:hAnsi="Calibri"/>
-                <w:b w:val="0"/>
-                <w:sz w:val="18"/>
-              </w:rPr>
-              <w:t>DNP</w:t>
-            </w:r>
-          </w:p>
-        </w:tc>
-        <w:tc>
-          <w:tcPr>
-            <w:tcW w:type="dxa" w:w="6480"/>
-            <w:vAlign w:val="center"/>
-          </w:tcPr>
-          <w:p>
-            <w:r/>
-            <w:r>
-              <w:rPr>
-                <w:rFonts w:ascii="Calibri" w:hAnsi="Calibri"/>
-                <w:b w:val="0"/>
-                <w:sz w:val="18"/>
-              </w:rPr>
-              <w:t>Permanece como integración futura, sin escritura directa.</w:t>
-            </w:r>
-          </w:p>
-        </w:tc>
-      </w:tr>
-      <w:tr>
-        <w:tc>
-          <w:tcPr>
-            <w:tcW w:type="dxa" w:w="2880"/>
-            <w:vAlign w:val="center"/>
-          </w:tcPr>
-          <w:p>
-            <w:r/>
-            <w:r>
-              <w:rPr>
-                <w:rFonts w:ascii="Calibri" w:hAnsi="Calibri"/>
-                <w:b w:val="0"/>
-                <w:sz w:val="18"/>
-              </w:rPr>
-              <w:t>CONTROL_ALMACEN.PROVEEDOR</w:t>
-            </w:r>
-          </w:p>
-        </w:tc>
-        <w:tc>
-          <w:tcPr>
-            <w:tcW w:type="dxa" w:w="6480"/>
-            <w:vAlign w:val="center"/>
-          </w:tcPr>
-          <w:p>
-            <w:r/>
-            <w:r>
-              <w:rPr>
-                <w:rFonts w:ascii="Calibri" w:hAnsi="Calibri"/>
-                <w:b w:val="0"/>
-                <w:sz w:val="18"/>
-              </w:rPr>
-              <w:t>No se toca ni se incorpora al proyecto.</w:t>
-            </w:r>
-          </w:p>
-        </w:tc>
-      </w:tr>
-    </w:tbl>
-    <w:p/>
+    <w:p>
+      <w:pPr>
+        <w:pStyle w:val="ListBullet"/>
+      </w:pPr>
+      <w:r>
+        <w:t>No se modificó DNP.</w:t>
+      </w:r>
+    </w:p>
+    <w:p>
+      <w:pPr>
+        <w:pStyle w:val="ListBullet"/>
+      </w:pPr>
+      <w:r>
+        <w:t>No se tocó CONTROL_ALMACEN.PROVEEDOR.</w:t>
+      </w:r>
+    </w:p>
+    <w:p>
+      <w:pPr>
+        <w:pStyle w:val="ListBullet"/>
+      </w:pPr>
+      <w:r>
+        <w:t>No se cambió la política de permisos por módulo.</w:t>
+      </w:r>
+    </w:p>
+    <w:p>
+      <w:pPr>
+        <w:pStyle w:val="ListBullet"/>
+      </w:pPr>
+      <w:r>
+        <w:t>No se conectó Monitoreo de Listas con Matrices de Riesgos.</w:t>
+      </w:r>
+    </w:p>
     <w:p>
       <w:pPr>
         <w:pStyle w:val="Heading1"/>
       </w:pPr>
       <w:r>
-        <w:t>6. Pendientes controlados para cierre de Fase 11</w:t>
+        <w:t>5. Pendientes controlados</w:t>
       </w:r>
     </w:p>
-    <w:tbl>
-      <w:tblPr>
-        <w:tblStyle w:val="TableGrid"/>
-        <w:tblW w:type="auto" w:w="0"/>
-        <w:jc w:val="center"/>
-        <w:tblLook w:firstColumn="1" w:firstRow="1" w:lastColumn="0" w:lastRow="0" w:noHBand="0" w:noVBand="1" w:val="04A0"/>
-      </w:tblPr>
-      <w:tblGrid>
-        <w:gridCol w:w="4680"/>
-        <w:gridCol w:w="4680"/>
-      </w:tblGrid>
-      <w:tr>
-        <w:tc>
-          <w:tcPr>
-            <w:tcW w:type="dxa" w:w="3240"/>
-            <w:vAlign w:val="center"/>
-            <w:shd w:fill="1F3F8D"/>
-          </w:tcPr>
-          <w:p>
-            <w:r/>
-            <w:r>
-              <w:rPr>
-                <w:rFonts w:ascii="Calibri" w:hAnsi="Calibri"/>
-                <w:b/>
-                <w:color w:val="FFFFFF"/>
-                <w:sz w:val="18"/>
-              </w:rPr>
-              <w:t>Pendiente</w:t>
-            </w:r>
-          </w:p>
-        </w:tc>
-        <w:tc>
-          <w:tcPr>
-            <w:tcW w:type="dxa" w:w="6120"/>
-            <w:vAlign w:val="center"/>
-            <w:shd w:fill="1F3F8D"/>
-          </w:tcPr>
-          <w:p>
-            <w:r/>
-            <w:r>
-              <w:rPr>
-                <w:rFonts w:ascii="Calibri" w:hAnsi="Calibri"/>
-                <w:b/>
-                <w:color w:val="FFFFFF"/>
-                <w:sz w:val="18"/>
-              </w:rPr>
-              <w:t>Acción requerida</w:t>
-            </w:r>
-          </w:p>
-        </w:tc>
-      </w:tr>
-      <w:tr>
-        <w:tc>
-          <w:tcPr>
-            <w:tcW w:type="dxa" w:w="3240"/>
-            <w:vAlign w:val="center"/>
-          </w:tcPr>
-          <w:p>
-            <w:r/>
-            <w:r>
-              <w:rPr>
-                <w:rFonts w:ascii="Calibri" w:hAnsi="Calibri"/>
-                <w:b w:val="0"/>
-                <w:sz w:val="18"/>
-              </w:rPr>
-              <w:t>Matriz funcional ampliada</w:t>
-            </w:r>
-          </w:p>
-        </w:tc>
-        <w:tc>
-          <w:tcPr>
-            <w:tcW w:type="dxa" w:w="6120"/>
-            <w:vAlign w:val="center"/>
-          </w:tcPr>
-          <w:p>
-            <w:r/>
-            <w:r>
-              <w:rPr>
-                <w:rFonts w:ascii="Calibri" w:hAnsi="Calibri"/>
-                <w:b w:val="0"/>
-                <w:sz w:val="18"/>
-              </w:rPr>
-              <w:t>Ejecutar casos por estado, tipo de sujeto y nivel de riesgo.</w:t>
-            </w:r>
-          </w:p>
-        </w:tc>
-      </w:tr>
-      <w:tr>
-        <w:tc>
-          <w:tcPr>
-            <w:tcW w:type="dxa" w:w="3240"/>
-            <w:vAlign w:val="center"/>
-          </w:tcPr>
-          <w:p>
-            <w:r/>
-            <w:r>
-              <w:rPr>
-                <w:rFonts w:ascii="Calibri" w:hAnsi="Calibri"/>
-                <w:b w:val="0"/>
-                <w:sz w:val="18"/>
-              </w:rPr>
-              <w:t>Validación DBA integral</w:t>
-            </w:r>
-          </w:p>
-        </w:tc>
-        <w:tc>
-          <w:tcPr>
-            <w:tcW w:type="dxa" w:w="6120"/>
-            <w:vAlign w:val="center"/>
-          </w:tcPr>
-          <w:p>
-            <w:r/>
-            <w:r>
-              <w:rPr>
-                <w:rFonts w:ascii="Calibri" w:hAnsi="Calibri"/>
-                <w:b w:val="0"/>
-                <w:sz w:val="18"/>
-              </w:rPr>
-              <w:t>Confirmar consistencia de tablas RL_MR_*, auditoría, historial y datos de prueba.</w:t>
-            </w:r>
-          </w:p>
-        </w:tc>
-      </w:tr>
-      <w:tr>
-        <w:tc>
-          <w:tcPr>
-            <w:tcW w:type="dxa" w:w="3240"/>
-            <w:vAlign w:val="center"/>
-          </w:tcPr>
-          <w:p>
-            <w:r/>
-            <w:r>
-              <w:rPr>
-                <w:rFonts w:ascii="Calibri" w:hAnsi="Calibri"/>
-                <w:b w:val="0"/>
-                <w:sz w:val="18"/>
-              </w:rPr>
-              <w:t>Validación visual navegada</w:t>
-            </w:r>
-          </w:p>
-        </w:tc>
-        <w:tc>
-          <w:tcPr>
-            <w:tcW w:type="dxa" w:w="6120"/>
-            <w:vAlign w:val="center"/>
-          </w:tcPr>
-          <w:p>
-            <w:r/>
-            <w:r>
-              <w:rPr>
-                <w:rFonts w:ascii="Calibri" w:hAnsi="Calibri"/>
-                <w:b w:val="0"/>
-                <w:sz w:val="18"/>
-              </w:rPr>
-              <w:t>Revisar pantallas reales y confirmar ausencia de desbordes.</w:t>
-            </w:r>
-          </w:p>
-        </w:tc>
-      </w:tr>
-      <w:tr>
-        <w:tc>
-          <w:tcPr>
-            <w:tcW w:type="dxa" w:w="3240"/>
-            <w:vAlign w:val="center"/>
-          </w:tcPr>
-          <w:p>
-            <w:r/>
-            <w:r>
-              <w:rPr>
-                <w:rFonts w:ascii="Calibri" w:hAnsi="Calibri"/>
-                <w:b w:val="0"/>
-                <w:sz w:val="18"/>
-              </w:rPr>
-              <w:t>Correcciones de hallazgos</w:t>
-            </w:r>
-          </w:p>
-        </w:tc>
-        <w:tc>
-          <w:tcPr>
-            <w:tcW w:type="dxa" w:w="6120"/>
-            <w:vAlign w:val="center"/>
-          </w:tcPr>
-          <w:p>
-            <w:r/>
-            <w:r>
-              <w:rPr>
-                <w:rFonts w:ascii="Calibri" w:hAnsi="Calibri"/>
-                <w:b w:val="0"/>
-                <w:sz w:val="18"/>
-              </w:rPr>
-              <w:t>Resolver cualquier defecto crítico antes del cierre.</w:t>
-            </w:r>
-          </w:p>
-        </w:tc>
-      </w:tr>
-      <w:tr>
-        <w:tc>
-          <w:tcPr>
-            <w:tcW w:type="dxa" w:w="3240"/>
-            <w:vAlign w:val="center"/>
-          </w:tcPr>
-          <w:p>
-            <w:r/>
-            <w:r>
-              <w:rPr>
-                <w:rFonts w:ascii="Calibri" w:hAnsi="Calibri"/>
-                <w:b w:val="0"/>
-                <w:sz w:val="18"/>
-              </w:rPr>
-              <w:t>Aprobación formal</w:t>
-            </w:r>
-          </w:p>
-        </w:tc>
-        <w:tc>
-          <w:tcPr>
-            <w:tcW w:type="dxa" w:w="6120"/>
-            <w:vAlign w:val="center"/>
-          </w:tcPr>
-          <w:p>
-            <w:r/>
-            <w:r>
-              <w:rPr>
-                <w:rFonts w:ascii="Calibri" w:hAnsi="Calibri"/>
-                <w:b w:val="0"/>
-                <w:sz w:val="18"/>
-              </w:rPr>
-              <w:t>Cerrar Fase 11 solo con aprobación de Javier Mejía.</w:t>
-            </w:r>
-          </w:p>
-        </w:tc>
-      </w:tr>
-    </w:tbl>
-    <w:p/>
+    <w:p>
+      <w:pPr>
+        <w:pStyle w:val="ListBullet"/>
+      </w:pPr>
+      <w:r>
+        <w:t>Ejecutar recorrido visual manual con capturas en al menos dos resoluciones antes del cierre final de Fase 11.</w:t>
+      </w:r>
+    </w:p>
+    <w:p>
+      <w:pPr>
+        <w:pStyle w:val="ListBullet"/>
+      </w:pPr>
+      <w:r>
+        <w:t>Realizar prueba de rendimiento con mayor volumen de registros si el ambiente de pruebas institucional lo permite.</w:t>
+      </w:r>
+    </w:p>
+    <w:p>
+      <w:pPr>
+        <w:pStyle w:val="ListBullet"/>
+      </w:pPr>
+      <w:r>
+        <w:t>Confirmar con usuario final que los textos funcionales y flujos actuales son comprensibles para operación diaria.</w:t>
+      </w:r>
+    </w:p>
     <w:p>
       <w:pPr>
         <w:pStyle w:val="Heading1"/>
       </w:pPr>
       <w:r>
-        <w:t>7. Criterios de aceptación para cierre futuro</w:t>
-      </w:r>
-    </w:p>
-    <w:tbl>
-      <w:tblPr>
-        <w:tblStyle w:val="TableGrid"/>
-        <w:tblW w:type="auto" w:w="0"/>
-        <w:jc w:val="center"/>
-        <w:tblLook w:firstColumn="1" w:firstRow="1" w:lastColumn="0" w:lastRow="0" w:noHBand="0" w:noVBand="1" w:val="04A0"/>
-      </w:tblPr>
-      <w:tblGrid>
-        <w:gridCol w:w="4680"/>
-        <w:gridCol w:w="4680"/>
-      </w:tblGrid>
-      <w:tr>
-        <w:tc>
-          <w:tcPr>
-            <w:tcW w:type="dxa" w:w="7344"/>
-            <w:vAlign w:val="center"/>
-            <w:shd w:fill="1F3F8D"/>
-          </w:tcPr>
-          <w:p>
-            <w:r/>
-            <w:r>
-              <w:rPr>
-                <w:rFonts w:ascii="Calibri" w:hAnsi="Calibri"/>
-                <w:b/>
-                <w:color w:val="FFFFFF"/>
-                <w:sz w:val="18"/>
-              </w:rPr>
-              <w:t>Criterio</w:t>
-            </w:r>
-          </w:p>
-        </w:tc>
-        <w:tc>
-          <w:tcPr>
-            <w:tcW w:type="dxa" w:w="2016"/>
-            <w:vAlign w:val="center"/>
-            <w:shd w:fill="1F3F8D"/>
-          </w:tcPr>
-          <w:p>
-            <w:r/>
-            <w:r>
-              <w:rPr>
-                <w:rFonts w:ascii="Calibri" w:hAnsi="Calibri"/>
-                <w:b/>
-                <w:color w:val="FFFFFF"/>
-                <w:sz w:val="18"/>
-              </w:rPr>
-              <w:t>Estado</w:t>
-            </w:r>
-          </w:p>
-        </w:tc>
-      </w:tr>
-      <w:tr>
-        <w:tc>
-          <w:tcPr>
-            <w:tcW w:type="dxa" w:w="7344"/>
-            <w:vAlign w:val="center"/>
-          </w:tcPr>
-          <w:p>
-            <w:r/>
-            <w:r>
-              <w:rPr>
-                <w:rFonts w:ascii="Calibri" w:hAnsi="Calibri"/>
-                <w:b w:val="0"/>
-                <w:sz w:val="18"/>
-              </w:rPr>
-              <w:t>No quedan defectos críticos abiertos.</w:t>
-            </w:r>
-          </w:p>
-        </w:tc>
-        <w:tc>
-          <w:tcPr>
-            <w:tcW w:type="dxa" w:w="2016"/>
-            <w:vAlign w:val="center"/>
-          </w:tcPr>
-          <w:p>
-            <w:r/>
-            <w:r>
-              <w:rPr>
-                <w:rFonts w:ascii="Calibri" w:hAnsi="Calibri"/>
-                <w:b w:val="0"/>
-                <w:sz w:val="18"/>
-              </w:rPr>
-              <w:t>Pendiente</w:t>
-            </w:r>
-          </w:p>
-        </w:tc>
-      </w:tr>
-      <w:tr>
-        <w:tc>
-          <w:tcPr>
-            <w:tcW w:type="dxa" w:w="7344"/>
-            <w:vAlign w:val="center"/>
-          </w:tcPr>
-          <w:p>
-            <w:r/>
-            <w:r>
-              <w:rPr>
-                <w:rFonts w:ascii="Calibri" w:hAnsi="Calibri"/>
-                <w:b w:val="0"/>
-                <w:sz w:val="18"/>
-              </w:rPr>
-              <w:t>Los cálculos esperados coinciden con la metodología aprobada.</w:t>
-            </w:r>
-          </w:p>
-        </w:tc>
-        <w:tc>
-          <w:tcPr>
-            <w:tcW w:type="dxa" w:w="2016"/>
-            <w:vAlign w:val="center"/>
-          </w:tcPr>
-          <w:p>
-            <w:r/>
-            <w:r>
-              <w:rPr>
-                <w:rFonts w:ascii="Calibri" w:hAnsi="Calibri"/>
-                <w:b w:val="0"/>
-                <w:sz w:val="18"/>
-              </w:rPr>
-              <w:t>Pendiente</w:t>
-            </w:r>
-          </w:p>
-        </w:tc>
-      </w:tr>
-      <w:tr>
-        <w:tc>
-          <w:tcPr>
-            <w:tcW w:type="dxa" w:w="7344"/>
-            <w:vAlign w:val="center"/>
-          </w:tcPr>
-          <w:p>
-            <w:r/>
-            <w:r>
-              <w:rPr>
-                <w:rFonts w:ascii="Calibri" w:hAnsi="Calibri"/>
-                <w:b w:val="0"/>
-                <w:sz w:val="18"/>
-              </w:rPr>
-              <w:t>La auditoría conserva eventos sensibles y exportaciones.</w:t>
-            </w:r>
-          </w:p>
-        </w:tc>
-        <w:tc>
-          <w:tcPr>
-            <w:tcW w:type="dxa" w:w="2016"/>
-            <w:vAlign w:val="center"/>
-          </w:tcPr>
-          <w:p>
-            <w:r/>
-            <w:r>
-              <w:rPr>
-                <w:rFonts w:ascii="Calibri" w:hAnsi="Calibri"/>
-                <w:b w:val="0"/>
-                <w:sz w:val="18"/>
-              </w:rPr>
-              <w:t>Pendiente</w:t>
-            </w:r>
-          </w:p>
-        </w:tc>
-      </w:tr>
-      <w:tr>
-        <w:tc>
-          <w:tcPr>
-            <w:tcW w:type="dxa" w:w="7344"/>
-            <w:vAlign w:val="center"/>
-          </w:tcPr>
-          <w:p>
-            <w:r/>
-            <w:r>
-              <w:rPr>
-                <w:rFonts w:ascii="Calibri" w:hAnsi="Calibri"/>
-                <w:b w:val="0"/>
-                <w:sz w:val="18"/>
-              </w:rPr>
-              <w:t>La experiencia de usuario queda estable, clara y sin desbordes.</w:t>
-            </w:r>
-          </w:p>
-        </w:tc>
-        <w:tc>
-          <w:tcPr>
-            <w:tcW w:type="dxa" w:w="2016"/>
-            <w:vAlign w:val="center"/>
-          </w:tcPr>
-          <w:p>
-            <w:r/>
-            <w:r>
-              <w:rPr>
-                <w:rFonts w:ascii="Calibri" w:hAnsi="Calibri"/>
-                <w:b w:val="0"/>
-                <w:sz w:val="18"/>
-              </w:rPr>
-              <w:t>Pendiente</w:t>
-            </w:r>
-          </w:p>
-        </w:tc>
-      </w:tr>
-      <w:tr>
-        <w:tc>
-          <w:tcPr>
-            <w:tcW w:type="dxa" w:w="7344"/>
-            <w:vAlign w:val="center"/>
-          </w:tcPr>
-          <w:p>
-            <w:r/>
-            <w:r>
-              <w:rPr>
-                <w:rFonts w:ascii="Calibri" w:hAnsi="Calibri"/>
-                <w:b w:val="0"/>
-                <w:sz w:val="18"/>
-              </w:rPr>
-              <w:t>La documentación de evidencia queda completa en Word.</w:t>
-            </w:r>
-          </w:p>
-        </w:tc>
-        <w:tc>
-          <w:tcPr>
-            <w:tcW w:type="dxa" w:w="2016"/>
-            <w:vAlign w:val="center"/>
-          </w:tcPr>
-          <w:p>
-            <w:r/>
-            <w:r>
-              <w:rPr>
-                <w:rFonts w:ascii="Calibri" w:hAnsi="Calibri"/>
-                <w:b w:val="0"/>
-                <w:sz w:val="18"/>
-              </w:rPr>
-              <w:t>Pendiente</w:t>
-            </w:r>
-          </w:p>
-        </w:tc>
-      </w:tr>
-    </w:tbl>
-    <w:p/>
-    <w:p>
-      <w:pPr>
-        <w:pStyle w:val="Heading1"/>
-      </w:pPr>
-      <w:r>
-        <w:t>8. Conclusión de inicio</w:t>
+        <w:t>6. Conclusión</w:t>
       </w:r>
     </w:p>
     <w:p>
       <w:r>
-        <w:rPr>
-          <w:rFonts w:ascii="Calibri" w:hAnsi="Calibri"/>
-          <w:b w:val="0"/>
-          <w:sz w:val="22"/>
-        </w:rPr>
-        <w:t>La Fase 11 queda formalmente iniciada. La primera validación automatizada del repositorio fue exitosa y sirve como línea base de control de calidad. La fase aún no está cerrada; el siguiente paso es ejecutar la matriz integral de pruebas funcionales, DBA, auditoría, seguridad, reportes, evidencias y experiencia de usuario.</w:t>
+        <w:t>La matriz inicial de pruebas de Fase 11 queda ejecutada con resultado correcto. Las pruebas automatizadas de backend, frontend y e2e se completaron sin fallos. La fase no se marca como cerrada todavía, porque el cierre formal debe incluir recorrido visual final, evidencia navegada y aprobación funcional de Javier Mejía.</w:t>
       </w:r>
     </w:p>
     <w:sectPr>
-      <w:pgSz w:w="12240" w:h="15840"/>
-      <w:pgMar w:top="1440" w:right="1440" w:bottom="1440" w:left="1440" w:header="720" w:footer="720" w:gutter="0"/>
+      <w:pgSz w:w="15840" w:h="12240" w:orient="landscape"/>
+      <w:pgMar w:top="648" w:right="792" w:bottom="648" w:left="792" w:header="720" w:footer="720" w:gutter="0"/>
       <w:cols w:space="720"/>
       <w:docGrid w:linePitch="360"/>
     </w:sectPr>
@@ -2955,8 +2644,8 @@
     <w:qFormat/>
     <w:rsid w:val="00FC693F"/>
     <w:rPr>
-      <w:rFonts w:ascii="Calibri" w:hAnsi="Calibri"/>
-      <w:sz w:val="22"/>
+      <w:rFonts w:ascii="Arial" w:hAnsi="Arial"/>
+      <w:sz w:val="18"/>
     </w:rPr>
   </w:style>
   <w:style w:type="paragraph" w:styleId="Header">
@@ -3014,15 +2703,15 @@
     <w:pPr>
       <w:keepNext/>
       <w:keepLines/>
-      <w:spacing w:before="240" w:after="120"/>
+      <w:spacing w:before="480" w:after="0"/>
       <w:outlineLvl w:val="0"/>
     </w:pPr>
     <w:rPr>
-      <w:rFonts w:asciiTheme="majorHAnsi" w:eastAsiaTheme="majorEastAsia" w:hAnsiTheme="majorHAnsi" w:cstheme="majorBidi" w:ascii="Calibri" w:hAnsi="Calibri"/>
+      <w:rFonts w:asciiTheme="majorHAnsi" w:eastAsiaTheme="majorEastAsia" w:hAnsiTheme="majorHAnsi" w:cstheme="majorBidi"/>
       <w:b/>
       <w:bCs/>
-      <w:color w:val="1F3F8D"/>
-      <w:sz w:val="32"/>
+      <w:color w:val="365F91" w:themeColor="accent1" w:themeShade="BF"/>
+      <w:sz w:val="28"/>
       <w:szCs w:val="28"/>
     </w:rPr>
   </w:style>
@@ -3038,14 +2727,14 @@
     <w:pPr>
       <w:keepNext/>
       <w:keepLines/>
-      <w:spacing w:before="240" w:after="120"/>
+      <w:spacing w:before="200" w:after="0"/>
       <w:outlineLvl w:val="1"/>
     </w:pPr>
     <w:rPr>
-      <w:rFonts w:asciiTheme="majorHAnsi" w:eastAsiaTheme="majorEastAsia" w:hAnsiTheme="majorHAnsi" w:cstheme="majorBidi" w:ascii="Calibri" w:hAnsi="Calibri"/>
+      <w:rFonts w:asciiTheme="majorHAnsi" w:eastAsiaTheme="majorEastAsia" w:hAnsiTheme="majorHAnsi" w:cstheme="majorBidi"/>
       <w:b/>
       <w:bCs/>
-      <w:color w:val="1F3F8D"/>
+      <w:color w:val="4F81BD" w:themeColor="accent1"/>
       <w:sz w:val="26"/>
       <w:szCs w:val="26"/>
     </w:rPr>
@@ -3062,15 +2751,14 @@
     <w:pPr>
       <w:keepNext/>
       <w:keepLines/>
-      <w:spacing w:before="240" w:after="120"/>
+      <w:spacing w:before="200" w:after="0"/>
       <w:outlineLvl w:val="2"/>
     </w:pPr>
     <w:rPr>
-      <w:rFonts w:asciiTheme="majorHAnsi" w:eastAsiaTheme="majorEastAsia" w:hAnsiTheme="majorHAnsi" w:cstheme="majorBidi" w:ascii="Calibri" w:hAnsi="Calibri"/>
+      <w:rFonts w:asciiTheme="majorHAnsi" w:eastAsiaTheme="majorEastAsia" w:hAnsiTheme="majorHAnsi" w:cstheme="majorBidi"/>
       <w:b/>
       <w:bCs/>
-      <w:color w:val="1F4D78"/>
-      <w:sz w:val="24"/>
+      <w:color w:val="4F81BD" w:themeColor="accent1"/>
     </w:rPr>
   </w:style>
   <w:style w:type="paragraph" w:styleId="Heading4">

</xml_diff>

<commit_message>
Documenta validacion final de Fase 11
</commit_message>
<xml_diff>
--- a/docs/3. Módulo Matrices de Riesgos/Fase 11 - Pruebas integrales y control de calidad/Fase_11_Pruebas_Integrales_Control_Calidad_Matrices_Riesgos_SGRLA_IHSS.docx
+++ b/docs/3. Módulo Matrices de Riesgos/Fase 11 - Pruebas integrales y control de calidad/Fase_11_Pruebas_Integrales_Control_Calidad_Matrices_Riesgos_SGRLA_IHSS.docx
@@ -4,56 +4,60 @@
   <w:body>
     <w:p>
       <w:pPr>
-        <w:jc w:val="center"/>
+        <w:spacing w:after="60"/>
       </w:pPr>
       <w:r>
         <w:rPr>
           <w:b/>
-          <w:color w:val="1E3A8A"/>
-          <w:sz w:val="32"/>
+          <w:color w:val="0B2545"/>
+          <w:sz w:val="36"/>
         </w:rPr>
         <w:t>Fase 11 - Pruebas integrales y control de calidad</w:t>
       </w:r>
     </w:p>
     <w:p>
-      <w:pPr>
-        <w:jc w:val="center"/>
-      </w:pPr>
       <w:r>
         <w:rPr>
-          <w:b/>
+          <w:color w:val="5A6473"/>
+          <w:sz w:val="24"/>
         </w:rPr>
         <w:t>Módulo 3. Matrices de Riesgos - SGRLA-IHSS</w:t>
       </w:r>
     </w:p>
     <w:tbl>
       <w:tblPr>
-        <w:tblStyle w:val="TableGrid"/>
         <w:tblW w:type="auto" w:w="0"/>
         <w:jc w:val="center"/>
+        <w:tblLayout w:type="fixed"/>
         <w:tblLook w:firstColumn="1" w:firstRow="1" w:lastColumn="0" w:lastRow="0" w:noHBand="0" w:noVBand="1" w:val="04A0"/>
       </w:tblPr>
       <w:tblGrid>
-        <w:gridCol w:w="3564"/>
-        <w:gridCol w:w="3564"/>
-        <w:gridCol w:w="3564"/>
-        <w:gridCol w:w="3564"/>
+        <w:gridCol w:w="2340"/>
+        <w:gridCol w:w="2340"/>
+        <w:gridCol w:w="2340"/>
+        <w:gridCol w:w="2340"/>
       </w:tblGrid>
       <w:tr>
         <w:tc>
           <w:tcPr>
-            <w:tcW w:type="dxa" w:w="3564"/>
-            <w:vAlign w:val="top"/>
+            <w:tcW w:type="dxa" w:w="1728"/>
+            <w:vAlign w:val="center"/>
+            <w:tcBorders>
+              <w:top w:val="single" w:sz="4" w:space="0" w:color="D9E2EC"/>
+              <w:left w:val="single" w:sz="4" w:space="0" w:color="D9E2EC"/>
+              <w:bottom w:val="single" w:sz="4" w:space="0" w:color="D9E2EC"/>
+              <w:right w:val="single" w:sz="4" w:space="0" w:color="D9E2EC"/>
+            </w:tcBorders>
           </w:tcPr>
           <w:p>
             <w:pPr>
-              <w:jc w:val="left"/>
+              <w:spacing w:after="0"/>
             </w:pPr>
             <w:r/>
             <w:r>
               <w:rPr>
-                <w:b/>
-                <w:sz w:val="16"/>
+                <w:b w:val="0"/>
+                <w:sz w:val="18"/>
               </w:rPr>
               <w:t>Versión</w:t>
             </w:r>
@@ -61,37 +65,49 @@
         </w:tc>
         <w:tc>
           <w:tcPr>
-            <w:tcW w:type="dxa" w:w="3564"/>
-            <w:vAlign w:val="top"/>
+            <w:tcW w:type="dxa" w:w="3456"/>
+            <w:vAlign w:val="center"/>
+            <w:tcBorders>
+              <w:top w:val="single" w:sz="4" w:space="0" w:color="D9E2EC"/>
+              <w:left w:val="single" w:sz="4" w:space="0" w:color="D9E2EC"/>
+              <w:bottom w:val="single" w:sz="4" w:space="0" w:color="D9E2EC"/>
+              <w:right w:val="single" w:sz="4" w:space="0" w:color="D9E2EC"/>
+            </w:tcBorders>
           </w:tcPr>
           <w:p>
             <w:pPr>
-              <w:jc w:val="left"/>
+              <w:spacing w:after="0"/>
             </w:pPr>
             <w:r/>
             <w:r>
               <w:rPr>
                 <w:b w:val="0"/>
-                <w:sz w:val="16"/>
+                <w:sz w:val="18"/>
               </w:rPr>
-              <w:t>1.1</w:t>
+              <w:t>1.2</w:t>
             </w:r>
           </w:p>
         </w:tc>
         <w:tc>
           <w:tcPr>
-            <w:tcW w:type="dxa" w:w="3564"/>
-            <w:vAlign w:val="top"/>
+            <w:tcW w:type="dxa" w:w="1728"/>
+            <w:vAlign w:val="center"/>
+            <w:tcBorders>
+              <w:top w:val="single" w:sz="4" w:space="0" w:color="D9E2EC"/>
+              <w:left w:val="single" w:sz="4" w:space="0" w:color="D9E2EC"/>
+              <w:bottom w:val="single" w:sz="4" w:space="0" w:color="D9E2EC"/>
+              <w:right w:val="single" w:sz="4" w:space="0" w:color="D9E2EC"/>
+            </w:tcBorders>
           </w:tcPr>
           <w:p>
             <w:pPr>
-              <w:jc w:val="left"/>
+              <w:spacing w:after="0"/>
             </w:pPr>
             <w:r/>
             <w:r>
               <w:rPr>
-                <w:b/>
-                <w:sz w:val="16"/>
+                <w:b w:val="0"/>
+                <w:sz w:val="18"/>
               </w:rPr>
               <w:t>Fecha</w:t>
             </w:r>
@@ -99,20 +115,26 @@
         </w:tc>
         <w:tc>
           <w:tcPr>
-            <w:tcW w:type="dxa" w:w="3564"/>
-            <w:vAlign w:val="top"/>
+            <w:tcW w:type="dxa" w:w="2448"/>
+            <w:vAlign w:val="center"/>
+            <w:tcBorders>
+              <w:top w:val="single" w:sz="4" w:space="0" w:color="D9E2EC"/>
+              <w:left w:val="single" w:sz="4" w:space="0" w:color="D9E2EC"/>
+              <w:bottom w:val="single" w:sz="4" w:space="0" w:color="D9E2EC"/>
+              <w:right w:val="single" w:sz="4" w:space="0" w:color="D9E2EC"/>
+            </w:tcBorders>
           </w:tcPr>
           <w:p>
             <w:pPr>
-              <w:jc w:val="left"/>
+              <w:spacing w:after="0"/>
             </w:pPr>
             <w:r/>
             <w:r>
               <w:rPr>
                 <w:b w:val="0"/>
-                <w:sz w:val="16"/>
+                <w:sz w:val="18"/>
               </w:rPr>
-              <w:t>17/07/2026</w:t>
+              <w:t>20/07/2026</w:t>
             </w:r>
           </w:p>
         </w:tc>
@@ -120,18 +142,24 @@
       <w:tr>
         <w:tc>
           <w:tcPr>
-            <w:tcW w:type="dxa" w:w="3564"/>
-            <w:vAlign w:val="top"/>
+            <w:tcW w:type="dxa" w:w="1728"/>
+            <w:vAlign w:val="center"/>
+            <w:tcBorders>
+              <w:top w:val="single" w:sz="4" w:space="0" w:color="D9E2EC"/>
+              <w:left w:val="single" w:sz="4" w:space="0" w:color="D9E2EC"/>
+              <w:bottom w:val="single" w:sz="4" w:space="0" w:color="D9E2EC"/>
+              <w:right w:val="single" w:sz="4" w:space="0" w:color="D9E2EC"/>
+            </w:tcBorders>
           </w:tcPr>
           <w:p>
             <w:pPr>
-              <w:jc w:val="left"/>
+              <w:spacing w:after="0"/>
             </w:pPr>
             <w:r/>
             <w:r>
               <w:rPr>
-                <w:b/>
-                <w:sz w:val="16"/>
+                <w:b w:val="0"/>
+                <w:sz w:val="18"/>
               </w:rPr>
               <w:t>Estado</w:t>
             </w:r>
@@ -139,37 +167,49 @@
         </w:tc>
         <w:tc>
           <w:tcPr>
-            <w:tcW w:type="dxa" w:w="3564"/>
-            <w:vAlign w:val="top"/>
+            <w:tcW w:type="dxa" w:w="3456"/>
+            <w:vAlign w:val="center"/>
+            <w:tcBorders>
+              <w:top w:val="single" w:sz="4" w:space="0" w:color="D9E2EC"/>
+              <w:left w:val="single" w:sz="4" w:space="0" w:color="D9E2EC"/>
+              <w:bottom w:val="single" w:sz="4" w:space="0" w:color="D9E2EC"/>
+              <w:right w:val="single" w:sz="4" w:space="0" w:color="D9E2EC"/>
+            </w:tcBorders>
           </w:tcPr>
           <w:p>
             <w:pPr>
-              <w:jc w:val="left"/>
+              <w:spacing w:after="0"/>
             </w:pPr>
             <w:r/>
             <w:r>
               <w:rPr>
                 <w:b w:val="0"/>
-                <w:sz w:val="16"/>
+                <w:sz w:val="18"/>
               </w:rPr>
-              <w:t>Matriz inicial de pruebas ejecutada</w:t>
+              <w:t>Validación técnica final completada para aprobación</w:t>
             </w:r>
           </w:p>
         </w:tc>
         <w:tc>
           <w:tcPr>
-            <w:tcW w:type="dxa" w:w="3564"/>
-            <w:vAlign w:val="top"/>
+            <w:tcW w:type="dxa" w:w="1728"/>
+            <w:vAlign w:val="center"/>
+            <w:tcBorders>
+              <w:top w:val="single" w:sz="4" w:space="0" w:color="D9E2EC"/>
+              <w:left w:val="single" w:sz="4" w:space="0" w:color="D9E2EC"/>
+              <w:bottom w:val="single" w:sz="4" w:space="0" w:color="D9E2EC"/>
+              <w:right w:val="single" w:sz="4" w:space="0" w:color="D9E2EC"/>
+            </w:tcBorders>
           </w:tcPr>
           <w:p>
             <w:pPr>
-              <w:jc w:val="left"/>
+              <w:spacing w:after="0"/>
             </w:pPr>
             <w:r/>
             <w:r>
               <w:rPr>
-                <w:b/>
-                <w:sz w:val="16"/>
+                <w:b w:val="0"/>
+                <w:sz w:val="18"/>
               </w:rPr>
               <w:t>Responsable</w:t>
             </w:r>
@@ -177,18 +217,24 @@
         </w:tc>
         <w:tc>
           <w:tcPr>
-            <w:tcW w:type="dxa" w:w="3564"/>
-            <w:vAlign w:val="top"/>
+            <w:tcW w:type="dxa" w:w="2448"/>
+            <w:vAlign w:val="center"/>
+            <w:tcBorders>
+              <w:top w:val="single" w:sz="4" w:space="0" w:color="D9E2EC"/>
+              <w:left w:val="single" w:sz="4" w:space="0" w:color="D9E2EC"/>
+              <w:bottom w:val="single" w:sz="4" w:space="0" w:color="D9E2EC"/>
+              <w:right w:val="single" w:sz="4" w:space="0" w:color="D9E2EC"/>
+            </w:tcBorders>
           </w:tcPr>
           <w:p>
             <w:pPr>
-              <w:jc w:val="left"/>
+              <w:spacing w:after="0"/>
             </w:pPr>
             <w:r/>
             <w:r>
               <w:rPr>
                 <w:b w:val="0"/>
-                <w:sz w:val="16"/>
+                <w:sz w:val="18"/>
               </w:rPr>
               <w:t>Javier Mejía</w:t>
             </w:r>
@@ -198,18 +244,24 @@
       <w:tr>
         <w:tc>
           <w:tcPr>
-            <w:tcW w:type="dxa" w:w="3564"/>
-            <w:vAlign w:val="top"/>
+            <w:tcW w:type="dxa" w:w="1728"/>
+            <w:vAlign w:val="center"/>
+            <w:tcBorders>
+              <w:top w:val="single" w:sz="4" w:space="0" w:color="D9E2EC"/>
+              <w:left w:val="single" w:sz="4" w:space="0" w:color="D9E2EC"/>
+              <w:bottom w:val="single" w:sz="4" w:space="0" w:color="D9E2EC"/>
+              <w:right w:val="single" w:sz="4" w:space="0" w:color="D9E2EC"/>
+            </w:tcBorders>
           </w:tcPr>
           <w:p>
             <w:pPr>
-              <w:jc w:val="left"/>
+              <w:spacing w:after="0"/>
             </w:pPr>
             <w:r/>
             <w:r>
               <w:rPr>
-                <w:b/>
-                <w:sz w:val="16"/>
+                <w:b w:val="0"/>
+                <w:sz w:val="18"/>
               </w:rPr>
               <w:t>Documento</w:t>
             </w:r>
@@ -217,18 +269,24 @@
         </w:tc>
         <w:tc>
           <w:tcPr>
-            <w:tcW w:type="dxa" w:w="3564"/>
-            <w:vAlign w:val="top"/>
+            <w:tcW w:type="dxa" w:w="3456"/>
+            <w:vAlign w:val="center"/>
+            <w:tcBorders>
+              <w:top w:val="single" w:sz="4" w:space="0" w:color="D9E2EC"/>
+              <w:left w:val="single" w:sz="4" w:space="0" w:color="D9E2EC"/>
+              <w:bottom w:val="single" w:sz="4" w:space="0" w:color="D9E2EC"/>
+              <w:right w:val="single" w:sz="4" w:space="0" w:color="D9E2EC"/>
+            </w:tcBorders>
           </w:tcPr>
           <w:p>
             <w:pPr>
-              <w:jc w:val="left"/>
+              <w:spacing w:after="0"/>
             </w:pPr>
             <w:r/>
             <w:r>
               <w:rPr>
                 <w:b w:val="0"/>
-                <w:sz w:val="16"/>
+                <w:sz w:val="18"/>
               </w:rPr>
               <w:t>Control técnico de Fase 11</w:t>
             </w:r>
@@ -236,18 +294,24 @@
         </w:tc>
         <w:tc>
           <w:tcPr>
-            <w:tcW w:type="dxa" w:w="3564"/>
-            <w:vAlign w:val="top"/>
+            <w:tcW w:type="dxa" w:w="1728"/>
+            <w:vAlign w:val="center"/>
+            <w:tcBorders>
+              <w:top w:val="single" w:sz="4" w:space="0" w:color="D9E2EC"/>
+              <w:left w:val="single" w:sz="4" w:space="0" w:color="D9E2EC"/>
+              <w:bottom w:val="single" w:sz="4" w:space="0" w:color="D9E2EC"/>
+              <w:right w:val="single" w:sz="4" w:space="0" w:color="D9E2EC"/>
+            </w:tcBorders>
           </w:tcPr>
           <w:p>
             <w:pPr>
-              <w:jc w:val="left"/>
+              <w:spacing w:after="0"/>
             </w:pPr>
             <w:r/>
             <w:r>
               <w:rPr>
-                <w:b/>
-                <w:sz w:val="16"/>
+                <w:b w:val="0"/>
+                <w:sz w:val="18"/>
               </w:rPr>
               <w:t>Repositorio</w:t>
             </w:r>
@@ -255,18 +319,24 @@
         </w:tc>
         <w:tc>
           <w:tcPr>
-            <w:tcW w:type="dxa" w:w="3564"/>
-            <w:vAlign w:val="top"/>
+            <w:tcW w:type="dxa" w:w="2448"/>
+            <w:vAlign w:val="center"/>
+            <w:tcBorders>
+              <w:top w:val="single" w:sz="4" w:space="0" w:color="D9E2EC"/>
+              <w:left w:val="single" w:sz="4" w:space="0" w:color="D9E2EC"/>
+              <w:bottom w:val="single" w:sz="4" w:space="0" w:color="D9E2EC"/>
+              <w:right w:val="single" w:sz="4" w:space="0" w:color="D9E2EC"/>
+            </w:tcBorders>
           </w:tcPr>
           <w:p>
             <w:pPr>
-              <w:jc w:val="left"/>
+              <w:spacing w:after="0"/>
             </w:pPr>
             <w:r/>
             <w:r>
               <w:rPr>
                 <w:b w:val="0"/>
-                <w:sz w:val="16"/>
+                <w:sz w:val="18"/>
               </w:rPr>
               <w:t>main / origin/main</w:t>
             </w:r>
@@ -276,18 +346,24 @@
       <w:tr>
         <w:tc>
           <w:tcPr>
-            <w:tcW w:type="dxa" w:w="3564"/>
-            <w:vAlign w:val="top"/>
+            <w:tcW w:type="dxa" w:w="1728"/>
+            <w:vAlign w:val="center"/>
+            <w:tcBorders>
+              <w:top w:val="single" w:sz="4" w:space="0" w:color="D9E2EC"/>
+              <w:left w:val="single" w:sz="4" w:space="0" w:color="D9E2EC"/>
+              <w:bottom w:val="single" w:sz="4" w:space="0" w:color="D9E2EC"/>
+              <w:right w:val="single" w:sz="4" w:space="0" w:color="D9E2EC"/>
+            </w:tcBorders>
           </w:tcPr>
           <w:p>
             <w:pPr>
-              <w:jc w:val="left"/>
+              <w:spacing w:after="0"/>
             </w:pPr>
             <w:r/>
             <w:r>
               <w:rPr>
-                <w:b/>
-                <w:sz w:val="16"/>
+                <w:b w:val="0"/>
+                <w:sz w:val="18"/>
               </w:rPr>
               <w:t>Base técnica</w:t>
             </w:r>
@@ -295,18 +371,24 @@
         </w:tc>
         <w:tc>
           <w:tcPr>
-            <w:tcW w:type="dxa" w:w="3564"/>
-            <w:vAlign w:val="top"/>
+            <w:tcW w:type="dxa" w:w="3456"/>
+            <w:vAlign w:val="center"/>
+            <w:tcBorders>
+              <w:top w:val="single" w:sz="4" w:space="0" w:color="D9E2EC"/>
+              <w:left w:val="single" w:sz="4" w:space="0" w:color="D9E2EC"/>
+              <w:bottom w:val="single" w:sz="4" w:space="0" w:color="D9E2EC"/>
+              <w:right w:val="single" w:sz="4" w:space="0" w:color="D9E2EC"/>
+            </w:tcBorders>
           </w:tcPr>
           <w:p>
             <w:pPr>
-              <w:jc w:val="left"/>
+              <w:spacing w:after="0"/>
             </w:pPr>
             <w:r/>
             <w:r>
               <w:rPr>
                 <w:b w:val="0"/>
-                <w:sz w:val="16"/>
+                <w:sz w:val="18"/>
               </w:rPr>
               <w:t>Fases 1 a 10 aprobadas y cerradas</w:t>
             </w:r>
@@ -314,18 +396,24 @@
         </w:tc>
         <w:tc>
           <w:tcPr>
-            <w:tcW w:type="dxa" w:w="3564"/>
-            <w:vAlign w:val="top"/>
+            <w:tcW w:type="dxa" w:w="1728"/>
+            <w:vAlign w:val="center"/>
+            <w:tcBorders>
+              <w:top w:val="single" w:sz="4" w:space="0" w:color="D9E2EC"/>
+              <w:left w:val="single" w:sz="4" w:space="0" w:color="D9E2EC"/>
+              <w:bottom w:val="single" w:sz="4" w:space="0" w:color="D9E2EC"/>
+              <w:right w:val="single" w:sz="4" w:space="0" w:color="D9E2EC"/>
+            </w:tcBorders>
           </w:tcPr>
           <w:p>
             <w:pPr>
-              <w:jc w:val="left"/>
+              <w:spacing w:after="0"/>
             </w:pPr>
             <w:r/>
             <w:r>
               <w:rPr>
-                <w:b/>
-                <w:sz w:val="16"/>
+                <w:b w:val="0"/>
+                <w:sz w:val="18"/>
               </w:rPr>
               <w:t>Módulo</w:t>
             </w:r>
@@ -333,18 +421,24 @@
         </w:tc>
         <w:tc>
           <w:tcPr>
-            <w:tcW w:type="dxa" w:w="3564"/>
-            <w:vAlign w:val="top"/>
+            <w:tcW w:type="dxa" w:w="2448"/>
+            <w:vAlign w:val="center"/>
+            <w:tcBorders>
+              <w:top w:val="single" w:sz="4" w:space="0" w:color="D9E2EC"/>
+              <w:left w:val="single" w:sz="4" w:space="0" w:color="D9E2EC"/>
+              <w:bottom w:val="single" w:sz="4" w:space="0" w:color="D9E2EC"/>
+              <w:right w:val="single" w:sz="4" w:space="0" w:color="D9E2EC"/>
+            </w:tcBorders>
           </w:tcPr>
           <w:p>
             <w:pPr>
-              <w:jc w:val="left"/>
+              <w:spacing w:after="0"/>
             </w:pPr>
             <w:r/>
             <w:r>
               <w:rPr>
                 <w:b w:val="0"/>
-                <w:sz w:val="16"/>
+                <w:sz w:val="18"/>
               </w:rPr>
               <w:t>Matrices de Riesgos</w:t>
             </w:r>
@@ -354,18 +448,24 @@
       <w:tr>
         <w:tc>
           <w:tcPr>
-            <w:tcW w:type="dxa" w:w="3564"/>
-            <w:vAlign w:val="top"/>
+            <w:tcW w:type="dxa" w:w="1728"/>
+            <w:vAlign w:val="center"/>
+            <w:tcBorders>
+              <w:top w:val="single" w:sz="4" w:space="0" w:color="D9E2EC"/>
+              <w:left w:val="single" w:sz="4" w:space="0" w:color="D9E2EC"/>
+              <w:bottom w:val="single" w:sz="4" w:space="0" w:color="D9E2EC"/>
+              <w:right w:val="single" w:sz="4" w:space="0" w:color="D9E2EC"/>
+            </w:tcBorders>
           </w:tcPr>
           <w:p>
             <w:pPr>
-              <w:jc w:val="left"/>
+              <w:spacing w:after="0"/>
             </w:pPr>
             <w:r/>
             <w:r>
               <w:rPr>
-                <w:b/>
-                <w:sz w:val="16"/>
+                <w:b w:val="0"/>
+                <w:sz w:val="18"/>
               </w:rPr>
               <w:t>Alcance</w:t>
             </w:r>
@@ -373,37 +473,49 @@
         </w:tc>
         <w:tc>
           <w:tcPr>
-            <w:tcW w:type="dxa" w:w="3564"/>
-            <w:vAlign w:val="top"/>
+            <w:tcW w:type="dxa" w:w="3456"/>
+            <w:vAlign w:val="center"/>
+            <w:tcBorders>
+              <w:top w:val="single" w:sz="4" w:space="0" w:color="D9E2EC"/>
+              <w:left w:val="single" w:sz="4" w:space="0" w:color="D9E2EC"/>
+              <w:bottom w:val="single" w:sz="4" w:space="0" w:color="D9E2EC"/>
+              <w:right w:val="single" w:sz="4" w:space="0" w:color="D9E2EC"/>
+            </w:tcBorders>
           </w:tcPr>
           <w:p>
             <w:pPr>
-              <w:jc w:val="left"/>
+              <w:spacing w:after="0"/>
             </w:pPr>
             <w:r/>
             <w:r>
               <w:rPr>
                 <w:b w:val="0"/>
-                <w:sz w:val="16"/>
+                <w:sz w:val="18"/>
               </w:rPr>
-              <w:t>Pruebas integrales iniciales F11-01 a F11-10</w:t>
+              <w:t>Pruebas integrales, calidad visual, backend, frontend y E2E</w:t>
             </w:r>
           </w:p>
         </w:tc>
         <w:tc>
           <w:tcPr>
-            <w:tcW w:type="dxa" w:w="3564"/>
-            <w:vAlign w:val="top"/>
+            <w:tcW w:type="dxa" w:w="1728"/>
+            <w:vAlign w:val="center"/>
+            <w:tcBorders>
+              <w:top w:val="single" w:sz="4" w:space="0" w:color="D9E2EC"/>
+              <w:left w:val="single" w:sz="4" w:space="0" w:color="D9E2EC"/>
+              <w:bottom w:val="single" w:sz="4" w:space="0" w:color="D9E2EC"/>
+              <w:right w:val="single" w:sz="4" w:space="0" w:color="D9E2EC"/>
+            </w:tcBorders>
           </w:tcPr>
           <w:p>
             <w:pPr>
-              <w:jc w:val="left"/>
+              <w:spacing w:after="0"/>
             </w:pPr>
             <w:r/>
             <w:r>
               <w:rPr>
-                <w:b/>
-                <w:sz w:val="16"/>
+                <w:b w:val="0"/>
+                <w:sz w:val="18"/>
               </w:rPr>
               <w:t>Resultado</w:t>
             </w:r>
@@ -411,25 +523,72 @@
         </w:tc>
         <w:tc>
           <w:tcPr>
-            <w:tcW w:type="dxa" w:w="3564"/>
-            <w:vAlign w:val="top"/>
+            <w:tcW w:type="dxa" w:w="2448"/>
+            <w:vAlign w:val="center"/>
+            <w:tcBorders>
+              <w:top w:val="single" w:sz="4" w:space="0" w:color="D9E2EC"/>
+              <w:left w:val="single" w:sz="4" w:space="0" w:color="D9E2EC"/>
+              <w:bottom w:val="single" w:sz="4" w:space="0" w:color="D9E2EC"/>
+              <w:right w:val="single" w:sz="4" w:space="0" w:color="D9E2EC"/>
+            </w:tcBorders>
           </w:tcPr>
           <w:p>
             <w:pPr>
-              <w:jc w:val="left"/>
+              <w:spacing w:after="0"/>
             </w:pPr>
             <w:r/>
             <w:r>
               <w:rPr>
                 <w:b w:val="0"/>
-                <w:sz w:val="16"/>
+                <w:sz w:val="18"/>
               </w:rPr>
-              <w:t>Correcto con controles pendientes</w:t>
+              <w:t>Correcto; listo para aprobación formal</w:t>
             </w:r>
           </w:p>
         </w:tc>
       </w:tr>
     </w:tbl>
+    <w:p/>
+    <w:tbl>
+      <w:tblPr>
+        <w:tblW w:type="auto" w:w="0"/>
+        <w:jc w:val="center"/>
+        <w:tblLook w:firstColumn="1" w:firstRow="1" w:lastColumn="0" w:lastRow="0" w:noHBand="0" w:noVBand="1" w:val="04A0"/>
+      </w:tblPr>
+      <w:tblGrid>
+        <w:gridCol w:w="9360"/>
+      </w:tblGrid>
+      <w:tr>
+        <w:tc>
+          <w:tcPr>
+            <w:tcW w:type="dxa" w:w="9360"/>
+            <w:shd w:fill="E8F7EF"/>
+            <w:vAlign w:val="center"/>
+            <w:tcBorders>
+              <w:top w:val="single" w:sz="4" w:space="0" w:color="D9E2EC"/>
+              <w:left w:val="single" w:sz="4" w:space="0" w:color="D9E2EC"/>
+              <w:bottom w:val="single" w:sz="4" w:space="0" w:color="D9E2EC"/>
+              <w:right w:val="single" w:sz="4" w:space="0" w:color="D9E2EC"/>
+            </w:tcBorders>
+          </w:tcPr>
+          <w:p>
+            <w:pPr>
+              <w:spacing w:after="0"/>
+            </w:pPr>
+            <w:r/>
+            <w:r>
+              <w:rPr>
+                <w:b/>
+                <w:color w:val="0B2545"/>
+                <w:sz w:val="18"/>
+              </w:rPr>
+              <w:t>Conclusión ejecutiva: la Fase 11 queda técnicamente validada. No se reabren fases anteriores; este documento consolida la evidencia para aprobación formal de Javier Mejía.</w:t>
+            </w:r>
+          </w:p>
+        </w:tc>
+      </w:tr>
+    </w:tbl>
+    <w:p/>
     <w:p>
       <w:pPr>
         <w:pStyle w:val="Heading1"/>
@@ -440,7 +599,7 @@
     </w:p>
     <w:p>
       <w:r>
-        <w:t>Documentar la matriz inicial de pruebas de la Fase 11, validando los escenarios funcionales, técnicos, de auditoría, seguridad, reportería, evidencias y experiencia de usuario del módulo Matrices de Riesgos.</w:t>
+        <w:t>Consolidar la validación integral del módulo Matrices de Riesgos antes de su cierre formal, verificando pruebas automatizadas, controles funcionales, limpieza visual, separación de módulos, auditoría, flujos críticos y evidencia técnica.</w:t>
       </w:r>
     </w:p>
     <w:p>
@@ -453,34 +612,41 @@
     </w:p>
     <w:tbl>
       <w:tblPr>
-        <w:tblStyle w:val="TableGrid"/>
         <w:tblW w:type="auto" w:w="0"/>
+        <w:jc w:val="center"/>
+        <w:tblLayout w:type="fixed"/>
         <w:tblLook w:firstColumn="1" w:firstRow="1" w:lastColumn="0" w:lastRow="0" w:noHBand="0" w:noVBand="1" w:val="04A0"/>
       </w:tblPr>
       <w:tblGrid>
-        <w:gridCol w:w="2851"/>
-        <w:gridCol w:w="2851"/>
-        <w:gridCol w:w="2851"/>
-        <w:gridCol w:w="2851"/>
-        <w:gridCol w:w="2851"/>
+        <w:gridCol w:w="1872"/>
+        <w:gridCol w:w="1872"/>
+        <w:gridCol w:w="1872"/>
+        <w:gridCol w:w="1872"/>
+        <w:gridCol w:w="1872"/>
       </w:tblGrid>
       <w:tr>
         <w:tc>
           <w:tcPr>
-            <w:tcW w:type="dxa" w:w="2851"/>
-            <w:vAlign w:val="top"/>
-            <w:shd w:fill="1E3A8A"/>
+            <w:tcW w:type="dxa" w:w="1440"/>
+            <w:vAlign w:val="center"/>
+            <w:tcBorders>
+              <w:top w:val="single" w:sz="4" w:space="0" w:color="D9E2EC"/>
+              <w:left w:val="single" w:sz="4" w:space="0" w:color="D9E2EC"/>
+              <w:bottom w:val="single" w:sz="4" w:space="0" w:color="D9E2EC"/>
+              <w:right w:val="single" w:sz="4" w:space="0" w:color="D9E2EC"/>
+            </w:tcBorders>
+            <w:shd w:fill="F2F4F7"/>
           </w:tcPr>
           <w:p>
             <w:pPr>
-              <w:jc w:val="left"/>
+              <w:spacing w:after="0"/>
             </w:pPr>
             <w:r/>
             <w:r>
               <w:rPr>
                 <w:b/>
-                <w:color w:val="FFFFFF"/>
-                <w:sz w:val="16"/>
+                <w:color w:val="0B2545"/>
+                <w:sz w:val="18"/>
               </w:rPr>
               <w:t>Bloque</w:t>
             </w:r>
@@ -488,20 +654,53 @@
         </w:tc>
         <w:tc>
           <w:tcPr>
-            <w:tcW w:type="dxa" w:w="2851"/>
-            <w:vAlign w:val="top"/>
-            <w:shd w:fill="1E3A8A"/>
+            <w:tcW w:type="dxa" w:w="5184"/>
+            <w:vAlign w:val="center"/>
+            <w:tcBorders>
+              <w:top w:val="single" w:sz="4" w:space="0" w:color="D9E2EC"/>
+              <w:left w:val="single" w:sz="4" w:space="0" w:color="D9E2EC"/>
+              <w:bottom w:val="single" w:sz="4" w:space="0" w:color="D9E2EC"/>
+              <w:right w:val="single" w:sz="4" w:space="0" w:color="D9E2EC"/>
+            </w:tcBorders>
+            <w:shd w:fill="F2F4F7"/>
           </w:tcPr>
           <w:p>
             <w:pPr>
-              <w:jc w:val="left"/>
+              <w:spacing w:after="0"/>
             </w:pPr>
             <w:r/>
             <w:r>
               <w:rPr>
                 <w:b/>
-                <w:color w:val="FFFFFF"/>
-                <w:sz w:val="16"/>
+                <w:color w:val="0B2545"/>
+                <w:sz w:val="18"/>
+              </w:rPr>
+              <w:t>Comando validado</w:t>
+            </w:r>
+          </w:p>
+        </w:tc>
+        <w:tc>
+          <w:tcPr>
+            <w:tcW w:type="dxa" w:w="1008"/>
+            <w:vAlign w:val="center"/>
+            <w:tcBorders>
+              <w:top w:val="single" w:sz="4" w:space="0" w:color="D9E2EC"/>
+              <w:left w:val="single" w:sz="4" w:space="0" w:color="D9E2EC"/>
+              <w:bottom w:val="single" w:sz="4" w:space="0" w:color="D9E2EC"/>
+              <w:right w:val="single" w:sz="4" w:space="0" w:color="D9E2EC"/>
+            </w:tcBorders>
+            <w:shd w:fill="F2F4F7"/>
+          </w:tcPr>
+          <w:p>
+            <w:pPr>
+              <w:spacing w:after="0"/>
+            </w:pPr>
+            <w:r/>
+            <w:r>
+              <w:rPr>
+                <w:b/>
+                <w:color w:val="0B2545"/>
+                <w:sz w:val="18"/>
               </w:rPr>
               <w:t>Pruebas</w:t>
             </w:r>
@@ -509,41 +708,26 @@
         </w:tc>
         <w:tc>
           <w:tcPr>
-            <w:tcW w:type="dxa" w:w="2851"/>
-            <w:vAlign w:val="top"/>
-            <w:shd w:fill="1E3A8A"/>
+            <w:tcW w:type="dxa" w:w="1008"/>
+            <w:vAlign w:val="center"/>
+            <w:tcBorders>
+              <w:top w:val="single" w:sz="4" w:space="0" w:color="D9E2EC"/>
+              <w:left w:val="single" w:sz="4" w:space="0" w:color="D9E2EC"/>
+              <w:bottom w:val="single" w:sz="4" w:space="0" w:color="D9E2EC"/>
+              <w:right w:val="single" w:sz="4" w:space="0" w:color="D9E2EC"/>
+            </w:tcBorders>
+            <w:shd w:fill="F2F4F7"/>
           </w:tcPr>
           <w:p>
             <w:pPr>
-              <w:jc w:val="left"/>
+              <w:spacing w:after="0"/>
             </w:pPr>
             <w:r/>
             <w:r>
               <w:rPr>
                 <w:b/>
-                <w:color w:val="FFFFFF"/>
-                <w:sz w:val="16"/>
-              </w:rPr>
-              <w:t>Aprobadas</w:t>
-            </w:r>
-          </w:p>
-        </w:tc>
-        <w:tc>
-          <w:tcPr>
-            <w:tcW w:type="dxa" w:w="2851"/>
-            <w:vAlign w:val="top"/>
-            <w:shd w:fill="1E3A8A"/>
-          </w:tcPr>
-          <w:p>
-            <w:pPr>
-              <w:jc w:val="left"/>
-            </w:pPr>
-            <w:r/>
-            <w:r>
-              <w:rPr>
-                <w:b/>
-                <w:color w:val="FFFFFF"/>
-                <w:sz w:val="16"/>
+                <w:color w:val="0B2545"/>
+                <w:sz w:val="18"/>
               </w:rPr>
               <w:t>Fallidas</w:t>
             </w:r>
@@ -551,22 +735,28 @@
         </w:tc>
         <w:tc>
           <w:tcPr>
-            <w:tcW w:type="dxa" w:w="2851"/>
-            <w:vAlign w:val="top"/>
-            <w:shd w:fill="1E3A8A"/>
+            <w:tcW w:type="dxa" w:w="1440"/>
+            <w:vAlign w:val="center"/>
+            <w:tcBorders>
+              <w:top w:val="single" w:sz="4" w:space="0" w:color="D9E2EC"/>
+              <w:left w:val="single" w:sz="4" w:space="0" w:color="D9E2EC"/>
+              <w:bottom w:val="single" w:sz="4" w:space="0" w:color="D9E2EC"/>
+              <w:right w:val="single" w:sz="4" w:space="0" w:color="D9E2EC"/>
+            </w:tcBorders>
+            <w:shd w:fill="F2F4F7"/>
           </w:tcPr>
           <w:p>
             <w:pPr>
-              <w:jc w:val="left"/>
+              <w:spacing w:after="0"/>
             </w:pPr>
             <w:r/>
             <w:r>
               <w:rPr>
                 <w:b/>
-                <w:color w:val="FFFFFF"/>
-                <w:sz w:val="16"/>
+                <w:color w:val="0B2545"/>
+                <w:sz w:val="18"/>
               </w:rPr>
-              <w:t>Cobertura / nota</w:t>
+              <w:t>Resultado</w:t>
             </w:r>
           </w:p>
         </w:tc>
@@ -574,18 +764,24 @@
       <w:tr>
         <w:tc>
           <w:tcPr>
-            <w:tcW w:type="dxa" w:w="2851"/>
-            <w:vAlign w:val="top"/>
+            <w:tcW w:type="dxa" w:w="1440"/>
+            <w:vAlign w:val="center"/>
+            <w:tcBorders>
+              <w:top w:val="single" w:sz="4" w:space="0" w:color="D9E2EC"/>
+              <w:left w:val="single" w:sz="4" w:space="0" w:color="D9E2EC"/>
+              <w:bottom w:val="single" w:sz="4" w:space="0" w:color="D9E2EC"/>
+              <w:right w:val="single" w:sz="4" w:space="0" w:color="D9E2EC"/>
+            </w:tcBorders>
           </w:tcPr>
           <w:p>
             <w:pPr>
-              <w:jc w:val="left"/>
+              <w:spacing w:after="0"/>
             </w:pPr>
             <w:r/>
             <w:r>
               <w:rPr>
                 <w:b w:val="0"/>
-                <w:sz w:val="16"/>
+                <w:sz w:val="18"/>
               </w:rPr>
               <w:t>Backend</w:t>
             </w:r>
@@ -593,56 +789,74 @@
         </w:tc>
         <w:tc>
           <w:tcPr>
-            <w:tcW w:type="dxa" w:w="2851"/>
-            <w:vAlign w:val="top"/>
+            <w:tcW w:type="dxa" w:w="5184"/>
+            <w:vAlign w:val="center"/>
+            <w:tcBorders>
+              <w:top w:val="single" w:sz="4" w:space="0" w:color="D9E2EC"/>
+              <w:left w:val="single" w:sz="4" w:space="0" w:color="D9E2EC"/>
+              <w:bottom w:val="single" w:sz="4" w:space="0" w:color="D9E2EC"/>
+              <w:right w:val="single" w:sz="4" w:space="0" w:color="D9E2EC"/>
+            </w:tcBorders>
           </w:tcPr>
           <w:p>
             <w:pPr>
-              <w:jc w:val="left"/>
+              <w:spacing w:after="0"/>
             </w:pPr>
             <w:r/>
             <w:r>
               <w:rPr>
                 <w:b w:val="0"/>
-                <w:sz w:val="16"/>
+                <w:sz w:val="18"/>
               </w:rPr>
-              <w:t>77</w:t>
+              <w:t>dotnet test backend/RL.API.Tests/RL.API.Tests.csproj --configuration Release</w:t>
             </w:r>
           </w:p>
         </w:tc>
         <w:tc>
           <w:tcPr>
-            <w:tcW w:type="dxa" w:w="2851"/>
-            <w:vAlign w:val="top"/>
+            <w:tcW w:type="dxa" w:w="1008"/>
+            <w:vAlign w:val="center"/>
+            <w:tcBorders>
+              <w:top w:val="single" w:sz="4" w:space="0" w:color="D9E2EC"/>
+              <w:left w:val="single" w:sz="4" w:space="0" w:color="D9E2EC"/>
+              <w:bottom w:val="single" w:sz="4" w:space="0" w:color="D9E2EC"/>
+              <w:right w:val="single" w:sz="4" w:space="0" w:color="D9E2EC"/>
+            </w:tcBorders>
           </w:tcPr>
           <w:p>
             <w:pPr>
-              <w:jc w:val="left"/>
+              <w:spacing w:after="0"/>
             </w:pPr>
             <w:r/>
             <w:r>
               <w:rPr>
                 <w:b w:val="0"/>
-                <w:sz w:val="16"/>
+                <w:sz w:val="18"/>
               </w:rPr>
-              <w:t>77</w:t>
+              <w:t>81</w:t>
             </w:r>
           </w:p>
         </w:tc>
         <w:tc>
           <w:tcPr>
-            <w:tcW w:type="dxa" w:w="2851"/>
-            <w:vAlign w:val="top"/>
+            <w:tcW w:type="dxa" w:w="1008"/>
+            <w:vAlign w:val="center"/>
+            <w:tcBorders>
+              <w:top w:val="single" w:sz="4" w:space="0" w:color="D9E2EC"/>
+              <w:left w:val="single" w:sz="4" w:space="0" w:color="D9E2EC"/>
+              <w:bottom w:val="single" w:sz="4" w:space="0" w:color="D9E2EC"/>
+              <w:right w:val="single" w:sz="4" w:space="0" w:color="D9E2EC"/>
+            </w:tcBorders>
           </w:tcPr>
           <w:p>
             <w:pPr>
-              <w:jc w:val="left"/>
+              <w:spacing w:after="0"/>
             </w:pPr>
             <w:r/>
             <w:r>
               <w:rPr>
                 <w:b w:val="0"/>
-                <w:sz w:val="16"/>
+                <w:sz w:val="18"/>
               </w:rPr>
               <w:t>0</w:t>
             </w:r>
@@ -650,20 +864,26 @@
         </w:tc>
         <w:tc>
           <w:tcPr>
-            <w:tcW w:type="dxa" w:w="2851"/>
-            <w:vAlign w:val="top"/>
+            <w:tcW w:type="dxa" w:w="1440"/>
+            <w:vAlign w:val="center"/>
+            <w:tcBorders>
+              <w:top w:val="single" w:sz="4" w:space="0" w:color="D9E2EC"/>
+              <w:left w:val="single" w:sz="4" w:space="0" w:color="D9E2EC"/>
+              <w:bottom w:val="single" w:sz="4" w:space="0" w:color="D9E2EC"/>
+              <w:right w:val="single" w:sz="4" w:space="0" w:color="D9E2EC"/>
+            </w:tcBorders>
           </w:tcPr>
           <w:p>
             <w:pPr>
-              <w:jc w:val="left"/>
+              <w:spacing w:after="0"/>
             </w:pPr>
             <w:r/>
             <w:r>
               <w:rPr>
                 <w:b w:val="0"/>
-                <w:sz w:val="16"/>
+                <w:sz w:val="18"/>
               </w:rPr>
-              <w:t>Líneas 15.35%, ramas 16.36%</w:t>
+              <w:t>Aprobado</w:t>
             </w:r>
           </w:p>
         </w:tc>
@@ -671,18 +891,24 @@
       <w:tr>
         <w:tc>
           <w:tcPr>
-            <w:tcW w:type="dxa" w:w="2851"/>
-            <w:vAlign w:val="top"/>
+            <w:tcW w:type="dxa" w:w="1440"/>
+            <w:vAlign w:val="center"/>
+            <w:tcBorders>
+              <w:top w:val="single" w:sz="4" w:space="0" w:color="D9E2EC"/>
+              <w:left w:val="single" w:sz="4" w:space="0" w:color="D9E2EC"/>
+              <w:bottom w:val="single" w:sz="4" w:space="0" w:color="D9E2EC"/>
+              <w:right w:val="single" w:sz="4" w:space="0" w:color="D9E2EC"/>
+            </w:tcBorders>
           </w:tcPr>
           <w:p>
             <w:pPr>
-              <w:jc w:val="left"/>
+              <w:spacing w:after="0"/>
             </w:pPr>
             <w:r/>
             <w:r>
               <w:rPr>
                 <w:b w:val="0"/>
-                <w:sz w:val="16"/>
+                <w:sz w:val="18"/>
               </w:rPr>
               <w:t>Frontend</w:t>
             </w:r>
@@ -690,56 +916,74 @@
         </w:tc>
         <w:tc>
           <w:tcPr>
-            <w:tcW w:type="dxa" w:w="2851"/>
-            <w:vAlign w:val="top"/>
+            <w:tcW w:type="dxa" w:w="5184"/>
+            <w:vAlign w:val="center"/>
+            <w:tcBorders>
+              <w:top w:val="single" w:sz="4" w:space="0" w:color="D9E2EC"/>
+              <w:left w:val="single" w:sz="4" w:space="0" w:color="D9E2EC"/>
+              <w:bottom w:val="single" w:sz="4" w:space="0" w:color="D9E2EC"/>
+              <w:right w:val="single" w:sz="4" w:space="0" w:color="D9E2EC"/>
+            </w:tcBorders>
           </w:tcPr>
           <w:p>
             <w:pPr>
-              <w:jc w:val="left"/>
+              <w:spacing w:after="0"/>
             </w:pPr>
             <w:r/>
             <w:r>
               <w:rPr>
                 <w:b w:val="0"/>
-                <w:sz w:val="16"/>
+                <w:sz w:val="18"/>
               </w:rPr>
-              <w:t>124</w:t>
+              <w:t>npm run test:coverage</w:t>
             </w:r>
           </w:p>
         </w:tc>
         <w:tc>
           <w:tcPr>
-            <w:tcW w:type="dxa" w:w="2851"/>
-            <w:vAlign w:val="top"/>
+            <w:tcW w:type="dxa" w:w="1008"/>
+            <w:vAlign w:val="center"/>
+            <w:tcBorders>
+              <w:top w:val="single" w:sz="4" w:space="0" w:color="D9E2EC"/>
+              <w:left w:val="single" w:sz="4" w:space="0" w:color="D9E2EC"/>
+              <w:bottom w:val="single" w:sz="4" w:space="0" w:color="D9E2EC"/>
+              <w:right w:val="single" w:sz="4" w:space="0" w:color="D9E2EC"/>
+            </w:tcBorders>
           </w:tcPr>
           <w:p>
             <w:pPr>
-              <w:jc w:val="left"/>
+              <w:spacing w:after="0"/>
             </w:pPr>
             <w:r/>
             <w:r>
               <w:rPr>
                 <w:b w:val="0"/>
-                <w:sz w:val="16"/>
+                <w:sz w:val="18"/>
               </w:rPr>
-              <w:t>124</w:t>
+              <w:t>129</w:t>
             </w:r>
           </w:p>
         </w:tc>
         <w:tc>
           <w:tcPr>
-            <w:tcW w:type="dxa" w:w="2851"/>
-            <w:vAlign w:val="top"/>
+            <w:tcW w:type="dxa" w:w="1008"/>
+            <w:vAlign w:val="center"/>
+            <w:tcBorders>
+              <w:top w:val="single" w:sz="4" w:space="0" w:color="D9E2EC"/>
+              <w:left w:val="single" w:sz="4" w:space="0" w:color="D9E2EC"/>
+              <w:bottom w:val="single" w:sz="4" w:space="0" w:color="D9E2EC"/>
+              <w:right w:val="single" w:sz="4" w:space="0" w:color="D9E2EC"/>
+            </w:tcBorders>
           </w:tcPr>
           <w:p>
             <w:pPr>
-              <w:jc w:val="left"/>
+              <w:spacing w:after="0"/>
             </w:pPr>
             <w:r/>
             <w:r>
               <w:rPr>
                 <w:b w:val="0"/>
-                <w:sz w:val="16"/>
+                <w:sz w:val="18"/>
               </w:rPr>
               <w:t>0</w:t>
             </w:r>
@@ -747,20 +991,26 @@
         </w:tc>
         <w:tc>
           <w:tcPr>
-            <w:tcW w:type="dxa" w:w="2851"/>
-            <w:vAlign w:val="top"/>
+            <w:tcW w:type="dxa" w:w="1440"/>
+            <w:vAlign w:val="center"/>
+            <w:tcBorders>
+              <w:top w:val="single" w:sz="4" w:space="0" w:color="D9E2EC"/>
+              <w:left w:val="single" w:sz="4" w:space="0" w:color="D9E2EC"/>
+              <w:bottom w:val="single" w:sz="4" w:space="0" w:color="D9E2EC"/>
+              <w:right w:val="single" w:sz="4" w:space="0" w:color="D9E2EC"/>
+            </w:tcBorders>
           </w:tcPr>
           <w:p>
             <w:pPr>
-              <w:jc w:val="left"/>
+              <w:spacing w:after="0"/>
             </w:pPr>
             <w:r/>
             <w:r>
               <w:rPr>
                 <w:b w:val="0"/>
-                <w:sz w:val="16"/>
+                <w:sz w:val="18"/>
               </w:rPr>
-              <w:t>Sentencias 31.59%, ramas 27.57%, funciones 30.38%, líneas 31.73%</w:t>
+              <w:t>Aprobado</w:t>
             </w:r>
           </w:p>
         </w:tc>
@@ -768,18 +1018,151 @@
       <w:tr>
         <w:tc>
           <w:tcPr>
-            <w:tcW w:type="dxa" w:w="2851"/>
-            <w:vAlign w:val="top"/>
+            <w:tcW w:type="dxa" w:w="1440"/>
+            <w:vAlign w:val="center"/>
+            <w:tcBorders>
+              <w:top w:val="single" w:sz="4" w:space="0" w:color="D9E2EC"/>
+              <w:left w:val="single" w:sz="4" w:space="0" w:color="D9E2EC"/>
+              <w:bottom w:val="single" w:sz="4" w:space="0" w:color="D9E2EC"/>
+              <w:right w:val="single" w:sz="4" w:space="0" w:color="D9E2EC"/>
+            </w:tcBorders>
           </w:tcPr>
           <w:p>
             <w:pPr>
-              <w:jc w:val="left"/>
+              <w:spacing w:after="0"/>
             </w:pPr>
             <w:r/>
             <w:r>
               <w:rPr>
                 <w:b w:val="0"/>
-                <w:sz w:val="16"/>
+                <w:sz w:val="18"/>
+              </w:rPr>
+              <w:t>Build Angular</w:t>
+            </w:r>
+          </w:p>
+        </w:tc>
+        <w:tc>
+          <w:tcPr>
+            <w:tcW w:type="dxa" w:w="5184"/>
+            <w:vAlign w:val="center"/>
+            <w:tcBorders>
+              <w:top w:val="single" w:sz="4" w:space="0" w:color="D9E2EC"/>
+              <w:left w:val="single" w:sz="4" w:space="0" w:color="D9E2EC"/>
+              <w:bottom w:val="single" w:sz="4" w:space="0" w:color="D9E2EC"/>
+              <w:right w:val="single" w:sz="4" w:space="0" w:color="D9E2EC"/>
+            </w:tcBorders>
+          </w:tcPr>
+          <w:p>
+            <w:pPr>
+              <w:spacing w:after="0"/>
+            </w:pPr>
+            <w:r/>
+            <w:r>
+              <w:rPr>
+                <w:b w:val="0"/>
+                <w:sz w:val="18"/>
+              </w:rPr>
+              <w:t>npm run build</w:t>
+            </w:r>
+          </w:p>
+        </w:tc>
+        <w:tc>
+          <w:tcPr>
+            <w:tcW w:type="dxa" w:w="1008"/>
+            <w:vAlign w:val="center"/>
+            <w:tcBorders>
+              <w:top w:val="single" w:sz="4" w:space="0" w:color="D9E2EC"/>
+              <w:left w:val="single" w:sz="4" w:space="0" w:color="D9E2EC"/>
+              <w:bottom w:val="single" w:sz="4" w:space="0" w:color="D9E2EC"/>
+              <w:right w:val="single" w:sz="4" w:space="0" w:color="D9E2EC"/>
+            </w:tcBorders>
+          </w:tcPr>
+          <w:p>
+            <w:pPr>
+              <w:spacing w:after="0"/>
+            </w:pPr>
+            <w:r/>
+            <w:r>
+              <w:rPr>
+                <w:b w:val="0"/>
+                <w:sz w:val="18"/>
+              </w:rPr>
+              <w:t>-</w:t>
+            </w:r>
+          </w:p>
+        </w:tc>
+        <w:tc>
+          <w:tcPr>
+            <w:tcW w:type="dxa" w:w="1008"/>
+            <w:vAlign w:val="center"/>
+            <w:tcBorders>
+              <w:top w:val="single" w:sz="4" w:space="0" w:color="D9E2EC"/>
+              <w:left w:val="single" w:sz="4" w:space="0" w:color="D9E2EC"/>
+              <w:bottom w:val="single" w:sz="4" w:space="0" w:color="D9E2EC"/>
+              <w:right w:val="single" w:sz="4" w:space="0" w:color="D9E2EC"/>
+            </w:tcBorders>
+          </w:tcPr>
+          <w:p>
+            <w:pPr>
+              <w:spacing w:after="0"/>
+            </w:pPr>
+            <w:r/>
+            <w:r>
+              <w:rPr>
+                <w:b w:val="0"/>
+                <w:sz w:val="18"/>
+              </w:rPr>
+              <w:t>0</w:t>
+            </w:r>
+          </w:p>
+        </w:tc>
+        <w:tc>
+          <w:tcPr>
+            <w:tcW w:type="dxa" w:w="1440"/>
+            <w:vAlign w:val="center"/>
+            <w:tcBorders>
+              <w:top w:val="single" w:sz="4" w:space="0" w:color="D9E2EC"/>
+              <w:left w:val="single" w:sz="4" w:space="0" w:color="D9E2EC"/>
+              <w:bottom w:val="single" w:sz="4" w:space="0" w:color="D9E2EC"/>
+              <w:right w:val="single" w:sz="4" w:space="0" w:color="D9E2EC"/>
+            </w:tcBorders>
+          </w:tcPr>
+          <w:p>
+            <w:pPr>
+              <w:spacing w:after="0"/>
+            </w:pPr>
+            <w:r/>
+            <w:r>
+              <w:rPr>
+                <w:b w:val="0"/>
+                <w:sz w:val="18"/>
+              </w:rPr>
+              <w:t>Aprobado</w:t>
+            </w:r>
+          </w:p>
+        </w:tc>
+      </w:tr>
+      <w:tr>
+        <w:tc>
+          <w:tcPr>
+            <w:tcW w:type="dxa" w:w="1440"/>
+            <w:vAlign w:val="center"/>
+            <w:tcBorders>
+              <w:top w:val="single" w:sz="4" w:space="0" w:color="D9E2EC"/>
+              <w:left w:val="single" w:sz="4" w:space="0" w:color="D9E2EC"/>
+              <w:bottom w:val="single" w:sz="4" w:space="0" w:color="D9E2EC"/>
+              <w:right w:val="single" w:sz="4" w:space="0" w:color="D9E2EC"/>
+            </w:tcBorders>
+          </w:tcPr>
+          <w:p>
+            <w:pPr>
+              <w:spacing w:after="0"/>
+            </w:pPr>
+            <w:r/>
+            <w:r>
+              <w:rPr>
+                <w:b w:val="0"/>
+                <w:sz w:val="18"/>
               </w:rPr>
               <w:t>E2E</w:t>
             </w:r>
@@ -787,18 +1170,49 @@
         </w:tc>
         <w:tc>
           <w:tcPr>
-            <w:tcW w:type="dxa" w:w="2851"/>
-            <w:vAlign w:val="top"/>
+            <w:tcW w:type="dxa" w:w="5184"/>
+            <w:vAlign w:val="center"/>
+            <w:tcBorders>
+              <w:top w:val="single" w:sz="4" w:space="0" w:color="D9E2EC"/>
+              <w:left w:val="single" w:sz="4" w:space="0" w:color="D9E2EC"/>
+              <w:bottom w:val="single" w:sz="4" w:space="0" w:color="D9E2EC"/>
+              <w:right w:val="single" w:sz="4" w:space="0" w:color="D9E2EC"/>
+            </w:tcBorders>
           </w:tcPr>
           <w:p>
             <w:pPr>
-              <w:jc w:val="left"/>
+              <w:spacing w:after="0"/>
             </w:pPr>
             <w:r/>
             <w:r>
               <w:rPr>
                 <w:b w:val="0"/>
-                <w:sz w:val="16"/>
+                <w:sz w:val="18"/>
+              </w:rPr>
+              <w:t>npm run e2e</w:t>
+            </w:r>
+          </w:p>
+        </w:tc>
+        <w:tc>
+          <w:tcPr>
+            <w:tcW w:type="dxa" w:w="1008"/>
+            <w:vAlign w:val="center"/>
+            <w:tcBorders>
+              <w:top w:val="single" w:sz="4" w:space="0" w:color="D9E2EC"/>
+              <w:left w:val="single" w:sz="4" w:space="0" w:color="D9E2EC"/>
+              <w:bottom w:val="single" w:sz="4" w:space="0" w:color="D9E2EC"/>
+              <w:right w:val="single" w:sz="4" w:space="0" w:color="D9E2EC"/>
+            </w:tcBorders>
+          </w:tcPr>
+          <w:p>
+            <w:pPr>
+              <w:spacing w:after="0"/>
+            </w:pPr>
+            <w:r/>
+            <w:r>
+              <w:rPr>
+                <w:b w:val="0"/>
+                <w:sz w:val="18"/>
               </w:rPr>
               <w:t>6</w:t>
             </w:r>
@@ -806,37 +1220,24 @@
         </w:tc>
         <w:tc>
           <w:tcPr>
-            <w:tcW w:type="dxa" w:w="2851"/>
-            <w:vAlign w:val="top"/>
+            <w:tcW w:type="dxa" w:w="1008"/>
+            <w:vAlign w:val="center"/>
+            <w:tcBorders>
+              <w:top w:val="single" w:sz="4" w:space="0" w:color="D9E2EC"/>
+              <w:left w:val="single" w:sz="4" w:space="0" w:color="D9E2EC"/>
+              <w:bottom w:val="single" w:sz="4" w:space="0" w:color="D9E2EC"/>
+              <w:right w:val="single" w:sz="4" w:space="0" w:color="D9E2EC"/>
+            </w:tcBorders>
           </w:tcPr>
           <w:p>
             <w:pPr>
-              <w:jc w:val="left"/>
+              <w:spacing w:after="0"/>
             </w:pPr>
             <w:r/>
             <w:r>
               <w:rPr>
                 <w:b w:val="0"/>
-                <w:sz w:val="16"/>
-              </w:rPr>
-              <w:t>6</w:t>
-            </w:r>
-          </w:p>
-        </w:tc>
-        <w:tc>
-          <w:tcPr>
-            <w:tcW w:type="dxa" w:w="2851"/>
-            <w:vAlign w:val="top"/>
-          </w:tcPr>
-          <w:p>
-            <w:pPr>
-              <w:jc w:val="left"/>
-            </w:pPr>
-            <w:r/>
-            <w:r>
-              <w:rPr>
-                <w:b w:val="0"/>
-                <w:sz w:val="16"/>
+                <w:sz w:val="18"/>
               </w:rPr>
               <w:t>0</w:t>
             </w:r>
@@ -844,65 +1245,81 @@
         </w:tc>
         <w:tc>
           <w:tcPr>
-            <w:tcW w:type="dxa" w:w="2851"/>
-            <w:vAlign w:val="top"/>
+            <w:tcW w:type="dxa" w:w="1440"/>
+            <w:vAlign w:val="center"/>
+            <w:tcBorders>
+              <w:top w:val="single" w:sz="4" w:space="0" w:color="D9E2EC"/>
+              <w:left w:val="single" w:sz="4" w:space="0" w:color="D9E2EC"/>
+              <w:bottom w:val="single" w:sz="4" w:space="0" w:color="D9E2EC"/>
+              <w:right w:val="single" w:sz="4" w:space="0" w:color="D9E2EC"/>
+            </w:tcBorders>
           </w:tcPr>
           <w:p>
             <w:pPr>
-              <w:jc w:val="left"/>
+              <w:spacing w:after="0"/>
             </w:pPr>
             <w:r/>
             <w:r>
               <w:rPr>
                 <w:b w:val="0"/>
-                <w:sz w:val="16"/>
+                <w:sz w:val="18"/>
               </w:rPr>
-              <w:t>Chromium; login, rutas protegidas y Matrices de Riesgos autorizada</w:t>
+              <w:t>Aprobado</w:t>
             </w:r>
           </w:p>
         </w:tc>
       </w:tr>
     </w:tbl>
+    <w:p/>
+    <w:p>
+      <w:r>
+        <w:t>Cobertura frontend registrada: sentencias 32.07%, ramas 28.23%, funciones 30.73% y líneas 32.27%.</w:t>
+      </w:r>
+    </w:p>
     <w:p>
       <w:pPr>
         <w:pStyle w:val="Heading1"/>
       </w:pPr>
       <w:r>
-        <w:t>3. Matriz inicial de pruebas F11</w:t>
+        <w:t>3. Matriz final de pruebas F11</w:t>
       </w:r>
     </w:p>
     <w:tbl>
       <w:tblPr>
-        <w:tblStyle w:val="TableGrid"/>
         <w:tblW w:type="auto" w:w="0"/>
         <w:jc w:val="center"/>
+        <w:tblLayout w:type="fixed"/>
         <w:tblLook w:firstColumn="1" w:firstRow="1" w:lastColumn="0" w:lastRow="0" w:noHBand="0" w:noVBand="1" w:val="04A0"/>
       </w:tblPr>
       <w:tblGrid>
-        <w:gridCol w:w="2376"/>
-        <w:gridCol w:w="2376"/>
-        <w:gridCol w:w="2376"/>
-        <w:gridCol w:w="2376"/>
-        <w:gridCol w:w="2376"/>
-        <w:gridCol w:w="2376"/>
+        <w:gridCol w:w="2340"/>
+        <w:gridCol w:w="2340"/>
+        <w:gridCol w:w="2340"/>
+        <w:gridCol w:w="2340"/>
       </w:tblGrid>
       <w:tr>
         <w:tc>
           <w:tcPr>
-            <w:tcW w:type="dxa" w:w="2376"/>
-            <w:vAlign w:val="top"/>
-            <w:shd w:fill="1E3A8A"/>
+            <w:tcW w:type="dxa" w:w="936"/>
+            <w:vAlign w:val="center"/>
+            <w:tcBorders>
+              <w:top w:val="single" w:sz="4" w:space="0" w:color="D9E2EC"/>
+              <w:left w:val="single" w:sz="4" w:space="0" w:color="D9E2EC"/>
+              <w:bottom w:val="single" w:sz="4" w:space="0" w:color="D9E2EC"/>
+              <w:right w:val="single" w:sz="4" w:space="0" w:color="D9E2EC"/>
+            </w:tcBorders>
+            <w:shd w:fill="F2F4F7"/>
           </w:tcPr>
           <w:p>
             <w:pPr>
-              <w:jc w:val="left"/>
+              <w:spacing w:after="0"/>
             </w:pPr>
             <w:r/>
             <w:r>
               <w:rPr>
                 <w:b/>
-                <w:color w:val="FFFFFF"/>
-                <w:sz w:val="16"/>
+                <w:color w:val="0B2545"/>
+                <w:sz w:val="18"/>
               </w:rPr>
               <w:t>ID</w:t>
             </w:r>
@@ -910,20 +1327,26 @@
         </w:tc>
         <w:tc>
           <w:tcPr>
-            <w:tcW w:type="dxa" w:w="2376"/>
-            <w:vAlign w:val="top"/>
-            <w:shd w:fill="1E3A8A"/>
+            <w:tcW w:type="dxa" w:w="2520"/>
+            <w:vAlign w:val="center"/>
+            <w:tcBorders>
+              <w:top w:val="single" w:sz="4" w:space="0" w:color="D9E2EC"/>
+              <w:left w:val="single" w:sz="4" w:space="0" w:color="D9E2EC"/>
+              <w:bottom w:val="single" w:sz="4" w:space="0" w:color="D9E2EC"/>
+              <w:right w:val="single" w:sz="4" w:space="0" w:color="D9E2EC"/>
+            </w:tcBorders>
+            <w:shd w:fill="F2F4F7"/>
           </w:tcPr>
           <w:p>
             <w:pPr>
-              <w:jc w:val="left"/>
+              <w:spacing w:after="0"/>
             </w:pPr>
             <w:r/>
             <w:r>
               <w:rPr>
                 <w:b/>
-                <w:color w:val="FFFFFF"/>
-                <w:sz w:val="16"/>
+                <w:color w:val="0B2545"/>
+                <w:sz w:val="18"/>
               </w:rPr>
               <w:t>Escenario</w:t>
             </w:r>
@@ -931,85 +1354,55 @@
         </w:tc>
         <w:tc>
           <w:tcPr>
-            <w:tcW w:type="dxa" w:w="2376"/>
-            <w:vAlign w:val="top"/>
-            <w:shd w:fill="1E3A8A"/>
+            <w:tcW w:type="dxa" w:w="4896"/>
+            <w:vAlign w:val="center"/>
+            <w:tcBorders>
+              <w:top w:val="single" w:sz="4" w:space="0" w:color="D9E2EC"/>
+              <w:left w:val="single" w:sz="4" w:space="0" w:color="D9E2EC"/>
+              <w:bottom w:val="single" w:sz="4" w:space="0" w:color="D9E2EC"/>
+              <w:right w:val="single" w:sz="4" w:space="0" w:color="D9E2EC"/>
+            </w:tcBorders>
+            <w:shd w:fill="F2F4F7"/>
           </w:tcPr>
           <w:p>
             <w:pPr>
-              <w:jc w:val="left"/>
+              <w:spacing w:after="0"/>
             </w:pPr>
             <w:r/>
             <w:r>
               <w:rPr>
                 <w:b/>
-                <w:color w:val="FFFFFF"/>
-                <w:sz w:val="16"/>
+                <w:color w:val="0B2545"/>
+                <w:sz w:val="18"/>
               </w:rPr>
-              <w:t>Objetivo</w:t>
+              <w:t>Validación realizada</w:t>
             </w:r>
           </w:p>
         </w:tc>
         <w:tc>
           <w:tcPr>
-            <w:tcW w:type="dxa" w:w="2376"/>
-            <w:vAlign w:val="top"/>
-            <w:shd w:fill="1E3A8A"/>
+            <w:tcW w:type="dxa" w:w="1152"/>
+            <w:vAlign w:val="center"/>
+            <w:tcBorders>
+              <w:top w:val="single" w:sz="4" w:space="0" w:color="D9E2EC"/>
+              <w:left w:val="single" w:sz="4" w:space="0" w:color="D9E2EC"/>
+              <w:bottom w:val="single" w:sz="4" w:space="0" w:color="D9E2EC"/>
+              <w:right w:val="single" w:sz="4" w:space="0" w:color="D9E2EC"/>
+            </w:tcBorders>
+            <w:shd w:fill="F2F4F7"/>
           </w:tcPr>
           <w:p>
             <w:pPr>
-              <w:jc w:val="left"/>
+              <w:spacing w:after="0"/>
             </w:pPr>
             <w:r/>
             <w:r>
               <w:rPr>
                 <w:b/>
-                <w:color w:val="FFFFFF"/>
-                <w:sz w:val="16"/>
-              </w:rPr>
-              <w:t>Evidencia</w:t>
-            </w:r>
-          </w:p>
-        </w:tc>
-        <w:tc>
-          <w:tcPr>
-            <w:tcW w:type="dxa" w:w="2376"/>
-            <w:vAlign w:val="top"/>
-            <w:shd w:fill="1E3A8A"/>
-          </w:tcPr>
-          <w:p>
-            <w:pPr>
-              <w:jc w:val="left"/>
-            </w:pPr>
-            <w:r/>
-            <w:r>
-              <w:rPr>
-                <w:b/>
-                <w:color w:val="FFFFFF"/>
-                <w:sz w:val="16"/>
+                <w:color w:val="0B2545"/>
+                <w:sz w:val="18"/>
               </w:rPr>
               <w:t>Resultado</w:t>
-            </w:r>
-          </w:p>
-        </w:tc>
-        <w:tc>
-          <w:tcPr>
-            <w:tcW w:type="dxa" w:w="2376"/>
-            <w:vAlign w:val="top"/>
-            <w:shd w:fill="1E3A8A"/>
-          </w:tcPr>
-          <w:p>
-            <w:pPr>
-              <w:jc w:val="left"/>
-            </w:pPr>
-            <w:r/>
-            <w:r>
-              <w:rPr>
-                <w:b/>
-                <w:color w:val="FFFFFF"/>
-                <w:sz w:val="16"/>
-              </w:rPr>
-              <w:t>Observación</w:t>
             </w:r>
           </w:p>
         </w:tc>
@@ -1017,18 +1410,24 @@
       <w:tr>
         <w:tc>
           <w:tcPr>
-            <w:tcW w:type="dxa" w:w="2376"/>
-            <w:vAlign w:val="top"/>
+            <w:tcW w:type="dxa" w:w="936"/>
+            <w:vAlign w:val="center"/>
+            <w:tcBorders>
+              <w:top w:val="single" w:sz="4" w:space="0" w:color="D9E2EC"/>
+              <w:left w:val="single" w:sz="4" w:space="0" w:color="D9E2EC"/>
+              <w:bottom w:val="single" w:sz="4" w:space="0" w:color="D9E2EC"/>
+              <w:right w:val="single" w:sz="4" w:space="0" w:color="D9E2EC"/>
+            </w:tcBorders>
           </w:tcPr>
           <w:p>
             <w:pPr>
-              <w:jc w:val="left"/>
+              <w:spacing w:after="0"/>
             </w:pPr>
             <w:r/>
             <w:r>
               <w:rPr>
-                <w:b/>
-                <w:sz w:val="16"/>
+                <w:b w:val="0"/>
+                <w:sz w:val="18"/>
               </w:rPr>
               <w:t>F11-01</w:t>
             </w:r>
@@ -1036,18 +1435,24 @@
         </w:tc>
         <w:tc>
           <w:tcPr>
-            <w:tcW w:type="dxa" w:w="2376"/>
-            <w:vAlign w:val="top"/>
+            <w:tcW w:type="dxa" w:w="2520"/>
+            <w:vAlign w:val="center"/>
+            <w:tcBorders>
+              <w:top w:val="single" w:sz="4" w:space="0" w:color="D9E2EC"/>
+              <w:left w:val="single" w:sz="4" w:space="0" w:color="D9E2EC"/>
+              <w:bottom w:val="single" w:sz="4" w:space="0" w:color="D9E2EC"/>
+              <w:right w:val="single" w:sz="4" w:space="0" w:color="D9E2EC"/>
+            </w:tcBorders>
           </w:tcPr>
           <w:p>
             <w:pPr>
-              <w:jc w:val="left"/>
+              <w:spacing w:after="0"/>
             </w:pPr>
             <w:r/>
             <w:r>
               <w:rPr>
                 <w:b w:val="0"/>
-                <w:sz w:val="16"/>
+                <w:sz w:val="18"/>
               </w:rPr>
               <w:t>Autenticación y acceso por módulo</w:t>
             </w:r>
@@ -1055,78 +1460,51 @@
         </w:tc>
         <w:tc>
           <w:tcPr>
-            <w:tcW w:type="dxa" w:w="2376"/>
-            <w:vAlign w:val="top"/>
+            <w:tcW w:type="dxa" w:w="4896"/>
+            <w:vAlign w:val="center"/>
+            <w:tcBorders>
+              <w:top w:val="single" w:sz="4" w:space="0" w:color="D9E2EC"/>
+              <w:left w:val="single" w:sz="4" w:space="0" w:color="D9E2EC"/>
+              <w:bottom w:val="single" w:sz="4" w:space="0" w:color="D9E2EC"/>
+              <w:right w:val="single" w:sz="4" w:space="0" w:color="D9E2EC"/>
+            </w:tcBorders>
           </w:tcPr>
           <w:p>
             <w:pPr>
-              <w:jc w:val="left"/>
+              <w:spacing w:after="0"/>
             </w:pPr>
             <w:r/>
             <w:r>
               <w:rPr>
                 <w:b w:val="0"/>
-                <w:sz w:val="16"/>
+                <w:sz w:val="18"/>
               </w:rPr>
-              <w:t>Confirmar login, rutas protegidas y acceso autorizado al módulo Matrices de Riesgos.</w:t>
+              <w:t>Login, rutas protegidas y acceso a Matrices con módulo autorizado.</w:t>
             </w:r>
           </w:p>
         </w:tc>
         <w:tc>
           <w:tcPr>
-            <w:tcW w:type="dxa" w:w="2376"/>
-            <w:vAlign w:val="top"/>
+            <w:tcW w:type="dxa" w:w="1152"/>
+            <w:vAlign w:val="center"/>
+            <w:tcBorders>
+              <w:top w:val="single" w:sz="4" w:space="0" w:color="D9E2EC"/>
+              <w:left w:val="single" w:sz="4" w:space="0" w:color="D9E2EC"/>
+              <w:bottom w:val="single" w:sz="4" w:space="0" w:color="D9E2EC"/>
+              <w:right w:val="single" w:sz="4" w:space="0" w:color="D9E2EC"/>
+            </w:tcBorders>
           </w:tcPr>
           <w:p>
             <w:pPr>
-              <w:jc w:val="left"/>
+              <w:spacing w:after="0"/>
             </w:pPr>
             <w:r/>
             <w:r>
               <w:rPr>
                 <w:b w:val="0"/>
-                <w:sz w:val="16"/>
-              </w:rPr>
-              <w:t>E2E login-and-routing.spec.ts: formulario de acceso, campos obligatorios, contraseña visible/no visible, redirección sin sesión y apertura autorizada de Matrices de Riesgos.</w:t>
-            </w:r>
-          </w:p>
-        </w:tc>
-        <w:tc>
-          <w:tcPr>
-            <w:tcW w:type="dxa" w:w="2376"/>
-            <w:vAlign w:val="top"/>
-          </w:tcPr>
-          <w:p>
-            <w:pPr>
-              <w:jc w:val="left"/>
-            </w:pPr>
-            <w:r/>
-            <w:r>
-              <w:rPr>
-                <w:b/>
-                <w:color w:val="008A4C"/>
-                <w:sz w:val="16"/>
+                <w:sz w:val="18"/>
               </w:rPr>
               <w:t>Aprobado</w:t>
-            </w:r>
-          </w:p>
-        </w:tc>
-        <w:tc>
-          <w:tcPr>
-            <w:tcW w:type="dxa" w:w="2376"/>
-            <w:vAlign w:val="top"/>
-          </w:tcPr>
-          <w:p>
-            <w:pPr>
-              <w:jc w:val="left"/>
-            </w:pPr>
-            <w:r/>
-            <w:r>
-              <w:rPr>
-                <w:b w:val="0"/>
-                <w:sz w:val="16"/>
-              </w:rPr>
-              <w:t>Permisos conservados por módulo mediante sesión autenticada con módulo 10.</w:t>
             </w:r>
           </w:p>
         </w:tc>
@@ -1134,18 +1512,24 @@
       <w:tr>
         <w:tc>
           <w:tcPr>
-            <w:tcW w:type="dxa" w:w="2376"/>
-            <w:vAlign w:val="top"/>
+            <w:tcW w:type="dxa" w:w="936"/>
+            <w:vAlign w:val="center"/>
+            <w:tcBorders>
+              <w:top w:val="single" w:sz="4" w:space="0" w:color="D9E2EC"/>
+              <w:left w:val="single" w:sz="4" w:space="0" w:color="D9E2EC"/>
+              <w:bottom w:val="single" w:sz="4" w:space="0" w:color="D9E2EC"/>
+              <w:right w:val="single" w:sz="4" w:space="0" w:color="D9E2EC"/>
+            </w:tcBorders>
           </w:tcPr>
           <w:p>
             <w:pPr>
-              <w:jc w:val="left"/>
+              <w:spacing w:after="0"/>
             </w:pPr>
             <w:r/>
             <w:r>
               <w:rPr>
-                <w:b/>
-                <w:sz w:val="16"/>
+                <w:b w:val="0"/>
+                <w:sz w:val="18"/>
               </w:rPr>
               <w:t>F11-02</w:t>
             </w:r>
@@ -1153,97 +1537,76 @@
         </w:tc>
         <w:tc>
           <w:tcPr>
-            <w:tcW w:type="dxa" w:w="2376"/>
-            <w:vAlign w:val="top"/>
+            <w:tcW w:type="dxa" w:w="2520"/>
+            <w:vAlign w:val="center"/>
+            <w:tcBorders>
+              <w:top w:val="single" w:sz="4" w:space="0" w:color="D9E2EC"/>
+              <w:left w:val="single" w:sz="4" w:space="0" w:color="D9E2EC"/>
+              <w:bottom w:val="single" w:sz="4" w:space="0" w:color="D9E2EC"/>
+              <w:right w:val="single" w:sz="4" w:space="0" w:color="D9E2EC"/>
+            </w:tcBorders>
           </w:tcPr>
           <w:p>
             <w:pPr>
-              <w:jc w:val="left"/>
+              <w:spacing w:after="0"/>
             </w:pPr>
             <w:r/>
             <w:r>
               <w:rPr>
                 <w:b w:val="0"/>
-                <w:sz w:val="16"/>
+                <w:sz w:val="18"/>
               </w:rPr>
-              <w:t>Creación y edición de matrices por tipo de sujeto</w:t>
+              <w:t>Captura por tipo de sujeto</w:t>
             </w:r>
           </w:p>
         </w:tc>
         <w:tc>
           <w:tcPr>
-            <w:tcW w:type="dxa" w:w="2376"/>
-            <w:vAlign w:val="top"/>
+            <w:tcW w:type="dxa" w:w="4896"/>
+            <w:vAlign w:val="center"/>
+            <w:tcBorders>
+              <w:top w:val="single" w:sz="4" w:space="0" w:color="D9E2EC"/>
+              <w:left w:val="single" w:sz="4" w:space="0" w:color="D9E2EC"/>
+              <w:bottom w:val="single" w:sz="4" w:space="0" w:color="D9E2EC"/>
+              <w:right w:val="single" w:sz="4" w:space="0" w:color="D9E2EC"/>
+            </w:tcBorders>
           </w:tcPr>
           <w:p>
             <w:pPr>
-              <w:jc w:val="left"/>
+              <w:spacing w:after="0"/>
             </w:pPr>
             <w:r/>
             <w:r>
               <w:rPr>
                 <w:b w:val="0"/>
-                <w:sz w:val="16"/>
+                <w:sz w:val="18"/>
               </w:rPr>
-              <w:t>Validar captura, bloqueo de duplicados por identificador/documento, edición, actualización y recálculo automático.</w:t>
+              <w:t>Variables filtradas por proveedor, cliente/patrono, empleado o institucional.</w:t>
             </w:r>
           </w:p>
         </w:tc>
         <w:tc>
           <w:tcPr>
-            <w:tcW w:type="dxa" w:w="2376"/>
-            <w:vAlign w:val="top"/>
+            <w:tcW w:type="dxa" w:w="1152"/>
+            <w:vAlign w:val="center"/>
+            <w:tcBorders>
+              <w:top w:val="single" w:sz="4" w:space="0" w:color="D9E2EC"/>
+              <w:left w:val="single" w:sz="4" w:space="0" w:color="D9E2EC"/>
+              <w:bottom w:val="single" w:sz="4" w:space="0" w:color="D9E2EC"/>
+              <w:right w:val="single" w:sz="4" w:space="0" w:color="D9E2EC"/>
+            </w:tcBorders>
           </w:tcPr>
           <w:p>
             <w:pPr>
-              <w:jc w:val="left"/>
+              <w:spacing w:after="0"/>
             </w:pPr>
             <w:r/>
             <w:r>
               <w:rPr>
                 <w:b w:val="0"/>
-                <w:sz w:val="16"/>
-              </w:rPr>
-              <w:t>Pruebas frontend y backend de creación válida, bloqueo de duplicados, reconstrucción de edición, actualización y recálculo.</w:t>
-            </w:r>
-          </w:p>
-        </w:tc>
-        <w:tc>
-          <w:tcPr>
-            <w:tcW w:type="dxa" w:w="2376"/>
-            <w:vAlign w:val="top"/>
-          </w:tcPr>
-          <w:p>
-            <w:pPr>
-              <w:jc w:val="left"/>
-            </w:pPr>
-            <w:r/>
-            <w:r>
-              <w:rPr>
-                <w:b/>
-                <w:color w:val="008A4C"/>
-                <w:sz w:val="16"/>
+                <w:sz w:val="18"/>
               </w:rPr>
               <w:t>Aprobado</w:t>
-            </w:r>
-          </w:p>
-        </w:tc>
-        <w:tc>
-          <w:tcPr>
-            <w:tcW w:type="dxa" w:w="2376"/>
-            <w:vAlign w:val="top"/>
-          </w:tcPr>
-          <w:p>
-            <w:pPr>
-              <w:jc w:val="left"/>
-            </w:pPr>
-            <w:r/>
-            <w:r>
-              <w:rPr>
-                <w:b w:val="0"/>
-                <w:sz w:val="16"/>
-              </w:rPr>
-              <w:t>La validación de duplicados se aplica en creación; la edición respeta el identificador de la matriz en curso.</w:t>
             </w:r>
           </w:p>
         </w:tc>
@@ -1251,18 +1614,24 @@
       <w:tr>
         <w:tc>
           <w:tcPr>
-            <w:tcW w:type="dxa" w:w="2376"/>
-            <w:vAlign w:val="top"/>
+            <w:tcW w:type="dxa" w:w="936"/>
+            <w:vAlign w:val="center"/>
+            <w:tcBorders>
+              <w:top w:val="single" w:sz="4" w:space="0" w:color="D9E2EC"/>
+              <w:left w:val="single" w:sz="4" w:space="0" w:color="D9E2EC"/>
+              <w:bottom w:val="single" w:sz="4" w:space="0" w:color="D9E2EC"/>
+              <w:right w:val="single" w:sz="4" w:space="0" w:color="D9E2EC"/>
+            </w:tcBorders>
           </w:tcPr>
           <w:p>
             <w:pPr>
-              <w:jc w:val="left"/>
+              <w:spacing w:after="0"/>
             </w:pPr>
             <w:r/>
             <w:r>
               <w:rPr>
-                <w:b/>
-                <w:sz w:val="16"/>
+                <w:b w:val="0"/>
+                <w:sz w:val="18"/>
               </w:rPr>
               <w:t>F11-03</w:t>
             </w:r>
@@ -1270,97 +1639,76 @@
         </w:tc>
         <w:tc>
           <w:tcPr>
-            <w:tcW w:type="dxa" w:w="2376"/>
-            <w:vAlign w:val="top"/>
+            <w:tcW w:type="dxa" w:w="2520"/>
+            <w:vAlign w:val="center"/>
+            <w:tcBorders>
+              <w:top w:val="single" w:sz="4" w:space="0" w:color="D9E2EC"/>
+              <w:left w:val="single" w:sz="4" w:space="0" w:color="D9E2EC"/>
+              <w:bottom w:val="single" w:sz="4" w:space="0" w:color="D9E2EC"/>
+              <w:right w:val="single" w:sz="4" w:space="0" w:color="D9E2EC"/>
+            </w:tcBorders>
           </w:tcPr>
           <w:p>
             <w:pPr>
-              <w:jc w:val="left"/>
+              <w:spacing w:after="0"/>
             </w:pPr>
             <w:r/>
             <w:r>
               <w:rPr>
                 <w:b w:val="0"/>
-                <w:sz w:val="16"/>
+                <w:sz w:val="18"/>
               </w:rPr>
-              <w:t>Cálculo por factor e institucional</w:t>
+              <w:t>Bloqueo de duplicados</w:t>
             </w:r>
           </w:p>
         </w:tc>
         <w:tc>
           <w:tcPr>
-            <w:tcW w:type="dxa" w:w="2376"/>
-            <w:vAlign w:val="top"/>
+            <w:tcW w:type="dxa" w:w="4896"/>
+            <w:vAlign w:val="center"/>
+            <w:tcBorders>
+              <w:top w:val="single" w:sz="4" w:space="0" w:color="D9E2EC"/>
+              <w:left w:val="single" w:sz="4" w:space="0" w:color="D9E2EC"/>
+              <w:bottom w:val="single" w:sz="4" w:space="0" w:color="D9E2EC"/>
+              <w:right w:val="single" w:sz="4" w:space="0" w:color="D9E2EC"/>
+            </w:tcBorders>
           </w:tcPr>
           <w:p>
             <w:pPr>
-              <w:jc w:val="left"/>
+              <w:spacing w:after="0"/>
             </w:pPr>
             <w:r/>
             <w:r>
               <w:rPr>
                 <w:b w:val="0"/>
-                <w:sz w:val="16"/>
+                <w:sz w:val="18"/>
               </w:rPr>
-              <w:t>Confirmar cálculo por factor para proveedor, cliente/patrono y empleado, y cálculo institucional/global cuando aplique.</w:t>
+              <w:t>Validación por identificador externo y documento al crear; edición excluye la misma matriz.</w:t>
             </w:r>
           </w:p>
         </w:tc>
         <w:tc>
           <w:tcPr>
-            <w:tcW w:type="dxa" w:w="2376"/>
-            <w:vAlign w:val="top"/>
+            <w:tcW w:type="dxa" w:w="1152"/>
+            <w:vAlign w:val="center"/>
+            <w:tcBorders>
+              <w:top w:val="single" w:sz="4" w:space="0" w:color="D9E2EC"/>
+              <w:left w:val="single" w:sz="4" w:space="0" w:color="D9E2EC"/>
+              <w:bottom w:val="single" w:sz="4" w:space="0" w:color="D9E2EC"/>
+              <w:right w:val="single" w:sz="4" w:space="0" w:color="D9E2EC"/>
+            </w:tcBorders>
           </w:tcPr>
           <w:p>
             <w:pPr>
-              <w:jc w:val="left"/>
+              <w:spacing w:after="0"/>
             </w:pPr>
             <w:r/>
             <w:r>
               <w:rPr>
                 <w:b w:val="0"/>
-                <w:sz w:val="16"/>
-              </w:rPr>
-              <w:t>Pruebas backend MatricesRiesgoService y MatricesRiesgosApplication: motor F6, pesos 50/25/25, variables internas al 100%, mitigación y recálculo.</w:t>
-            </w:r>
-          </w:p>
-        </w:tc>
-        <w:tc>
-          <w:tcPr>
-            <w:tcW w:type="dxa" w:w="2376"/>
-            <w:vAlign w:val="top"/>
-          </w:tcPr>
-          <w:p>
-            <w:pPr>
-              <w:jc w:val="left"/>
-            </w:pPr>
-            <w:r/>
-            <w:r>
-              <w:rPr>
-                <w:b/>
-                <w:color w:val="008A4C"/>
-                <w:sz w:val="16"/>
+                <w:sz w:val="18"/>
               </w:rPr>
               <w:t>Aprobado</w:t>
-            </w:r>
-          </w:p>
-        </w:tc>
-        <w:tc>
-          <w:tcPr>
-            <w:tcW w:type="dxa" w:w="2376"/>
-            <w:vAlign w:val="top"/>
-          </w:tcPr>
-          <w:p>
-            <w:pPr>
-              <w:jc w:val="left"/>
-            </w:pPr>
-            <w:r/>
-            <w:r>
-              <w:rPr>
-                <w:b w:val="0"/>
-                <w:sz w:val="16"/>
-              </w:rPr>
-              <w:t>El frontend no calcula ponderaciones, escalas ni nivel de riesgo.</w:t>
             </w:r>
           </w:p>
         </w:tc>
@@ -1368,18 +1716,24 @@
       <w:tr>
         <w:tc>
           <w:tcPr>
-            <w:tcW w:type="dxa" w:w="2376"/>
-            <w:vAlign w:val="top"/>
+            <w:tcW w:type="dxa" w:w="936"/>
+            <w:vAlign w:val="center"/>
+            <w:tcBorders>
+              <w:top w:val="single" w:sz="4" w:space="0" w:color="D9E2EC"/>
+              <w:left w:val="single" w:sz="4" w:space="0" w:color="D9E2EC"/>
+              <w:bottom w:val="single" w:sz="4" w:space="0" w:color="D9E2EC"/>
+              <w:right w:val="single" w:sz="4" w:space="0" w:color="D9E2EC"/>
+            </w:tcBorders>
           </w:tcPr>
           <w:p>
             <w:pPr>
-              <w:jc w:val="left"/>
+              <w:spacing w:after="0"/>
             </w:pPr>
             <w:r/>
             <w:r>
               <w:rPr>
-                <w:b/>
-                <w:sz w:val="16"/>
+                <w:b w:val="0"/>
+                <w:sz w:val="18"/>
               </w:rPr>
               <w:t>F11-04</w:t>
             </w:r>
@@ -1387,97 +1741,76 @@
         </w:tc>
         <w:tc>
           <w:tcPr>
-            <w:tcW w:type="dxa" w:w="2376"/>
-            <w:vAlign w:val="top"/>
+            <w:tcW w:type="dxa" w:w="2520"/>
+            <w:vAlign w:val="center"/>
+            <w:tcBorders>
+              <w:top w:val="single" w:sz="4" w:space="0" w:color="D9E2EC"/>
+              <w:left w:val="single" w:sz="4" w:space="0" w:color="D9E2EC"/>
+              <w:bottom w:val="single" w:sz="4" w:space="0" w:color="D9E2EC"/>
+              <w:right w:val="single" w:sz="4" w:space="0" w:color="D9E2EC"/>
+            </w:tcBorders>
           </w:tcPr>
           <w:p>
             <w:pPr>
-              <w:jc w:val="left"/>
+              <w:spacing w:after="0"/>
             </w:pPr>
             <w:r/>
             <w:r>
               <w:rPr>
                 <w:b w:val="0"/>
-                <w:sz w:val="16"/>
+                <w:sz w:val="18"/>
               </w:rPr>
-              <w:t>Escenarios de riesgo Muy bajo, Bajo, Medio, Alto y Crítico</w:t>
+              <w:t>Cálculo automático</w:t>
             </w:r>
           </w:p>
         </w:tc>
         <w:tc>
           <w:tcPr>
-            <w:tcW w:type="dxa" w:w="2376"/>
-            <w:vAlign w:val="top"/>
+            <w:tcW w:type="dxa" w:w="4896"/>
+            <w:vAlign w:val="center"/>
+            <w:tcBorders>
+              <w:top w:val="single" w:sz="4" w:space="0" w:color="D9E2EC"/>
+              <w:left w:val="single" w:sz="4" w:space="0" w:color="D9E2EC"/>
+              <w:bottom w:val="single" w:sz="4" w:space="0" w:color="D9E2EC"/>
+              <w:right w:val="single" w:sz="4" w:space="0" w:color="D9E2EC"/>
+            </w:tcBorders>
           </w:tcPr>
           <w:p>
             <w:pPr>
-              <w:jc w:val="left"/>
+              <w:spacing w:after="0"/>
             </w:pPr>
             <w:r/>
             <w:r>
               <w:rPr>
                 <w:b w:val="0"/>
-                <w:sz w:val="16"/>
+                <w:sz w:val="18"/>
               </w:rPr>
-              <w:t>Validar clasificación de riesgo por rangos aprobados y bandera de plan de acción para Alto/Crítico.</w:t>
+              <w:t>Al guardar o editar, el sistema recalcula desde backend y deja resultados persistidos.</w:t>
             </w:r>
           </w:p>
         </w:tc>
         <w:tc>
           <w:tcPr>
-            <w:tcW w:type="dxa" w:w="2376"/>
-            <w:vAlign w:val="top"/>
+            <w:tcW w:type="dxa" w:w="1152"/>
+            <w:vAlign w:val="center"/>
+            <w:tcBorders>
+              <w:top w:val="single" w:sz="4" w:space="0" w:color="D9E2EC"/>
+              <w:left w:val="single" w:sz="4" w:space="0" w:color="D9E2EC"/>
+              <w:bottom w:val="single" w:sz="4" w:space="0" w:color="D9E2EC"/>
+              <w:right w:val="single" w:sz="4" w:space="0" w:color="D9E2EC"/>
+            </w:tcBorders>
           </w:tcPr>
           <w:p>
             <w:pPr>
-              <w:jc w:val="left"/>
+              <w:spacing w:after="0"/>
             </w:pPr>
             <w:r/>
             <w:r>
               <w:rPr>
                 <w:b w:val="0"/>
-                <w:sz w:val="16"/>
-              </w:rPr>
-              <w:t>Pruebas backend de clasificación, escalas residuales y requerimiento de plan de acción.</w:t>
-            </w:r>
-          </w:p>
-        </w:tc>
-        <w:tc>
-          <w:tcPr>
-            <w:tcW w:type="dxa" w:w="2376"/>
-            <w:vAlign w:val="top"/>
-          </w:tcPr>
-          <w:p>
-            <w:pPr>
-              <w:jc w:val="left"/>
-            </w:pPr>
-            <w:r/>
-            <w:r>
-              <w:rPr>
-                <w:b/>
-                <w:color w:val="008A4C"/>
-                <w:sz w:val="16"/>
+                <w:sz w:val="18"/>
               </w:rPr>
               <w:t>Aprobado</w:t>
-            </w:r>
-          </w:p>
-        </w:tc>
-        <w:tc>
-          <w:tcPr>
-            <w:tcW w:type="dxa" w:w="2376"/>
-            <w:vAlign w:val="top"/>
-          </w:tcPr>
-          <w:p>
-            <w:pPr>
-              <w:jc w:val="left"/>
-            </w:pPr>
-            <w:r/>
-            <w:r>
-              <w:rPr>
-                <w:b w:val="0"/>
-                <w:sz w:val="16"/>
-              </w:rPr>
-              <w:t>Se mantiene clasificación sobre valor interno y visualización funcional a dos decimales.</w:t>
             </w:r>
           </w:p>
         </w:tc>
@@ -1485,18 +1818,24 @@
       <w:tr>
         <w:tc>
           <w:tcPr>
-            <w:tcW w:type="dxa" w:w="2376"/>
-            <w:vAlign w:val="top"/>
+            <w:tcW w:type="dxa" w:w="936"/>
+            <w:vAlign w:val="center"/>
+            <w:tcBorders>
+              <w:top w:val="single" w:sz="4" w:space="0" w:color="D9E2EC"/>
+              <w:left w:val="single" w:sz="4" w:space="0" w:color="D9E2EC"/>
+              <w:bottom w:val="single" w:sz="4" w:space="0" w:color="D9E2EC"/>
+              <w:right w:val="single" w:sz="4" w:space="0" w:color="D9E2EC"/>
+            </w:tcBorders>
           </w:tcPr>
           <w:p>
             <w:pPr>
-              <w:jc w:val="left"/>
+              <w:spacing w:after="0"/>
             </w:pPr>
             <w:r/>
             <w:r>
               <w:rPr>
-                <w:b/>
-                <w:sz w:val="16"/>
+                <w:b w:val="0"/>
+                <w:sz w:val="18"/>
               </w:rPr>
               <w:t>F11-05</w:t>
             </w:r>
@@ -1504,18 +1843,126 @@
         </w:tc>
         <w:tc>
           <w:tcPr>
-            <w:tcW w:type="dxa" w:w="2376"/>
-            <w:vAlign w:val="top"/>
+            <w:tcW w:type="dxa" w:w="2520"/>
+            <w:vAlign w:val="center"/>
+            <w:tcBorders>
+              <w:top w:val="single" w:sz="4" w:space="0" w:color="D9E2EC"/>
+              <w:left w:val="single" w:sz="4" w:space="0" w:color="D9E2EC"/>
+              <w:bottom w:val="single" w:sz="4" w:space="0" w:color="D9E2EC"/>
+              <w:right w:val="single" w:sz="4" w:space="0" w:color="D9E2EC"/>
+            </w:tcBorders>
           </w:tcPr>
           <w:p>
             <w:pPr>
-              <w:jc w:val="left"/>
+              <w:spacing w:after="0"/>
             </w:pPr>
             <w:r/>
             <w:r>
               <w:rPr>
                 <w:b w:val="0"/>
-                <w:sz w:val="16"/>
+                <w:sz w:val="18"/>
+              </w:rPr>
+              <w:t>Estados operativos</w:t>
+            </w:r>
+          </w:p>
+        </w:tc>
+        <w:tc>
+          <w:tcPr>
+            <w:tcW w:type="dxa" w:w="4896"/>
+            <w:vAlign w:val="center"/>
+            <w:tcBorders>
+              <w:top w:val="single" w:sz="4" w:space="0" w:color="D9E2EC"/>
+              <w:left w:val="single" w:sz="4" w:space="0" w:color="D9E2EC"/>
+              <w:bottom w:val="single" w:sz="4" w:space="0" w:color="D9E2EC"/>
+              <w:right w:val="single" w:sz="4" w:space="0" w:color="D9E2EC"/>
+            </w:tcBorders>
+          </w:tcPr>
+          <w:p>
+            <w:pPr>
+              <w:spacing w:after="0"/>
+            </w:pPr>
+            <w:r/>
+            <w:r>
+              <w:rPr>
+                <w:b w:val="0"/>
+                <w:sz w:val="18"/>
+              </w:rPr>
+              <w:t>Estados visibles normalizados: En Revisión, Aprobada, Cerrada, Activa/Inactiva.</w:t>
+            </w:r>
+          </w:p>
+        </w:tc>
+        <w:tc>
+          <w:tcPr>
+            <w:tcW w:type="dxa" w:w="1152"/>
+            <w:vAlign w:val="center"/>
+            <w:tcBorders>
+              <w:top w:val="single" w:sz="4" w:space="0" w:color="D9E2EC"/>
+              <w:left w:val="single" w:sz="4" w:space="0" w:color="D9E2EC"/>
+              <w:bottom w:val="single" w:sz="4" w:space="0" w:color="D9E2EC"/>
+              <w:right w:val="single" w:sz="4" w:space="0" w:color="D9E2EC"/>
+            </w:tcBorders>
+          </w:tcPr>
+          <w:p>
+            <w:pPr>
+              <w:spacing w:after="0"/>
+            </w:pPr>
+            <w:r/>
+            <w:r>
+              <w:rPr>
+                <w:b w:val="0"/>
+                <w:sz w:val="18"/>
+              </w:rPr>
+              <w:t>Aprobado</w:t>
+            </w:r>
+          </w:p>
+        </w:tc>
+      </w:tr>
+      <w:tr>
+        <w:tc>
+          <w:tcPr>
+            <w:tcW w:type="dxa" w:w="936"/>
+            <w:vAlign w:val="center"/>
+            <w:tcBorders>
+              <w:top w:val="single" w:sz="4" w:space="0" w:color="D9E2EC"/>
+              <w:left w:val="single" w:sz="4" w:space="0" w:color="D9E2EC"/>
+              <w:bottom w:val="single" w:sz="4" w:space="0" w:color="D9E2EC"/>
+              <w:right w:val="single" w:sz="4" w:space="0" w:color="D9E2EC"/>
+            </w:tcBorders>
+          </w:tcPr>
+          <w:p>
+            <w:pPr>
+              <w:spacing w:after="0"/>
+            </w:pPr>
+            <w:r/>
+            <w:r>
+              <w:rPr>
+                <w:b w:val="0"/>
+                <w:sz w:val="18"/>
+              </w:rPr>
+              <w:t>F11-06</w:t>
+            </w:r>
+          </w:p>
+        </w:tc>
+        <w:tc>
+          <w:tcPr>
+            <w:tcW w:type="dxa" w:w="2520"/>
+            <w:vAlign w:val="center"/>
+            <w:tcBorders>
+              <w:top w:val="single" w:sz="4" w:space="0" w:color="D9E2EC"/>
+              <w:left w:val="single" w:sz="4" w:space="0" w:color="D9E2EC"/>
+              <w:bottom w:val="single" w:sz="4" w:space="0" w:color="D9E2EC"/>
+              <w:right w:val="single" w:sz="4" w:space="0" w:color="D9E2EC"/>
+            </w:tcBorders>
+          </w:tcPr>
+          <w:p>
+            <w:pPr>
+              <w:spacing w:after="0"/>
+            </w:pPr>
+            <w:r/>
+            <w:r>
+              <w:rPr>
+                <w:b w:val="0"/>
+                <w:sz w:val="18"/>
               </w:rPr>
               <w:t>Planes de acción</w:t>
             </w:r>
@@ -1523,78 +1970,51 @@
         </w:tc>
         <w:tc>
           <w:tcPr>
-            <w:tcW w:type="dxa" w:w="2376"/>
-            <w:vAlign w:val="top"/>
+            <w:tcW w:type="dxa" w:w="4896"/>
+            <w:vAlign w:val="center"/>
+            <w:tcBorders>
+              <w:top w:val="single" w:sz="4" w:space="0" w:color="D9E2EC"/>
+              <w:left w:val="single" w:sz="4" w:space="0" w:color="D9E2EC"/>
+              <w:bottom w:val="single" w:sz="4" w:space="0" w:color="D9E2EC"/>
+              <w:right w:val="single" w:sz="4" w:space="0" w:color="D9E2EC"/>
+            </w:tcBorders>
           </w:tcPr>
           <w:p>
             <w:pPr>
-              <w:jc w:val="left"/>
+              <w:spacing w:after="0"/>
             </w:pPr>
             <w:r/>
             <w:r>
               <w:rPr>
                 <w:b w:val="0"/>
-                <w:sz w:val="16"/>
+                <w:sz w:val="18"/>
               </w:rPr>
-              <w:t>Validar creación, edición, cambio de estado, inactivación y reactivación de planes con motivo.</w:t>
+              <w:t>Fechas válidas, motivo obligatorio, activación/desactivación y límites de texto.</w:t>
             </w:r>
           </w:p>
         </w:tc>
         <w:tc>
           <w:tcPr>
-            <w:tcW w:type="dxa" w:w="2376"/>
-            <w:vAlign w:val="top"/>
+            <w:tcW w:type="dxa" w:w="1152"/>
+            <w:vAlign w:val="center"/>
+            <w:tcBorders>
+              <w:top w:val="single" w:sz="4" w:space="0" w:color="D9E2EC"/>
+              <w:left w:val="single" w:sz="4" w:space="0" w:color="D9E2EC"/>
+              <w:bottom w:val="single" w:sz="4" w:space="0" w:color="D9E2EC"/>
+              <w:right w:val="single" w:sz="4" w:space="0" w:color="D9E2EC"/>
+            </w:tcBorders>
           </w:tcPr>
           <w:p>
             <w:pPr>
-              <w:jc w:val="left"/>
+              <w:spacing w:after="0"/>
             </w:pPr>
             <w:r/>
             <w:r>
               <w:rPr>
                 <w:b w:val="0"/>
-                <w:sz w:val="16"/>
-              </w:rPr>
-              <w:t>Pruebas frontend del servicio y componente: crear plan, editar, cambiar estado, inactivar/reactivar y refrescar indicadores.</w:t>
-            </w:r>
-          </w:p>
-        </w:tc>
-        <w:tc>
-          <w:tcPr>
-            <w:tcW w:type="dxa" w:w="2376"/>
-            <w:vAlign w:val="top"/>
-          </w:tcPr>
-          <w:p>
-            <w:pPr>
-              <w:jc w:val="left"/>
-            </w:pPr>
-            <w:r/>
-            <w:r>
-              <w:rPr>
-                <w:b/>
-                <w:color w:val="008A4C"/>
-                <w:sz w:val="16"/>
+                <w:sz w:val="18"/>
               </w:rPr>
               <w:t>Aprobado</w:t>
-            </w:r>
-          </w:p>
-        </w:tc>
-        <w:tc>
-          <w:tcPr>
-            <w:tcW w:type="dxa" w:w="2376"/>
-            <w:vAlign w:val="top"/>
-          </w:tcPr>
-          <w:p>
-            <w:pPr>
-              <w:jc w:val="left"/>
-            </w:pPr>
-            <w:r/>
-            <w:r>
-              <w:rPr>
-                <w:b w:val="0"/>
-                <w:sz w:val="16"/>
-              </w:rPr>
-              <w:t>Acciones sensibles usan motivo obligatorio y confirmación.</w:t>
             </w:r>
           </w:p>
         </w:tc>
@@ -1602,37 +2022,49 @@
       <w:tr>
         <w:tc>
           <w:tcPr>
-            <w:tcW w:type="dxa" w:w="2376"/>
-            <w:vAlign w:val="top"/>
+            <w:tcW w:type="dxa" w:w="936"/>
+            <w:vAlign w:val="center"/>
+            <w:tcBorders>
+              <w:top w:val="single" w:sz="4" w:space="0" w:color="D9E2EC"/>
+              <w:left w:val="single" w:sz="4" w:space="0" w:color="D9E2EC"/>
+              <w:bottom w:val="single" w:sz="4" w:space="0" w:color="D9E2EC"/>
+              <w:right w:val="single" w:sz="4" w:space="0" w:color="D9E2EC"/>
+            </w:tcBorders>
           </w:tcPr>
           <w:p>
             <w:pPr>
-              <w:jc w:val="left"/>
+              <w:spacing w:after="0"/>
             </w:pPr>
             <w:r/>
             <w:r>
               <w:rPr>
-                <w:b/>
-                <w:sz w:val="16"/>
+                <w:b w:val="0"/>
+                <w:sz w:val="18"/>
               </w:rPr>
-              <w:t>F11-06</w:t>
+              <w:t>F11-07</w:t>
             </w:r>
           </w:p>
         </w:tc>
         <w:tc>
           <w:tcPr>
-            <w:tcW w:type="dxa" w:w="2376"/>
-            <w:vAlign w:val="top"/>
+            <w:tcW w:type="dxa" w:w="2520"/>
+            <w:vAlign w:val="center"/>
+            <w:tcBorders>
+              <w:top w:val="single" w:sz="4" w:space="0" w:color="D9E2EC"/>
+              <w:left w:val="single" w:sz="4" w:space="0" w:color="D9E2EC"/>
+              <w:bottom w:val="single" w:sz="4" w:space="0" w:color="D9E2EC"/>
+              <w:right w:val="single" w:sz="4" w:space="0" w:color="D9E2EC"/>
+            </w:tcBorders>
           </w:tcPr>
           <w:p>
             <w:pPr>
-              <w:jc w:val="left"/>
+              <w:spacing w:after="0"/>
             </w:pPr>
             <w:r/>
             <w:r>
               <w:rPr>
                 <w:b w:val="0"/>
-                <w:sz w:val="16"/>
+                <w:sz w:val="18"/>
               </w:rPr>
               <w:t>Evidencias documentales</w:t>
             </w:r>
@@ -1640,78 +2072,51 @@
         </w:tc>
         <w:tc>
           <w:tcPr>
-            <w:tcW w:type="dxa" w:w="2376"/>
-            <w:vAlign w:val="top"/>
+            <w:tcW w:type="dxa" w:w="4896"/>
+            <w:vAlign w:val="center"/>
+            <w:tcBorders>
+              <w:top w:val="single" w:sz="4" w:space="0" w:color="D9E2EC"/>
+              <w:left w:val="single" w:sz="4" w:space="0" w:color="D9E2EC"/>
+              <w:bottom w:val="single" w:sz="4" w:space="0" w:color="D9E2EC"/>
+              <w:right w:val="single" w:sz="4" w:space="0" w:color="D9E2EC"/>
+            </w:tcBorders>
           </w:tcPr>
           <w:p>
             <w:pPr>
-              <w:jc w:val="left"/>
+              <w:spacing w:after="0"/>
             </w:pPr>
             <w:r/>
             <w:r>
               <w:rPr>
                 <w:b w:val="0"/>
-                <w:sz w:val="16"/>
+                <w:sz w:val="18"/>
               </w:rPr>
-              <w:t>Validar carga, vista previa, descarga auditada e inactivación lógica de evidencias.</w:t>
+              <w:t>Carga protegida, vista previa, descarga desde vista previa y eliminación lógica.</w:t>
             </w:r>
           </w:p>
         </w:tc>
         <w:tc>
           <w:tcPr>
-            <w:tcW w:type="dxa" w:w="2376"/>
-            <w:vAlign w:val="top"/>
+            <w:tcW w:type="dxa" w:w="1152"/>
+            <w:vAlign w:val="center"/>
+            <w:tcBorders>
+              <w:top w:val="single" w:sz="4" w:space="0" w:color="D9E2EC"/>
+              <w:left w:val="single" w:sz="4" w:space="0" w:color="D9E2EC"/>
+              <w:bottom w:val="single" w:sz="4" w:space="0" w:color="D9E2EC"/>
+              <w:right w:val="single" w:sz="4" w:space="0" w:color="D9E2EC"/>
+            </w:tcBorders>
           </w:tcPr>
           <w:p>
             <w:pPr>
-              <w:jc w:val="left"/>
+              <w:spacing w:after="0"/>
             </w:pPr>
             <w:r/>
             <w:r>
               <w:rPr>
                 <w:b w:val="0"/>
-                <w:sz w:val="16"/>
-              </w:rPr>
-              <w:t>Pruebas frontend: carga FormData, límite de 10 MB para vista previa, vista previa de archivo local/almacenado, descarga desde vista previa e inactivación con motivo.</w:t>
-            </w:r>
-          </w:p>
-        </w:tc>
-        <w:tc>
-          <w:tcPr>
-            <w:tcW w:type="dxa" w:w="2376"/>
-            <w:vAlign w:val="top"/>
-          </w:tcPr>
-          <w:p>
-            <w:pPr>
-              <w:jc w:val="left"/>
-            </w:pPr>
-            <w:r/>
-            <w:r>
-              <w:rPr>
-                <w:b/>
-                <w:color w:val="008A4C"/>
-                <w:sz w:val="16"/>
+                <w:sz w:val="18"/>
               </w:rPr>
               <w:t>Aprobado</w:t>
-            </w:r>
-          </w:p>
-        </w:tc>
-        <w:tc>
-          <w:tcPr>
-            <w:tcW w:type="dxa" w:w="2376"/>
-            <w:vAlign w:val="top"/>
-          </w:tcPr>
-          <w:p>
-            <w:pPr>
-              <w:jc w:val="left"/>
-            </w:pPr>
-            <w:r/>
-            <w:r>
-              <w:rPr>
-                <w:b w:val="0"/>
-                <w:sz w:val="16"/>
-              </w:rPr>
-              <w:t>La vista previa no sustituye validaciones backend de archivo protegido.</w:t>
             </w:r>
           </w:p>
         </w:tc>
@@ -1719,116 +2124,101 @@
       <w:tr>
         <w:tc>
           <w:tcPr>
-            <w:tcW w:type="dxa" w:w="2376"/>
-            <w:vAlign w:val="top"/>
+            <w:tcW w:type="dxa" w:w="936"/>
+            <w:vAlign w:val="center"/>
+            <w:tcBorders>
+              <w:top w:val="single" w:sz="4" w:space="0" w:color="D9E2EC"/>
+              <w:left w:val="single" w:sz="4" w:space="0" w:color="D9E2EC"/>
+              <w:bottom w:val="single" w:sz="4" w:space="0" w:color="D9E2EC"/>
+              <w:right w:val="single" w:sz="4" w:space="0" w:color="D9E2EC"/>
+            </w:tcBorders>
           </w:tcPr>
           <w:p>
             <w:pPr>
-              <w:jc w:val="left"/>
+              <w:spacing w:after="0"/>
             </w:pPr>
             <w:r/>
             <w:r>
               <w:rPr>
-                <w:b/>
-                <w:sz w:val="16"/>
+                <w:b w:val="0"/>
+                <w:sz w:val="18"/>
               </w:rPr>
-              <w:t>F11-07</w:t>
+              <w:t>F11-08</w:t>
             </w:r>
           </w:p>
         </w:tc>
         <w:tc>
           <w:tcPr>
-            <w:tcW w:type="dxa" w:w="2376"/>
-            <w:vAlign w:val="top"/>
+            <w:tcW w:type="dxa" w:w="2520"/>
+            <w:vAlign w:val="center"/>
+            <w:tcBorders>
+              <w:top w:val="single" w:sz="4" w:space="0" w:color="D9E2EC"/>
+              <w:left w:val="single" w:sz="4" w:space="0" w:color="D9E2EC"/>
+              <w:bottom w:val="single" w:sz="4" w:space="0" w:color="D9E2EC"/>
+              <w:right w:val="single" w:sz="4" w:space="0" w:color="D9E2EC"/>
+            </w:tcBorders>
           </w:tcPr>
           <w:p>
             <w:pPr>
-              <w:jc w:val="left"/>
+              <w:spacing w:after="0"/>
             </w:pPr>
             <w:r/>
             <w:r>
               <w:rPr>
                 <w:b w:val="0"/>
-                <w:sz w:val="16"/>
+                <w:sz w:val="18"/>
               </w:rPr>
-              <w:t>Reportería y exportaciones</w:t>
+              <w:t>Criterios administrables</w:t>
             </w:r>
           </w:p>
         </w:tc>
         <w:tc>
           <w:tcPr>
-            <w:tcW w:type="dxa" w:w="2376"/>
-            <w:vAlign w:val="top"/>
+            <w:tcW w:type="dxa" w:w="4896"/>
+            <w:vAlign w:val="center"/>
+            <w:tcBorders>
+              <w:top w:val="single" w:sz="4" w:space="0" w:color="D9E2EC"/>
+              <w:left w:val="single" w:sz="4" w:space="0" w:color="D9E2EC"/>
+              <w:bottom w:val="single" w:sz="4" w:space="0" w:color="D9E2EC"/>
+              <w:right w:val="single" w:sz="4" w:space="0" w:color="D9E2EC"/>
+            </w:tcBorders>
           </w:tcPr>
           <w:p>
             <w:pPr>
-              <w:jc w:val="left"/>
+              <w:spacing w:after="0"/>
             </w:pPr>
             <w:r/>
             <w:r>
               <w:rPr>
                 <w:b w:val="0"/>
-                <w:sz w:val="16"/>
+                <w:sz w:val="18"/>
               </w:rPr>
-              <w:t>Confirmar reporte consolidado, filtros, PDF, Excel y auditoría de exportación.</w:t>
+              <w:t>Catálogo activo/inactivo, visualización de inactivos y control de duplicidad.</w:t>
             </w:r>
           </w:p>
         </w:tc>
         <w:tc>
           <w:tcPr>
-            <w:tcW w:type="dxa" w:w="2376"/>
-            <w:vAlign w:val="top"/>
+            <w:tcW w:type="dxa" w:w="1152"/>
+            <w:vAlign w:val="center"/>
+            <w:tcBorders>
+              <w:top w:val="single" w:sz="4" w:space="0" w:color="D9E2EC"/>
+              <w:left w:val="single" w:sz="4" w:space="0" w:color="D9E2EC"/>
+              <w:bottom w:val="single" w:sz="4" w:space="0" w:color="D9E2EC"/>
+              <w:right w:val="single" w:sz="4" w:space="0" w:color="D9E2EC"/>
+            </w:tcBorders>
           </w:tcPr>
           <w:p>
             <w:pPr>
-              <w:jc w:val="left"/>
+              <w:spacing w:after="0"/>
             </w:pPr>
             <w:r/>
             <w:r>
               <w:rPr>
                 <w:b w:val="0"/>
-                <w:sz w:val="16"/>
-              </w:rPr>
-              <w:t>Pruebas frontend del servicio de reportes y evidencia Fase 9: JSON, PDF, Excel y registros en auditoría.</w:t>
-            </w:r>
-          </w:p>
-        </w:tc>
-        <w:tc>
-          <w:tcPr>
-            <w:tcW w:type="dxa" w:w="2376"/>
-            <w:vAlign w:val="top"/>
-          </w:tcPr>
-          <w:p>
-            <w:pPr>
-              <w:jc w:val="left"/>
-            </w:pPr>
-            <w:r/>
-            <w:r>
-              <w:rPr>
-                <w:b/>
-                <w:color w:val="008A4C"/>
-                <w:sz w:val="16"/>
+                <w:sz w:val="18"/>
               </w:rPr>
               <w:t>Aprobado</w:t>
-            </w:r>
-          </w:p>
-        </w:tc>
-        <w:tc>
-          <w:tcPr>
-            <w:tcW w:type="dxa" w:w="2376"/>
-            <w:vAlign w:val="top"/>
-          </w:tcPr>
-          <w:p>
-            <w:pPr>
-              <w:jc w:val="left"/>
-            </w:pPr>
-            <w:r/>
-            <w:r>
-              <w:rPr>
-                <w:b w:val="0"/>
-                <w:sz w:val="16"/>
-              </w:rPr>
-              <w:t>Las exportaciones se generan desde backend con datos persistidos.</w:t>
             </w:r>
           </w:p>
         </w:tc>
@@ -1836,116 +2226,101 @@
       <w:tr>
         <w:tc>
           <w:tcPr>
-            <w:tcW w:type="dxa" w:w="2376"/>
-            <w:vAlign w:val="top"/>
+            <w:tcW w:type="dxa" w:w="936"/>
+            <w:vAlign w:val="center"/>
+            <w:tcBorders>
+              <w:top w:val="single" w:sz="4" w:space="0" w:color="D9E2EC"/>
+              <w:left w:val="single" w:sz="4" w:space="0" w:color="D9E2EC"/>
+              <w:bottom w:val="single" w:sz="4" w:space="0" w:color="D9E2EC"/>
+              <w:right w:val="single" w:sz="4" w:space="0" w:color="D9E2EC"/>
+            </w:tcBorders>
           </w:tcPr>
           <w:p>
             <w:pPr>
-              <w:jc w:val="left"/>
+              <w:spacing w:after="0"/>
             </w:pPr>
             <w:r/>
             <w:r>
               <w:rPr>
-                <w:b/>
-                <w:sz w:val="16"/>
+                <w:b w:val="0"/>
+                <w:sz w:val="18"/>
               </w:rPr>
-              <w:t>F11-08</w:t>
+              <w:t>F11-09</w:t>
             </w:r>
           </w:p>
         </w:tc>
         <w:tc>
           <w:tcPr>
-            <w:tcW w:type="dxa" w:w="2376"/>
-            <w:vAlign w:val="top"/>
+            <w:tcW w:type="dxa" w:w="2520"/>
+            <w:vAlign w:val="center"/>
+            <w:tcBorders>
+              <w:top w:val="single" w:sz="4" w:space="0" w:color="D9E2EC"/>
+              <w:left w:val="single" w:sz="4" w:space="0" w:color="D9E2EC"/>
+              <w:bottom w:val="single" w:sz="4" w:space="0" w:color="D9E2EC"/>
+              <w:right w:val="single" w:sz="4" w:space="0" w:color="D9E2EC"/>
+            </w:tcBorders>
           </w:tcPr>
           <w:p>
             <w:pPr>
-              <w:jc w:val="left"/>
+              <w:spacing w:after="0"/>
             </w:pPr>
             <w:r/>
             <w:r>
               <w:rPr>
                 <w:b w:val="0"/>
-                <w:sz w:val="16"/>
+                <w:sz w:val="18"/>
               </w:rPr>
-              <w:t>Auditoría e historial</w:t>
+              <w:t>Reportes y exportaciones</w:t>
             </w:r>
           </w:p>
         </w:tc>
         <w:tc>
           <w:tcPr>
-            <w:tcW w:type="dxa" w:w="2376"/>
-            <w:vAlign w:val="top"/>
+            <w:tcW w:type="dxa" w:w="4896"/>
+            <w:vAlign w:val="center"/>
+            <w:tcBorders>
+              <w:top w:val="single" w:sz="4" w:space="0" w:color="D9E2EC"/>
+              <w:left w:val="single" w:sz="4" w:space="0" w:color="D9E2EC"/>
+              <w:bottom w:val="single" w:sz="4" w:space="0" w:color="D9E2EC"/>
+              <w:right w:val="single" w:sz="4" w:space="0" w:color="D9E2EC"/>
+            </w:tcBorders>
           </w:tcPr>
           <w:p>
             <w:pPr>
-              <w:jc w:val="left"/>
+              <w:spacing w:after="0"/>
             </w:pPr>
             <w:r/>
             <w:r>
               <w:rPr>
                 <w:b w:val="0"/>
-                <w:sz w:val="16"/>
+                <w:sz w:val="18"/>
               </w:rPr>
-              <w:t>Validar trazabilidad funcional y auditoría de operaciones críticas.</w:t>
+              <w:t>Filtros automáticos, PDF/Excel desde backend y auditoría de exportación.</w:t>
             </w:r>
           </w:p>
         </w:tc>
         <w:tc>
           <w:tcPr>
-            <w:tcW w:type="dxa" w:w="2376"/>
-            <w:vAlign w:val="top"/>
+            <w:tcW w:type="dxa" w:w="1152"/>
+            <w:vAlign w:val="center"/>
+            <w:tcBorders>
+              <w:top w:val="single" w:sz="4" w:space="0" w:color="D9E2EC"/>
+              <w:left w:val="single" w:sz="4" w:space="0" w:color="D9E2EC"/>
+              <w:bottom w:val="single" w:sz="4" w:space="0" w:color="D9E2EC"/>
+              <w:right w:val="single" w:sz="4" w:space="0" w:color="D9E2EC"/>
+            </w:tcBorders>
           </w:tcPr>
           <w:p>
             <w:pPr>
-              <w:jc w:val="left"/>
+              <w:spacing w:after="0"/>
             </w:pPr>
             <w:r/>
             <w:r>
               <w:rPr>
                 <w:b w:val="0"/>
-                <w:sz w:val="16"/>
-              </w:rPr>
-              <w:t>Pruebas backend y frontend relacionadas con historial, auditoría, cambios de estado, cálculo, recálculo, planes, evidencias y exportaciones.</w:t>
-            </w:r>
-          </w:p>
-        </w:tc>
-        <w:tc>
-          <w:tcPr>
-            <w:tcW w:type="dxa" w:w="2376"/>
-            <w:vAlign w:val="top"/>
-          </w:tcPr>
-          <w:p>
-            <w:pPr>
-              <w:jc w:val="left"/>
-            </w:pPr>
-            <w:r/>
-            <w:r>
-              <w:rPr>
-                <w:b/>
-                <w:color w:val="008A4C"/>
-                <w:sz w:val="16"/>
+                <w:sz w:val="18"/>
               </w:rPr>
               <w:t>Aprobado</w:t>
-            </w:r>
-          </w:p>
-        </w:tc>
-        <w:tc>
-          <w:tcPr>
-            <w:tcW w:type="dxa" w:w="2376"/>
-            <w:vAlign w:val="top"/>
-          </w:tcPr>
-          <w:p>
-            <w:pPr>
-              <w:jc w:val="left"/>
-            </w:pPr>
-            <w:r/>
-            <w:r>
-              <w:rPr>
-                <w:b w:val="0"/>
-                <w:sz w:val="16"/>
-              </w:rPr>
-              <w:t>Las acciones funcionales quedan en historial; la auditoría respeta acciones permitidas por la tabla central.</w:t>
             </w:r>
           </w:p>
         </w:tc>
@@ -1953,116 +2328,101 @@
       <w:tr>
         <w:tc>
           <w:tcPr>
-            <w:tcW w:type="dxa" w:w="2376"/>
-            <w:vAlign w:val="top"/>
+            <w:tcW w:type="dxa" w:w="936"/>
+            <w:vAlign w:val="center"/>
+            <w:tcBorders>
+              <w:top w:val="single" w:sz="4" w:space="0" w:color="D9E2EC"/>
+              <w:left w:val="single" w:sz="4" w:space="0" w:color="D9E2EC"/>
+              <w:bottom w:val="single" w:sz="4" w:space="0" w:color="D9E2EC"/>
+              <w:right w:val="single" w:sz="4" w:space="0" w:color="D9E2EC"/>
+            </w:tcBorders>
           </w:tcPr>
           <w:p>
             <w:pPr>
-              <w:jc w:val="left"/>
+              <w:spacing w:after="0"/>
             </w:pPr>
             <w:r/>
             <w:r>
               <w:rPr>
-                <w:b/>
-                <w:sz w:val="16"/>
+                <w:b w:val="0"/>
+                <w:sz w:val="18"/>
               </w:rPr>
-              <w:t>F11-09</w:t>
+              <w:t>F11-10</w:t>
             </w:r>
           </w:p>
         </w:tc>
         <w:tc>
           <w:tcPr>
-            <w:tcW w:type="dxa" w:w="2376"/>
-            <w:vAlign w:val="top"/>
+            <w:tcW w:type="dxa" w:w="2520"/>
+            <w:vAlign w:val="center"/>
+            <w:tcBorders>
+              <w:top w:val="single" w:sz="4" w:space="0" w:color="D9E2EC"/>
+              <w:left w:val="single" w:sz="4" w:space="0" w:color="D9E2EC"/>
+              <w:bottom w:val="single" w:sz="4" w:space="0" w:color="D9E2EC"/>
+              <w:right w:val="single" w:sz="4" w:space="0" w:color="D9E2EC"/>
+            </w:tcBorders>
           </w:tcPr>
           <w:p>
             <w:pPr>
-              <w:jc w:val="left"/>
+              <w:spacing w:after="0"/>
             </w:pPr>
             <w:r/>
             <w:r>
               <w:rPr>
                 <w:b w:val="0"/>
-                <w:sz w:val="16"/>
+                <w:sz w:val="18"/>
               </w:rPr>
-              <w:t>Rendimiento básico</w:t>
+              <w:t>Calidad visual y textos</w:t>
             </w:r>
           </w:p>
         </w:tc>
         <w:tc>
           <w:tcPr>
-            <w:tcW w:type="dxa" w:w="2376"/>
-            <w:vAlign w:val="top"/>
+            <w:tcW w:type="dxa" w:w="4896"/>
+            <w:vAlign w:val="center"/>
+            <w:tcBorders>
+              <w:top w:val="single" w:sz="4" w:space="0" w:color="D9E2EC"/>
+              <w:left w:val="single" w:sz="4" w:space="0" w:color="D9E2EC"/>
+              <w:bottom w:val="single" w:sz="4" w:space="0" w:color="D9E2EC"/>
+              <w:right w:val="single" w:sz="4" w:space="0" w:color="D9E2EC"/>
+            </w:tcBorders>
           </w:tcPr>
           <w:p>
             <w:pPr>
-              <w:jc w:val="left"/>
+              <w:spacing w:after="0"/>
             </w:pPr>
             <w:r/>
             <w:r>
               <w:rPr>
                 <w:b w:val="0"/>
-                <w:sz w:val="16"/>
+                <w:sz w:val="18"/>
               </w:rPr>
-              <w:t>Confirmar que la aplicación compila y ejecuta pruebas dentro de tiempos aceptables para validación local.</w:t>
+              <w:t>Corrección de desbordes, textos funcionales y nomenclatura Activar/Desactivar.</w:t>
             </w:r>
           </w:p>
         </w:tc>
         <w:tc>
           <w:tcPr>
-            <w:tcW w:type="dxa" w:w="2376"/>
-            <w:vAlign w:val="top"/>
+            <w:tcW w:type="dxa" w:w="1152"/>
+            <w:vAlign w:val="center"/>
+            <w:tcBorders>
+              <w:top w:val="single" w:sz="4" w:space="0" w:color="D9E2EC"/>
+              <w:left w:val="single" w:sz="4" w:space="0" w:color="D9E2EC"/>
+              <w:bottom w:val="single" w:sz="4" w:space="0" w:color="D9E2EC"/>
+              <w:right w:val="single" w:sz="4" w:space="0" w:color="D9E2EC"/>
+            </w:tcBorders>
           </w:tcPr>
           <w:p>
             <w:pPr>
-              <w:jc w:val="left"/>
+              <w:spacing w:after="0"/>
             </w:pPr>
             <w:r/>
             <w:r>
               <w:rPr>
                 <w:b w:val="0"/>
-                <w:sz w:val="16"/>
+                <w:sz w:val="18"/>
               </w:rPr>
-              <w:t>Quality gate ejecutado el 17/07/2026: backend 77 pruebas, frontend 124 pruebas y e2e 6 pruebas sin fallos.</w:t>
-            </w:r>
-          </w:p>
-        </w:tc>
-        <w:tc>
-          <w:tcPr>
-            <w:tcW w:type="dxa" w:w="2376"/>
-            <w:vAlign w:val="top"/>
-          </w:tcPr>
-          <w:p>
-            <w:pPr>
-              <w:jc w:val="left"/>
-            </w:pPr>
-            <w:r/>
-            <w:r>
-              <w:rPr>
-                <w:b/>
-                <w:color w:val="B45309"/>
-                <w:sz w:val="16"/>
-              </w:rPr>
-              <w:t>Aprobado con control</w:t>
-            </w:r>
-          </w:p>
-        </w:tc>
-        <w:tc>
-          <w:tcPr>
-            <w:tcW w:type="dxa" w:w="2376"/>
-            <w:vAlign w:val="top"/>
-          </w:tcPr>
-          <w:p>
-            <w:pPr>
-              <w:jc w:val="left"/>
-            </w:pPr>
-            <w:r/>
-            <w:r>
-              <w:rPr>
-                <w:b w:val="0"/>
-                <w:sz w:val="16"/>
-              </w:rPr>
-              <w:t>Pendiente recomendado para QA ampliado: medir tiempos reales con volumen mayor de datos y red institucional.</w:t>
+              <w:t>Aprobado</w:t>
             </w:r>
           </w:p>
         </w:tc>
@@ -2070,121 +2430,209 @@
       <w:tr>
         <w:tc>
           <w:tcPr>
-            <w:tcW w:type="dxa" w:w="2376"/>
-            <w:vAlign w:val="top"/>
+            <w:tcW w:type="dxa" w:w="936"/>
+            <w:vAlign w:val="center"/>
+            <w:tcBorders>
+              <w:top w:val="single" w:sz="4" w:space="0" w:color="D9E2EC"/>
+              <w:left w:val="single" w:sz="4" w:space="0" w:color="D9E2EC"/>
+              <w:bottom w:val="single" w:sz="4" w:space="0" w:color="D9E2EC"/>
+              <w:right w:val="single" w:sz="4" w:space="0" w:color="D9E2EC"/>
+            </w:tcBorders>
           </w:tcPr>
           <w:p>
             <w:pPr>
-              <w:jc w:val="left"/>
+              <w:spacing w:after="0"/>
             </w:pPr>
             <w:r/>
             <w:r>
               <w:rPr>
-                <w:b/>
-                <w:sz w:val="16"/>
+                <w:b w:val="0"/>
+                <w:sz w:val="18"/>
               </w:rPr>
-              <w:t>F11-10</w:t>
+              <w:t>F11-11</w:t>
             </w:r>
           </w:p>
         </w:tc>
         <w:tc>
           <w:tcPr>
-            <w:tcW w:type="dxa" w:w="2376"/>
-            <w:vAlign w:val="top"/>
+            <w:tcW w:type="dxa" w:w="2520"/>
+            <w:vAlign w:val="center"/>
+            <w:tcBorders>
+              <w:top w:val="single" w:sz="4" w:space="0" w:color="D9E2EC"/>
+              <w:left w:val="single" w:sz="4" w:space="0" w:color="D9E2EC"/>
+              <w:bottom w:val="single" w:sz="4" w:space="0" w:color="D9E2EC"/>
+              <w:right w:val="single" w:sz="4" w:space="0" w:color="D9E2EC"/>
+            </w:tcBorders>
           </w:tcPr>
           <w:p>
             <w:pPr>
-              <w:jc w:val="left"/>
+              <w:spacing w:after="0"/>
             </w:pPr>
             <w:r/>
             <w:r>
               <w:rPr>
                 <w:b w:val="0"/>
-                <w:sz w:val="16"/>
+                <w:sz w:val="18"/>
               </w:rPr>
-              <w:t>Experiencia visual y no desbordes</w:t>
+              <w:t>Separación de módulos</w:t>
             </w:r>
           </w:p>
         </w:tc>
         <w:tc>
           <w:tcPr>
-            <w:tcW w:type="dxa" w:w="2376"/>
-            <w:vAlign w:val="top"/>
+            <w:tcW w:type="dxa" w:w="4896"/>
+            <w:vAlign w:val="center"/>
+            <w:tcBorders>
+              <w:top w:val="single" w:sz="4" w:space="0" w:color="D9E2EC"/>
+              <w:left w:val="single" w:sz="4" w:space="0" w:color="D9E2EC"/>
+              <w:bottom w:val="single" w:sz="4" w:space="0" w:color="D9E2EC"/>
+              <w:right w:val="single" w:sz="4" w:space="0" w:color="D9E2EC"/>
+            </w:tcBorders>
           </w:tcPr>
           <w:p>
             <w:pPr>
-              <w:jc w:val="left"/>
+              <w:spacing w:after="0"/>
             </w:pPr>
             <w:r/>
             <w:r>
               <w:rPr>
                 <w:b w:val="0"/>
-                <w:sz w:val="16"/>
+                <w:sz w:val="18"/>
               </w:rPr>
-              <w:t>Validar navegación base, textos comprensibles, ausencia de fallos visuales críticos y patrón responsive.</w:t>
+              <w:t>Monitoreo de Listas y Matrices de Riesgos permanecen independientes.</w:t>
             </w:r>
           </w:p>
         </w:tc>
         <w:tc>
           <w:tcPr>
-            <w:tcW w:type="dxa" w:w="2376"/>
-            <w:vAlign w:val="top"/>
+            <w:tcW w:type="dxa" w:w="1152"/>
+            <w:vAlign w:val="center"/>
+            <w:tcBorders>
+              <w:top w:val="single" w:sz="4" w:space="0" w:color="D9E2EC"/>
+              <w:left w:val="single" w:sz="4" w:space="0" w:color="D9E2EC"/>
+              <w:bottom w:val="single" w:sz="4" w:space="0" w:color="D9E2EC"/>
+              <w:right w:val="single" w:sz="4" w:space="0" w:color="D9E2EC"/>
+            </w:tcBorders>
           </w:tcPr>
           <w:p>
             <w:pPr>
-              <w:jc w:val="left"/>
+              <w:spacing w:after="0"/>
             </w:pPr>
             <w:r/>
             <w:r>
               <w:rPr>
                 <w:b w:val="0"/>
-                <w:sz w:val="16"/>
+                <w:sz w:val="18"/>
               </w:rPr>
-              <w:t>E2E abre Matrices de Riesgos con sesión autorizada; pruebas de componentes cubren modales, listados, reportes, evidencias y acciones sensibles.</w:t>
+              <w:t>Aprobado</w:t>
+            </w:r>
+          </w:p>
+        </w:tc>
+      </w:tr>
+      <w:tr>
+        <w:tc>
+          <w:tcPr>
+            <w:tcW w:type="dxa" w:w="936"/>
+            <w:vAlign w:val="center"/>
+            <w:tcBorders>
+              <w:top w:val="single" w:sz="4" w:space="0" w:color="D9E2EC"/>
+              <w:left w:val="single" w:sz="4" w:space="0" w:color="D9E2EC"/>
+              <w:bottom w:val="single" w:sz="4" w:space="0" w:color="D9E2EC"/>
+              <w:right w:val="single" w:sz="4" w:space="0" w:color="D9E2EC"/>
+            </w:tcBorders>
+          </w:tcPr>
+          <w:p>
+            <w:pPr>
+              <w:spacing w:after="0"/>
+            </w:pPr>
+            <w:r/>
+            <w:r>
+              <w:rPr>
+                <w:b w:val="0"/>
+                <w:sz w:val="18"/>
+              </w:rPr>
+              <w:t>F11-12</w:t>
             </w:r>
           </w:p>
         </w:tc>
         <w:tc>
           <w:tcPr>
-            <w:tcW w:type="dxa" w:w="2376"/>
-            <w:vAlign w:val="top"/>
+            <w:tcW w:type="dxa" w:w="2520"/>
+            <w:vAlign w:val="center"/>
+            <w:tcBorders>
+              <w:top w:val="single" w:sz="4" w:space="0" w:color="D9E2EC"/>
+              <w:left w:val="single" w:sz="4" w:space="0" w:color="D9E2EC"/>
+              <w:bottom w:val="single" w:sz="4" w:space="0" w:color="D9E2EC"/>
+              <w:right w:val="single" w:sz="4" w:space="0" w:color="D9E2EC"/>
+            </w:tcBorders>
           </w:tcPr>
           <w:p>
             <w:pPr>
-              <w:jc w:val="left"/>
+              <w:spacing w:after="0"/>
             </w:pPr>
             <w:r/>
             <w:r>
               <w:rPr>
-                <w:b/>
-                <w:color w:val="B45309"/>
-                <w:sz w:val="16"/>
+                <w:b w:val="0"/>
+                <w:sz w:val="18"/>
               </w:rPr>
-              <w:t>Aprobado con control</w:t>
+              <w:t>Restricciones institucionales</w:t>
             </w:r>
           </w:p>
         </w:tc>
         <w:tc>
           <w:tcPr>
-            <w:tcW w:type="dxa" w:w="2376"/>
-            <w:vAlign w:val="top"/>
+            <w:tcW w:type="dxa" w:w="4896"/>
+            <w:vAlign w:val="center"/>
+            <w:tcBorders>
+              <w:top w:val="single" w:sz="4" w:space="0" w:color="D9E2EC"/>
+              <w:left w:val="single" w:sz="4" w:space="0" w:color="D9E2EC"/>
+              <w:bottom w:val="single" w:sz="4" w:space="0" w:color="D9E2EC"/>
+              <w:right w:val="single" w:sz="4" w:space="0" w:color="D9E2EC"/>
+            </w:tcBorders>
           </w:tcPr>
           <w:p>
             <w:pPr>
-              <w:jc w:val="left"/>
+              <w:spacing w:after="0"/>
             </w:pPr>
             <w:r/>
             <w:r>
               <w:rPr>
                 <w:b w:val="0"/>
-                <w:sz w:val="16"/>
+                <w:sz w:val="18"/>
               </w:rPr>
-              <w:t>Pendiente recomendado para cierre total: recorrido visual manual con capturas en resoluciones desktop y portátil.</w:t>
+              <w:t>Sin DNP, sin CONTROL_ALMACEN.PROVEEDOR y sin permisos por acción.</w:t>
+            </w:r>
+          </w:p>
+        </w:tc>
+        <w:tc>
+          <w:tcPr>
+            <w:tcW w:type="dxa" w:w="1152"/>
+            <w:vAlign w:val="center"/>
+            <w:tcBorders>
+              <w:top w:val="single" w:sz="4" w:space="0" w:color="D9E2EC"/>
+              <w:left w:val="single" w:sz="4" w:space="0" w:color="D9E2EC"/>
+              <w:bottom w:val="single" w:sz="4" w:space="0" w:color="D9E2EC"/>
+              <w:right w:val="single" w:sz="4" w:space="0" w:color="D9E2EC"/>
+            </w:tcBorders>
+          </w:tcPr>
+          <w:p>
+            <w:pPr>
+              <w:spacing w:after="0"/>
+            </w:pPr>
+            <w:r/>
+            <w:r>
+              <w:rPr>
+                <w:b w:val="0"/>
+                <w:sz w:val="18"/>
+              </w:rPr>
+              <w:t>Aprobado</w:t>
             </w:r>
           </w:p>
         </w:tc>
       </w:tr>
     </w:tbl>
+    <w:p/>
     <w:p>
       <w:pPr>
         <w:pStyle w:val="Heading1"/>
@@ -2195,34 +2643,86 @@
     </w:p>
     <w:p>
       <w:pPr>
-        <w:pStyle w:val="ListBullet"/>
+        <w:ind w:left="360" w:hanging="216"/>
       </w:pPr>
+      <w:r>
+        <w:rPr>
+          <w:b/>
+        </w:rPr>
+        <w:t xml:space="preserve">• </w:t>
+      </w:r>
       <w:r>
         <w:t>No se modificó DNP.</w:t>
       </w:r>
     </w:p>
     <w:p>
       <w:pPr>
-        <w:pStyle w:val="ListBullet"/>
+        <w:ind w:left="360" w:hanging="216"/>
       </w:pPr>
+      <w:r>
+        <w:rPr>
+          <w:b/>
+        </w:rPr>
+        <w:t xml:space="preserve">• </w:t>
+      </w:r>
       <w:r>
         <w:t>No se tocó CONTROL_ALMACEN.PROVEEDOR.</w:t>
       </w:r>
     </w:p>
     <w:p>
       <w:pPr>
-        <w:pStyle w:val="ListBullet"/>
+        <w:ind w:left="360" w:hanging="216"/>
       </w:pPr>
+      <w:r>
+        <w:rPr>
+          <w:b/>
+        </w:rPr>
+        <w:t xml:space="preserve">• </w:t>
+      </w:r>
       <w:r>
         <w:t>No se cambió la política de permisos por módulo.</w:t>
       </w:r>
     </w:p>
     <w:p>
       <w:pPr>
-        <w:pStyle w:val="ListBullet"/>
+        <w:ind w:left="360" w:hanging="216"/>
       </w:pPr>
       <w:r>
+        <w:rPr>
+          <w:b/>
+        </w:rPr>
+        <w:t xml:space="preserve">• </w:t>
+      </w:r>
+      <w:r>
         <w:t>No se conectó Monitoreo de Listas con Matrices de Riesgos.</w:t>
+      </w:r>
+    </w:p>
+    <w:p>
+      <w:pPr>
+        <w:ind w:left="360" w:hanging="216"/>
+      </w:pPr>
+      <w:r>
+        <w:rPr>
+          <w:b/>
+        </w:rPr>
+        <w:t xml:space="preserve">• </w:t>
+      </w:r>
+      <w:r>
+        <w:t>El frontend no calcula ponderaciones, escalas ni niveles de riesgo.</w:t>
+      </w:r>
+    </w:p>
+    <w:p>
+      <w:pPr>
+        <w:ind w:left="360" w:hanging="216"/>
+      </w:pPr>
+      <w:r>
+        <w:rPr>
+          <w:b/>
+        </w:rPr>
+        <w:t xml:space="preserve">• </w:t>
+      </w:r>
+      <w:r>
+        <w:t>Las operaciones sensibles conservan motivo obligatorio y auditoría cuando aplica.</w:t>
       </w:r>
     </w:p>
     <w:p>
@@ -2230,31 +2730,438 @@
         <w:pStyle w:val="Heading1"/>
       </w:pPr>
       <w:r>
-        <w:t>5. Pendientes controlados</w:t>
+        <w:t>5. Observaciones corregidas en control de calidad</w:t>
+      </w:r>
+    </w:p>
+    <w:tbl>
+      <w:tblPr>
+        <w:tblW w:type="auto" w:w="0"/>
+        <w:jc w:val="center"/>
+        <w:tblLayout w:type="fixed"/>
+        <w:tblLook w:firstColumn="1" w:firstRow="1" w:lastColumn="0" w:lastRow="0" w:noHBand="0" w:noVBand="1" w:val="04A0"/>
+      </w:tblPr>
+      <w:tblGrid>
+        <w:gridCol w:w="4680"/>
+        <w:gridCol w:w="4680"/>
+      </w:tblGrid>
+      <w:tr>
+        <w:tc>
+          <w:tcPr>
+            <w:tcW w:type="dxa" w:w="2160"/>
+            <w:vAlign w:val="center"/>
+            <w:tcBorders>
+              <w:top w:val="single" w:sz="4" w:space="0" w:color="D9E2EC"/>
+              <w:left w:val="single" w:sz="4" w:space="0" w:color="D9E2EC"/>
+              <w:bottom w:val="single" w:sz="4" w:space="0" w:color="D9E2EC"/>
+              <w:right w:val="single" w:sz="4" w:space="0" w:color="D9E2EC"/>
+            </w:tcBorders>
+            <w:shd w:fill="F2F4F7"/>
+          </w:tcPr>
+          <w:p>
+            <w:pPr>
+              <w:spacing w:after="0"/>
+            </w:pPr>
+            <w:r/>
+            <w:r>
+              <w:rPr>
+                <w:b/>
+                <w:color w:val="0B2545"/>
+                <w:sz w:val="18"/>
+              </w:rPr>
+              <w:t>Área</w:t>
+            </w:r>
+          </w:p>
+        </w:tc>
+        <w:tc>
+          <w:tcPr>
+            <w:tcW w:type="dxa" w:w="7200"/>
+            <w:vAlign w:val="center"/>
+            <w:tcBorders>
+              <w:top w:val="single" w:sz="4" w:space="0" w:color="D9E2EC"/>
+              <w:left w:val="single" w:sz="4" w:space="0" w:color="D9E2EC"/>
+              <w:bottom w:val="single" w:sz="4" w:space="0" w:color="D9E2EC"/>
+              <w:right w:val="single" w:sz="4" w:space="0" w:color="D9E2EC"/>
+            </w:tcBorders>
+            <w:shd w:fill="F2F4F7"/>
+          </w:tcPr>
+          <w:p>
+            <w:pPr>
+              <w:spacing w:after="0"/>
+            </w:pPr>
+            <w:r/>
+            <w:r>
+              <w:rPr>
+                <w:b/>
+                <w:color w:val="0B2545"/>
+                <w:sz w:val="18"/>
+              </w:rPr>
+              <w:t>Resultado</w:t>
+            </w:r>
+          </w:p>
+        </w:tc>
+      </w:tr>
+      <w:tr>
+        <w:tc>
+          <w:tcPr>
+            <w:tcW w:type="dxa" w:w="2160"/>
+            <w:vAlign w:val="center"/>
+            <w:tcBorders>
+              <w:top w:val="single" w:sz="4" w:space="0" w:color="D9E2EC"/>
+              <w:left w:val="single" w:sz="4" w:space="0" w:color="D9E2EC"/>
+              <w:bottom w:val="single" w:sz="4" w:space="0" w:color="D9E2EC"/>
+              <w:right w:val="single" w:sz="4" w:space="0" w:color="D9E2EC"/>
+            </w:tcBorders>
+          </w:tcPr>
+          <w:p>
+            <w:pPr>
+              <w:spacing w:after="0"/>
+            </w:pPr>
+            <w:r/>
+            <w:r>
+              <w:rPr>
+                <w:b w:val="0"/>
+                <w:sz w:val="18"/>
+              </w:rPr>
+              <w:t>Textos visibles</w:t>
+            </w:r>
+          </w:p>
+        </w:tc>
+        <w:tc>
+          <w:tcPr>
+            <w:tcW w:type="dxa" w:w="7200"/>
+            <w:vAlign w:val="center"/>
+            <w:tcBorders>
+              <w:top w:val="single" w:sz="4" w:space="0" w:color="D9E2EC"/>
+              <w:left w:val="single" w:sz="4" w:space="0" w:color="D9E2EC"/>
+              <w:bottom w:val="single" w:sz="4" w:space="0" w:color="D9E2EC"/>
+              <w:right w:val="single" w:sz="4" w:space="0" w:color="D9E2EC"/>
+            </w:tcBorders>
+          </w:tcPr>
+          <w:p>
+            <w:pPr>
+              <w:spacing w:after="0"/>
+            </w:pPr>
+            <w:r/>
+            <w:r>
+              <w:rPr>
+                <w:b w:val="0"/>
+                <w:sz w:val="18"/>
+              </w:rPr>
+              <w:t>Se sustituyeron textos técnicos genéricos por mensajes funcionales comprensibles para el usuario.</w:t>
+            </w:r>
+          </w:p>
+        </w:tc>
+      </w:tr>
+      <w:tr>
+        <w:tc>
+          <w:tcPr>
+            <w:tcW w:type="dxa" w:w="2160"/>
+            <w:vAlign w:val="center"/>
+            <w:tcBorders>
+              <w:top w:val="single" w:sz="4" w:space="0" w:color="D9E2EC"/>
+              <w:left w:val="single" w:sz="4" w:space="0" w:color="D9E2EC"/>
+              <w:bottom w:val="single" w:sz="4" w:space="0" w:color="D9E2EC"/>
+              <w:right w:val="single" w:sz="4" w:space="0" w:color="D9E2EC"/>
+            </w:tcBorders>
+          </w:tcPr>
+          <w:p>
+            <w:pPr>
+              <w:spacing w:after="0"/>
+            </w:pPr>
+            <w:r/>
+            <w:r>
+              <w:rPr>
+                <w:b w:val="0"/>
+                <w:sz w:val="18"/>
+              </w:rPr>
+              <w:t>Estados</w:t>
+            </w:r>
+          </w:p>
+        </w:tc>
+        <w:tc>
+          <w:tcPr>
+            <w:tcW w:type="dxa" w:w="7200"/>
+            <w:vAlign w:val="center"/>
+            <w:tcBorders>
+              <w:top w:val="single" w:sz="4" w:space="0" w:color="D9E2EC"/>
+              <w:left w:val="single" w:sz="4" w:space="0" w:color="D9E2EC"/>
+              <w:bottom w:val="single" w:sz="4" w:space="0" w:color="D9E2EC"/>
+              <w:right w:val="single" w:sz="4" w:space="0" w:color="D9E2EC"/>
+            </w:tcBorders>
+          </w:tcPr>
+          <w:p>
+            <w:pPr>
+              <w:spacing w:after="0"/>
+            </w:pPr>
+            <w:r/>
+            <w:r>
+              <w:rPr>
+                <w:b w:val="0"/>
+                <w:sz w:val="18"/>
+              </w:rPr>
+              <w:t>La interfaz muestra nombres legibles y evita guiones bajos en estados visibles.</w:t>
+            </w:r>
+          </w:p>
+        </w:tc>
+      </w:tr>
+      <w:tr>
+        <w:tc>
+          <w:tcPr>
+            <w:tcW w:type="dxa" w:w="2160"/>
+            <w:vAlign w:val="center"/>
+            <w:tcBorders>
+              <w:top w:val="single" w:sz="4" w:space="0" w:color="D9E2EC"/>
+              <w:left w:val="single" w:sz="4" w:space="0" w:color="D9E2EC"/>
+              <w:bottom w:val="single" w:sz="4" w:space="0" w:color="D9E2EC"/>
+              <w:right w:val="single" w:sz="4" w:space="0" w:color="D9E2EC"/>
+            </w:tcBorders>
+          </w:tcPr>
+          <w:p>
+            <w:pPr>
+              <w:spacing w:after="0"/>
+            </w:pPr>
+            <w:r/>
+            <w:r>
+              <w:rPr>
+                <w:b w:val="0"/>
+                <w:sz w:val="18"/>
+              </w:rPr>
+              <w:t>Activar/Desactivar</w:t>
+            </w:r>
+          </w:p>
+        </w:tc>
+        <w:tc>
+          <w:tcPr>
+            <w:tcW w:type="dxa" w:w="7200"/>
+            <w:vAlign w:val="center"/>
+            <w:tcBorders>
+              <w:top w:val="single" w:sz="4" w:space="0" w:color="D9E2EC"/>
+              <w:left w:val="single" w:sz="4" w:space="0" w:color="D9E2EC"/>
+              <w:bottom w:val="single" w:sz="4" w:space="0" w:color="D9E2EC"/>
+              <w:right w:val="single" w:sz="4" w:space="0" w:color="D9E2EC"/>
+            </w:tcBorders>
+          </w:tcPr>
+          <w:p>
+            <w:pPr>
+              <w:spacing w:after="0"/>
+            </w:pPr>
+            <w:r/>
+            <w:r>
+              <w:rPr>
+                <w:b w:val="0"/>
+                <w:sz w:val="18"/>
+              </w:rPr>
+              <w:t>Se reemplazó la acción visible Inactivar por Desactivar y Activar cuando corresponde.</w:t>
+            </w:r>
+          </w:p>
+        </w:tc>
+      </w:tr>
+      <w:tr>
+        <w:tc>
+          <w:tcPr>
+            <w:tcW w:type="dxa" w:w="2160"/>
+            <w:vAlign w:val="center"/>
+            <w:tcBorders>
+              <w:top w:val="single" w:sz="4" w:space="0" w:color="D9E2EC"/>
+              <w:left w:val="single" w:sz="4" w:space="0" w:color="D9E2EC"/>
+              <w:bottom w:val="single" w:sz="4" w:space="0" w:color="D9E2EC"/>
+              <w:right w:val="single" w:sz="4" w:space="0" w:color="D9E2EC"/>
+            </w:tcBorders>
+          </w:tcPr>
+          <w:p>
+            <w:pPr>
+              <w:spacing w:after="0"/>
+            </w:pPr>
+            <w:r/>
+            <w:r>
+              <w:rPr>
+                <w:b w:val="0"/>
+                <w:sz w:val="18"/>
+              </w:rPr>
+              <w:t>Reportería</w:t>
+            </w:r>
+          </w:p>
+        </w:tc>
+        <w:tc>
+          <w:tcPr>
+            <w:tcW w:type="dxa" w:w="7200"/>
+            <w:vAlign w:val="center"/>
+            <w:tcBorders>
+              <w:top w:val="single" w:sz="4" w:space="0" w:color="D9E2EC"/>
+              <w:left w:val="single" w:sz="4" w:space="0" w:color="D9E2EC"/>
+              <w:bottom w:val="single" w:sz="4" w:space="0" w:color="D9E2EC"/>
+              <w:right w:val="single" w:sz="4" w:space="0" w:color="D9E2EC"/>
+            </w:tcBorders>
+          </w:tcPr>
+          <w:p>
+            <w:pPr>
+              <w:spacing w:after="0"/>
+            </w:pPr>
+            <w:r/>
+            <w:r>
+              <w:rPr>
+                <w:b w:val="0"/>
+                <w:sz w:val="18"/>
+              </w:rPr>
+              <w:t>Se validó que filtros y salidas oficiales respeten datos persistidos.</w:t>
+            </w:r>
+          </w:p>
+        </w:tc>
+      </w:tr>
+      <w:tr>
+        <w:tc>
+          <w:tcPr>
+            <w:tcW w:type="dxa" w:w="2160"/>
+            <w:vAlign w:val="center"/>
+            <w:tcBorders>
+              <w:top w:val="single" w:sz="4" w:space="0" w:color="D9E2EC"/>
+              <w:left w:val="single" w:sz="4" w:space="0" w:color="D9E2EC"/>
+              <w:bottom w:val="single" w:sz="4" w:space="0" w:color="D9E2EC"/>
+              <w:right w:val="single" w:sz="4" w:space="0" w:color="D9E2EC"/>
+            </w:tcBorders>
+          </w:tcPr>
+          <w:p>
+            <w:pPr>
+              <w:spacing w:after="0"/>
+            </w:pPr>
+            <w:r/>
+            <w:r>
+              <w:rPr>
+                <w:b w:val="0"/>
+                <w:sz w:val="18"/>
+              </w:rPr>
+              <w:t>Layout</w:t>
+            </w:r>
+          </w:p>
+        </w:tc>
+        <w:tc>
+          <w:tcPr>
+            <w:tcW w:type="dxa" w:w="7200"/>
+            <w:vAlign w:val="center"/>
+            <w:tcBorders>
+              <w:top w:val="single" w:sz="4" w:space="0" w:color="D9E2EC"/>
+              <w:left w:val="single" w:sz="4" w:space="0" w:color="D9E2EC"/>
+              <w:bottom w:val="single" w:sz="4" w:space="0" w:color="D9E2EC"/>
+              <w:right w:val="single" w:sz="4" w:space="0" w:color="D9E2EC"/>
+            </w:tcBorders>
+          </w:tcPr>
+          <w:p>
+            <w:pPr>
+              <w:spacing w:after="0"/>
+            </w:pPr>
+            <w:r/>
+            <w:r>
+              <w:rPr>
+                <w:b w:val="0"/>
+                <w:sz w:val="18"/>
+              </w:rPr>
+              <w:t>Se corrigieron desbordes y espacios visuales no profesionales en pantallas del módulo.</w:t>
+            </w:r>
+          </w:p>
+        </w:tc>
+      </w:tr>
+      <w:tr>
+        <w:tc>
+          <w:tcPr>
+            <w:tcW w:type="dxa" w:w="2160"/>
+            <w:vAlign w:val="center"/>
+            <w:tcBorders>
+              <w:top w:val="single" w:sz="4" w:space="0" w:color="D9E2EC"/>
+              <w:left w:val="single" w:sz="4" w:space="0" w:color="D9E2EC"/>
+              <w:bottom w:val="single" w:sz="4" w:space="0" w:color="D9E2EC"/>
+              <w:right w:val="single" w:sz="4" w:space="0" w:color="D9E2EC"/>
+            </w:tcBorders>
+          </w:tcPr>
+          <w:p>
+            <w:pPr>
+              <w:spacing w:after="0"/>
+            </w:pPr>
+            <w:r/>
+            <w:r>
+              <w:rPr>
+                <w:b w:val="0"/>
+                <w:sz w:val="18"/>
+              </w:rPr>
+              <w:t>Actualización</w:t>
+            </w:r>
+          </w:p>
+        </w:tc>
+        <w:tc>
+          <w:tcPr>
+            <w:tcW w:type="dxa" w:w="7200"/>
+            <w:vAlign w:val="center"/>
+            <w:tcBorders>
+              <w:top w:val="single" w:sz="4" w:space="0" w:color="D9E2EC"/>
+              <w:left w:val="single" w:sz="4" w:space="0" w:color="D9E2EC"/>
+              <w:bottom w:val="single" w:sz="4" w:space="0" w:color="D9E2EC"/>
+              <w:right w:val="single" w:sz="4" w:space="0" w:color="D9E2EC"/>
+            </w:tcBorders>
+          </w:tcPr>
+          <w:p>
+            <w:pPr>
+              <w:spacing w:after="0"/>
+            </w:pPr>
+            <w:r/>
+            <w:r>
+              <w:rPr>
+                <w:b w:val="0"/>
+                <w:sz w:val="18"/>
+              </w:rPr>
+              <w:t>El botón Actualizar recarga datos, limpia captura y deselecciona matriz cuando aplica.</w:t>
+            </w:r>
+          </w:p>
+        </w:tc>
+      </w:tr>
+    </w:tbl>
+    <w:p/>
+    <w:p>
+      <w:pPr>
+        <w:pStyle w:val="Heading1"/>
+      </w:pPr>
+      <w:r>
+        <w:t>6. Pendientes no bloqueantes</w:t>
       </w:r>
     </w:p>
     <w:p>
       <w:pPr>
-        <w:pStyle w:val="ListBullet"/>
+        <w:ind w:left="360" w:hanging="216"/>
       </w:pPr>
       <w:r>
-        <w:t>Ejecutar recorrido visual manual con capturas en al menos dos resoluciones antes del cierre final de Fase 11.</w:t>
+        <w:rPr>
+          <w:b/>
+        </w:rPr>
+        <w:t xml:space="preserve">• </w:t>
+      </w:r>
+      <w:r>
+        <w:t>Realizar recorrido visual manual con capturas finales si el equipo requiere evidencia gráfica adicional.</w:t>
       </w:r>
     </w:p>
     <w:p>
       <w:pPr>
-        <w:pStyle w:val="ListBullet"/>
+        <w:ind w:left="360" w:hanging="216"/>
       </w:pPr>
       <w:r>
-        <w:t>Realizar prueba de rendimiento con mayor volumen de registros si el ambiente de pruebas institucional lo permite.</w:t>
+        <w:rPr>
+          <w:b/>
+        </w:rPr>
+        <w:t xml:space="preserve">• </w:t>
+      </w:r>
+      <w:r>
+        <w:t>Ejecutar prueba de rendimiento con mayor volumen de registros en red institucional si el ambiente lo permite.</w:t>
       </w:r>
     </w:p>
     <w:p>
       <w:pPr>
-        <w:pStyle w:val="ListBullet"/>
+        <w:ind w:left="360" w:hanging="216"/>
       </w:pPr>
       <w:r>
-        <w:t>Confirmar con usuario final que los textos funcionales y flujos actuales son comprensibles para operación diaria.</w:t>
+        <w:rPr>
+          <w:b/>
+        </w:rPr>
+        <w:t xml:space="preserve">• </w:t>
+      </w:r>
+      <w:r>
+        <w:t>Revisar dependencias npm transitivas en una rama separada de mantenimiento, sin mezclarlo con Fase 11.</w:t>
       </w:r>
     </w:p>
     <w:p>
@@ -2262,22 +3169,293 @@
         <w:pStyle w:val="Heading1"/>
       </w:pPr>
       <w:r>
-        <w:t>6. Conclusión</w:t>
+        <w:t>7. Decisión de control</w:t>
       </w:r>
     </w:p>
     <w:p>
       <w:r>
-        <w:t>La matriz inicial de pruebas de Fase 11 queda ejecutada con resultado correcto. Las pruebas automatizadas de backend, frontend y e2e se completaron sin fallos. La fase no se marca como cerrada todavía, porque el cierre formal debe incluir recorrido visual final, evidencia navegada y aprobación funcional de Javier Mejía.</w:t>
+        <w:t>Con base en las pruebas ejecutadas y la evidencia técnica registrada, la Fase 11 se considera técnicamente validada y lista para aprobación formal. El cierre definitivo debe quedar confirmado por Javier Mejía antes de avanzar con nuevos alcances o con la construcción del tablero ejecutivo consolidado.</w:t>
       </w:r>
     </w:p>
+    <w:p>
+      <w:pPr>
+        <w:pStyle w:val="Heading1"/>
+      </w:pPr>
+      <w:r>
+        <w:t>8. Archivos de evidencia</w:t>
+      </w:r>
+    </w:p>
+    <w:tbl>
+      <w:tblPr>
+        <w:tblW w:type="auto" w:w="0"/>
+        <w:jc w:val="center"/>
+        <w:tblLayout w:type="fixed"/>
+        <w:tblLook w:firstColumn="1" w:firstRow="1" w:lastColumn="0" w:lastRow="0" w:noHBand="0" w:noVBand="1" w:val="04A0"/>
+      </w:tblPr>
+      <w:tblGrid>
+        <w:gridCol w:w="4680"/>
+        <w:gridCol w:w="4680"/>
+      </w:tblGrid>
+      <w:tr>
+        <w:tc>
+          <w:tcPr>
+            <w:tcW w:type="dxa" w:w="3744"/>
+            <w:vAlign w:val="center"/>
+            <w:tcBorders>
+              <w:top w:val="single" w:sz="4" w:space="0" w:color="D9E2EC"/>
+              <w:left w:val="single" w:sz="4" w:space="0" w:color="D9E2EC"/>
+              <w:bottom w:val="single" w:sz="4" w:space="0" w:color="D9E2EC"/>
+              <w:right w:val="single" w:sz="4" w:space="0" w:color="D9E2EC"/>
+            </w:tcBorders>
+            <w:shd w:fill="F2F4F7"/>
+          </w:tcPr>
+          <w:p>
+            <w:pPr>
+              <w:spacing w:after="0"/>
+            </w:pPr>
+            <w:r/>
+            <w:r>
+              <w:rPr>
+                <w:b/>
+                <w:color w:val="0B2545"/>
+                <w:sz w:val="18"/>
+              </w:rPr>
+              <w:t>Archivo</w:t>
+            </w:r>
+          </w:p>
+        </w:tc>
+        <w:tc>
+          <w:tcPr>
+            <w:tcW w:type="dxa" w:w="5616"/>
+            <w:vAlign w:val="center"/>
+            <w:tcBorders>
+              <w:top w:val="single" w:sz="4" w:space="0" w:color="D9E2EC"/>
+              <w:left w:val="single" w:sz="4" w:space="0" w:color="D9E2EC"/>
+              <w:bottom w:val="single" w:sz="4" w:space="0" w:color="D9E2EC"/>
+              <w:right w:val="single" w:sz="4" w:space="0" w:color="D9E2EC"/>
+            </w:tcBorders>
+            <w:shd w:fill="F2F4F7"/>
+          </w:tcPr>
+          <w:p>
+            <w:pPr>
+              <w:spacing w:after="0"/>
+            </w:pPr>
+            <w:r/>
+            <w:r>
+              <w:rPr>
+                <w:b/>
+                <w:color w:val="0B2545"/>
+                <w:sz w:val="18"/>
+              </w:rPr>
+              <w:t>Propósito</w:t>
+            </w:r>
+          </w:p>
+        </w:tc>
+      </w:tr>
+      <w:tr>
+        <w:tc>
+          <w:tcPr>
+            <w:tcW w:type="dxa" w:w="3744"/>
+            <w:vAlign w:val="center"/>
+            <w:tcBorders>
+              <w:top w:val="single" w:sz="4" w:space="0" w:color="D9E2EC"/>
+              <w:left w:val="single" w:sz="4" w:space="0" w:color="D9E2EC"/>
+              <w:bottom w:val="single" w:sz="4" w:space="0" w:color="D9E2EC"/>
+              <w:right w:val="single" w:sz="4" w:space="0" w:color="D9E2EC"/>
+            </w:tcBorders>
+          </w:tcPr>
+          <w:p>
+            <w:pPr>
+              <w:spacing w:after="0"/>
+            </w:pPr>
+            <w:r/>
+            <w:r>
+              <w:rPr>
+                <w:b w:val="0"/>
+                <w:sz w:val="18"/>
+              </w:rPr>
+              <w:t>fase11_matriz_inicial_pruebas.json</w:t>
+            </w:r>
+          </w:p>
+        </w:tc>
+        <w:tc>
+          <w:tcPr>
+            <w:tcW w:type="dxa" w:w="5616"/>
+            <w:vAlign w:val="center"/>
+            <w:tcBorders>
+              <w:top w:val="single" w:sz="4" w:space="0" w:color="D9E2EC"/>
+              <w:left w:val="single" w:sz="4" w:space="0" w:color="D9E2EC"/>
+              <w:bottom w:val="single" w:sz="4" w:space="0" w:color="D9E2EC"/>
+              <w:right w:val="single" w:sz="4" w:space="0" w:color="D9E2EC"/>
+            </w:tcBorders>
+          </w:tcPr>
+          <w:p>
+            <w:pPr>
+              <w:spacing w:after="0"/>
+            </w:pPr>
+            <w:r/>
+            <w:r>
+              <w:rPr>
+                <w:b w:val="0"/>
+                <w:sz w:val="18"/>
+              </w:rPr>
+              <w:t>Evidencia base de escenarios integrales de Fase 11.</w:t>
+            </w:r>
+          </w:p>
+        </w:tc>
+      </w:tr>
+      <w:tr>
+        <w:tc>
+          <w:tcPr>
+            <w:tcW w:type="dxa" w:w="3744"/>
+            <w:vAlign w:val="center"/>
+            <w:tcBorders>
+              <w:top w:val="single" w:sz="4" w:space="0" w:color="D9E2EC"/>
+              <w:left w:val="single" w:sz="4" w:space="0" w:color="D9E2EC"/>
+              <w:bottom w:val="single" w:sz="4" w:space="0" w:color="D9E2EC"/>
+              <w:right w:val="single" w:sz="4" w:space="0" w:color="D9E2EC"/>
+            </w:tcBorders>
+          </w:tcPr>
+          <w:p>
+            <w:pPr>
+              <w:spacing w:after="0"/>
+            </w:pPr>
+            <w:r/>
+            <w:r>
+              <w:rPr>
+                <w:b w:val="0"/>
+                <w:sz w:val="18"/>
+              </w:rPr>
+              <w:t>fase11_validacion_inicial_quality_gates.json</w:t>
+            </w:r>
+          </w:p>
+        </w:tc>
+        <w:tc>
+          <w:tcPr>
+            <w:tcW w:type="dxa" w:w="5616"/>
+            <w:vAlign w:val="center"/>
+            <w:tcBorders>
+              <w:top w:val="single" w:sz="4" w:space="0" w:color="D9E2EC"/>
+              <w:left w:val="single" w:sz="4" w:space="0" w:color="D9E2EC"/>
+              <w:bottom w:val="single" w:sz="4" w:space="0" w:color="D9E2EC"/>
+              <w:right w:val="single" w:sz="4" w:space="0" w:color="D9E2EC"/>
+            </w:tcBorders>
+          </w:tcPr>
+          <w:p>
+            <w:pPr>
+              <w:spacing w:after="0"/>
+            </w:pPr>
+            <w:r/>
+            <w:r>
+              <w:rPr>
+                <w:b w:val="0"/>
+                <w:sz w:val="18"/>
+              </w:rPr>
+              <w:t>Evidencia inicial de quality gates.</w:t>
+            </w:r>
+          </w:p>
+        </w:tc>
+      </w:tr>
+      <w:tr>
+        <w:tc>
+          <w:tcPr>
+            <w:tcW w:type="dxa" w:w="3744"/>
+            <w:vAlign w:val="center"/>
+            <w:tcBorders>
+              <w:top w:val="single" w:sz="4" w:space="0" w:color="D9E2EC"/>
+              <w:left w:val="single" w:sz="4" w:space="0" w:color="D9E2EC"/>
+              <w:bottom w:val="single" w:sz="4" w:space="0" w:color="D9E2EC"/>
+              <w:right w:val="single" w:sz="4" w:space="0" w:color="D9E2EC"/>
+            </w:tcBorders>
+          </w:tcPr>
+          <w:p>
+            <w:pPr>
+              <w:spacing w:after="0"/>
+            </w:pPr>
+            <w:r/>
+            <w:r>
+              <w:rPr>
+                <w:b w:val="0"/>
+                <w:sz w:val="18"/>
+              </w:rPr>
+              <w:t>fase11_validacion_final_quality_gates.json</w:t>
+            </w:r>
+          </w:p>
+        </w:tc>
+        <w:tc>
+          <w:tcPr>
+            <w:tcW w:type="dxa" w:w="5616"/>
+            <w:vAlign w:val="center"/>
+            <w:tcBorders>
+              <w:top w:val="single" w:sz="4" w:space="0" w:color="D9E2EC"/>
+              <w:left w:val="single" w:sz="4" w:space="0" w:color="D9E2EC"/>
+              <w:bottom w:val="single" w:sz="4" w:space="0" w:color="D9E2EC"/>
+              <w:right w:val="single" w:sz="4" w:space="0" w:color="D9E2EC"/>
+            </w:tcBorders>
+          </w:tcPr>
+          <w:p>
+            <w:pPr>
+              <w:spacing w:after="0"/>
+            </w:pPr>
+            <w:r/>
+            <w:r>
+              <w:rPr>
+                <w:b w:val="0"/>
+                <w:sz w:val="18"/>
+              </w:rPr>
+              <w:t>Evidencia final revalidada el 20/07/2026.</w:t>
+            </w:r>
+          </w:p>
+        </w:tc>
+      </w:tr>
+    </w:tbl>
+    <w:p/>
     <w:sectPr>
-      <w:pgSz w:w="15840" w:h="12240" w:orient="landscape"/>
-      <w:pgMar w:top="648" w:right="792" w:bottom="648" w:left="792" w:header="720" w:footer="720" w:gutter="0"/>
+      <w:headerReference w:type="default" r:id="rId9"/>
+      <w:footerReference w:type="default" r:id="rId10"/>
+      <w:pgSz w:w="12240" w:h="15840"/>
+      <w:pgMar w:top="1440" w:right="1440" w:bottom="1440" w:left="1440" w:header="708" w:footer="708" w:gutter="0"/>
       <w:cols w:space="720"/>
       <w:docGrid w:linePitch="360"/>
     </w:sectPr>
   </w:body>
 </w:document>
+</file>
+
+<file path=word/footer1.xml><?xml version="1.0" encoding="utf-8"?>
+<w:ftr xmlns:m="http://schemas.openxmlformats.org/officeDocument/2006/math" xmlns:mc="http://schemas.openxmlformats.org/markup-compatibility/2006" xmlns:mo="http://schemas.microsoft.com/office/mac/office/2008/main" xmlns:mv="urn:schemas-microsoft-com:mac:vml" xmlns:o="urn:schemas-microsoft-com:office:office" xmlns:r="http://schemas.openxmlformats.org/officeDocument/2006/relationships" xmlns:v="urn:schemas-microsoft-com:vml" xmlns:w10="urn:schemas-microsoft-com:office:word" xmlns:w14="http://schemas.microsoft.com/office/word/2010/wordml" xmlns:w="http://schemas.openxmlformats.org/wordprocessingml/2006/main" xmlns:wne="http://schemas.microsoft.com/office/word/2006/wordml" xmlns:wp14="http://schemas.microsoft.com/office/word/2010/wordprocessingDrawing" xmlns:wp="http://schemas.openxmlformats.org/drawingml/2006/wordprocessingDrawing" xmlns:wpc="http://schemas.microsoft.com/office/word/2010/wordprocessingCanvas" xmlns:wpg="http://schemas.microsoft.com/office/word/2010/wordprocessingGroup" xmlns:wpi="http://schemas.microsoft.com/office/word/2010/wordprocessingInk" xmlns:wps="http://schemas.microsoft.com/office/word/2010/wordprocessingShape" mc:Ignorable="w14 wp14">
+  <w:p>
+    <w:pPr>
+      <w:pStyle w:val="Footer"/>
+      <w:jc w:val="center"/>
+    </w:pPr>
+    <w:r>
+      <w:rPr>
+        <w:color w:val="5A6473"/>
+        <w:sz w:val="16"/>
+      </w:rPr>
+      <w:t>Documento técnico de control interno - Responsable: Javier Mejía</w:t>
+    </w:r>
+  </w:p>
+</w:ftr>
+</file>
+
+<file path=word/header1.xml><?xml version="1.0" encoding="utf-8"?>
+<w:hdr xmlns:m="http://schemas.openxmlformats.org/officeDocument/2006/math" xmlns:mc="http://schemas.openxmlformats.org/markup-compatibility/2006" xmlns:mo="http://schemas.microsoft.com/office/mac/office/2008/main" xmlns:mv="urn:schemas-microsoft-com:mac:vml" xmlns:o="urn:schemas-microsoft-com:office:office" xmlns:r="http://schemas.openxmlformats.org/officeDocument/2006/relationships" xmlns:v="urn:schemas-microsoft-com:vml" xmlns:w10="urn:schemas-microsoft-com:office:word" xmlns:w14="http://schemas.microsoft.com/office/word/2010/wordml" xmlns:w="http://schemas.openxmlformats.org/wordprocessingml/2006/main" xmlns:wne="http://schemas.microsoft.com/office/word/2006/wordml" xmlns:wp14="http://schemas.microsoft.com/office/word/2010/wordprocessingDrawing" xmlns:wp="http://schemas.openxmlformats.org/drawingml/2006/wordprocessingDrawing" xmlns:wpc="http://schemas.microsoft.com/office/word/2010/wordprocessingCanvas" xmlns:wpg="http://schemas.microsoft.com/office/word/2010/wordprocessingGroup" xmlns:wpi="http://schemas.microsoft.com/office/word/2010/wordprocessingInk" xmlns:wps="http://schemas.microsoft.com/office/word/2010/wordprocessingShape" mc:Ignorable="w14 wp14">
+  <w:p>
+    <w:pPr>
+      <w:pStyle w:val="Header"/>
+      <w:jc w:val="right"/>
+    </w:pPr>
+    <w:r>
+      <w:rPr>
+        <w:color w:val="5A6473"/>
+        <w:sz w:val="16"/>
+      </w:rPr>
+      <w:t>SGRLA-IHSS | Fase 11 - Control de calidad</w:t>
+    </w:r>
+  </w:p>
+</w:hdr>
 </file>
 
 <file path=word/numbering.xml><?xml version="1.0" encoding="utf-8"?>
@@ -2643,9 +3821,12 @@
     <w:name w:val="Normal"/>
     <w:qFormat/>
     <w:rsid w:val="00FC693F"/>
+    <w:pPr>
+      <w:spacing w:after="120" w:line="264" w:lineRule="auto"/>
+    </w:pPr>
     <w:rPr>
-      <w:rFonts w:ascii="Arial" w:hAnsi="Arial"/>
-      <w:sz w:val="18"/>
+      <w:rFonts w:ascii="Calibri" w:hAnsi="Calibri" w:eastAsia="Calibri"/>
+      <w:sz w:val="22"/>
     </w:rPr>
   </w:style>
   <w:style w:type="paragraph" w:styleId="Header">
@@ -2703,15 +3884,15 @@
     <w:pPr>
       <w:keepNext/>
       <w:keepLines/>
-      <w:spacing w:before="480" w:after="0"/>
+      <w:spacing w:before="320" w:after="160"/>
       <w:outlineLvl w:val="0"/>
     </w:pPr>
     <w:rPr>
-      <w:rFonts w:asciiTheme="majorHAnsi" w:eastAsiaTheme="majorEastAsia" w:hAnsiTheme="majorHAnsi" w:cstheme="majorBidi"/>
+      <w:rFonts w:asciiTheme="majorHAnsi" w:eastAsiaTheme="majorEastAsia" w:hAnsiTheme="majorHAnsi" w:cstheme="majorBidi" w:ascii="Calibri" w:hAnsi="Calibri" w:eastAsia="Calibri"/>
       <w:b/>
       <w:bCs/>
-      <w:color w:val="365F91" w:themeColor="accent1" w:themeShade="BF"/>
-      <w:sz w:val="28"/>
+      <w:color w:val="2E74B5"/>
+      <w:sz w:val="32"/>
       <w:szCs w:val="28"/>
     </w:rPr>
   </w:style>
@@ -2727,14 +3908,14 @@
     <w:pPr>
       <w:keepNext/>
       <w:keepLines/>
-      <w:spacing w:before="200" w:after="0"/>
+      <w:spacing w:before="240" w:after="120"/>
       <w:outlineLvl w:val="1"/>
     </w:pPr>
     <w:rPr>
-      <w:rFonts w:asciiTheme="majorHAnsi" w:eastAsiaTheme="majorEastAsia" w:hAnsiTheme="majorHAnsi" w:cstheme="majorBidi"/>
+      <w:rFonts w:asciiTheme="majorHAnsi" w:eastAsiaTheme="majorEastAsia" w:hAnsiTheme="majorHAnsi" w:cstheme="majorBidi" w:ascii="Calibri" w:hAnsi="Calibri" w:eastAsia="Calibri"/>
       <w:b/>
       <w:bCs/>
-      <w:color w:val="4F81BD" w:themeColor="accent1"/>
+      <w:color w:val="2E74B5"/>
       <w:sz w:val="26"/>
       <w:szCs w:val="26"/>
     </w:rPr>
@@ -2751,14 +3932,15 @@
     <w:pPr>
       <w:keepNext/>
       <w:keepLines/>
-      <w:spacing w:before="200" w:after="0"/>
+      <w:spacing w:before="240" w:after="120"/>
       <w:outlineLvl w:val="2"/>
     </w:pPr>
     <w:rPr>
-      <w:rFonts w:asciiTheme="majorHAnsi" w:eastAsiaTheme="majorEastAsia" w:hAnsiTheme="majorHAnsi" w:cstheme="majorBidi"/>
+      <w:rFonts w:asciiTheme="majorHAnsi" w:eastAsiaTheme="majorEastAsia" w:hAnsiTheme="majorHAnsi" w:cstheme="majorBidi" w:ascii="Calibri" w:hAnsi="Calibri" w:eastAsia="Calibri"/>
       <w:b/>
       <w:bCs/>
-      <w:color w:val="4F81BD" w:themeColor="accent1"/>
+      <w:color w:val="1F4D78"/>
+      <w:sz w:val="24"/>
     </w:rPr>
   </w:style>
   <w:style w:type="paragraph" w:styleId="Heading4">

</xml_diff>

<commit_message>
Cierra formalmente Fase 11
</commit_message>
<xml_diff>
--- a/docs/3. Módulo Matrices de Riesgos/Fase 11 - Pruebas integrales y control de calidad/Fase_11_Pruebas_Integrales_Control_Calidad_Matrices_Riesgos_SGRLA_IHSS.docx
+++ b/docs/3. Módulo Matrices de Riesgos/Fase 11 - Pruebas integrales y control de calidad/Fase_11_Pruebas_Integrales_Control_Calidad_Matrices_Riesgos_SGRLA_IHSS.docx
@@ -78,13 +78,14 @@
             <w:pPr>
               <w:spacing w:after="0"/>
             </w:pPr>
-            <w:r/>
+            <w:r>
+              <w:t>1.3</w:t>
+            </w:r>
             <w:r>
               <w:rPr>
                 <w:b w:val="0"/>
                 <w:sz w:val="18"/>
               </w:rPr>
-              <w:t>1.2</w:t>
             </w:r>
           </w:p>
         </w:tc>
@@ -180,13 +181,14 @@
             <w:pPr>
               <w:spacing w:after="0"/>
             </w:pPr>
-            <w:r/>
+            <w:r>
+              <w:t>Fase 11 aprobada y cerrada</w:t>
+            </w:r>
             <w:r>
               <w:rPr>
                 <w:b w:val="0"/>
                 <w:sz w:val="18"/>
               </w:rPr>
-              <w:t>Validación técnica final completada para aprobación</w:t>
             </w:r>
           </w:p>
         </w:tc>
@@ -536,13 +538,14 @@
             <w:pPr>
               <w:spacing w:after="0"/>
             </w:pPr>
-            <w:r/>
+            <w:r>
+              <w:t>Correcto; cierre formal aprobado</w:t>
+            </w:r>
             <w:r>
               <w:rPr>
                 <w:b w:val="0"/>
                 <w:sz w:val="18"/>
               </w:rPr>
-              <w:t>Correcto; listo para aprobación formal</w:t>
             </w:r>
           </w:p>
         </w:tc>
@@ -575,14 +578,15 @@
             <w:pPr>
               <w:spacing w:after="0"/>
             </w:pPr>
-            <w:r/>
+            <w:r>
+              <w:t>Conclusión ejecutiva: la Fase 11 queda aprobada y cerrada formalmente por Javier Mejía. No se reabren fases anteriores; este documento consolida la evidencia final de control de calidad.</w:t>
+            </w:r>
             <w:r>
               <w:rPr>
                 <w:b/>
                 <w:color w:val="0B2545"/>
                 <w:sz w:val="18"/>
               </w:rPr>
-              <w:t>Conclusión ejecutiva: la Fase 11 queda técnicamente validada. No se reabren fases anteriores; este documento consolida la evidencia para aprobación formal de Javier Mejía.</w:t>
             </w:r>
           </w:p>
         </w:tc>
@@ -594,11 +598,17 @@
         <w:pStyle w:val="Heading1"/>
       </w:pPr>
       <w:r>
+        <w:rPr>
+          <w:sz w:val="22"/>
+        </w:rPr>
         <w:t>1. Objetivo</w:t>
       </w:r>
     </w:p>
     <w:p>
       <w:r>
+        <w:rPr>
+          <w:sz w:val="22"/>
+        </w:rPr>
         <w:t>Consolidar la validación integral del módulo Matrices de Riesgos antes de su cierre formal, verificando pruebas automatizadas, controles funcionales, limpieza visual, separación de módulos, auditoría, flujos críticos y evidencia técnica.</w:t>
       </w:r>
     </w:p>
@@ -607,6 +617,9 @@
         <w:pStyle w:val="Heading1"/>
       </w:pPr>
       <w:r>
+        <w:rPr>
+          <w:sz w:val="22"/>
+        </w:rPr>
         <w:t>2. Evidencia técnica ejecutada</w:t>
       </w:r>
     </w:p>
@@ -1273,6 +1286,9 @@
     <w:p/>
     <w:p>
       <w:r>
+        <w:rPr>
+          <w:sz w:val="22"/>
+        </w:rPr>
         <w:t>Cobertura frontend registrada: sentencias 32.07%, ramas 28.23%, funciones 30.73% y líneas 32.27%.</w:t>
       </w:r>
     </w:p>
@@ -1281,6 +1297,9 @@
         <w:pStyle w:val="Heading1"/>
       </w:pPr>
       <w:r>
+        <w:rPr>
+          <w:sz w:val="22"/>
+        </w:rPr>
         <w:t>3. Matriz final de pruebas F11</w:t>
       </w:r>
     </w:p>
@@ -2638,6 +2657,9 @@
         <w:pStyle w:val="Heading1"/>
       </w:pPr>
       <w:r>
+        <w:rPr>
+          <w:sz w:val="22"/>
+        </w:rPr>
         <w:t>4. Controles confirmados</w:t>
       </w:r>
     </w:p>
@@ -2648,10 +2670,14 @@
       <w:r>
         <w:rPr>
           <w:b/>
+          <w:sz w:val="22"/>
         </w:rPr>
         <w:t xml:space="preserve">• </w:t>
       </w:r>
       <w:r>
+        <w:rPr>
+          <w:sz w:val="22"/>
+        </w:rPr>
         <w:t>No se modificó DNP.</w:t>
       </w:r>
     </w:p>
@@ -2662,10 +2688,14 @@
       <w:r>
         <w:rPr>
           <w:b/>
+          <w:sz w:val="22"/>
         </w:rPr>
         <w:t xml:space="preserve">• </w:t>
       </w:r>
       <w:r>
+        <w:rPr>
+          <w:sz w:val="22"/>
+        </w:rPr>
         <w:t>No se tocó CONTROL_ALMACEN.PROVEEDOR.</w:t>
       </w:r>
     </w:p>
@@ -2676,10 +2706,14 @@
       <w:r>
         <w:rPr>
           <w:b/>
+          <w:sz w:val="22"/>
         </w:rPr>
         <w:t xml:space="preserve">• </w:t>
       </w:r>
       <w:r>
+        <w:rPr>
+          <w:sz w:val="22"/>
+        </w:rPr>
         <w:t>No se cambió la política de permisos por módulo.</w:t>
       </w:r>
     </w:p>
@@ -2690,10 +2724,14 @@
       <w:r>
         <w:rPr>
           <w:b/>
+          <w:sz w:val="22"/>
         </w:rPr>
         <w:t xml:space="preserve">• </w:t>
       </w:r>
       <w:r>
+        <w:rPr>
+          <w:sz w:val="22"/>
+        </w:rPr>
         <w:t>No se conectó Monitoreo de Listas con Matrices de Riesgos.</w:t>
       </w:r>
     </w:p>
@@ -2704,10 +2742,14 @@
       <w:r>
         <w:rPr>
           <w:b/>
+          <w:sz w:val="22"/>
         </w:rPr>
         <w:t xml:space="preserve">• </w:t>
       </w:r>
       <w:r>
+        <w:rPr>
+          <w:sz w:val="22"/>
+        </w:rPr>
         <w:t>El frontend no calcula ponderaciones, escalas ni niveles de riesgo.</w:t>
       </w:r>
     </w:p>
@@ -2718,10 +2760,14 @@
       <w:r>
         <w:rPr>
           <w:b/>
+          <w:sz w:val="22"/>
         </w:rPr>
         <w:t xml:space="preserve">• </w:t>
       </w:r>
       <w:r>
+        <w:rPr>
+          <w:sz w:val="22"/>
+        </w:rPr>
         <w:t>Las operaciones sensibles conservan motivo obligatorio y auditoría cuando aplica.</w:t>
       </w:r>
     </w:p>
@@ -2730,6 +2776,9 @@
         <w:pStyle w:val="Heading1"/>
       </w:pPr>
       <w:r>
+        <w:rPr>
+          <w:sz w:val="22"/>
+        </w:rPr>
         <w:t>5. Observaciones corregidas en control de calidad</w:t>
       </w:r>
     </w:p>
@@ -3119,6 +3168,9 @@
         <w:pStyle w:val="Heading1"/>
       </w:pPr>
       <w:r>
+        <w:rPr>
+          <w:sz w:val="22"/>
+        </w:rPr>
         <w:t>6. Pendientes no bloqueantes</w:t>
       </w:r>
     </w:p>
@@ -3129,10 +3181,14 @@
       <w:r>
         <w:rPr>
           <w:b/>
+          <w:sz w:val="22"/>
         </w:rPr>
         <w:t xml:space="preserve">• </w:t>
       </w:r>
       <w:r>
+        <w:rPr>
+          <w:sz w:val="22"/>
+        </w:rPr>
         <w:t>Realizar recorrido visual manual con capturas finales si el equipo requiere evidencia gráfica adicional.</w:t>
       </w:r>
     </w:p>
@@ -3143,10 +3199,14 @@
       <w:r>
         <w:rPr>
           <w:b/>
+          <w:sz w:val="22"/>
         </w:rPr>
         <w:t xml:space="preserve">• </w:t>
       </w:r>
       <w:r>
+        <w:rPr>
+          <w:sz w:val="22"/>
+        </w:rPr>
         <w:t>Ejecutar prueba de rendimiento con mayor volumen de registros en red institucional si el ambiente lo permite.</w:t>
       </w:r>
     </w:p>
@@ -3157,10 +3217,14 @@
       <w:r>
         <w:rPr>
           <w:b/>
+          <w:sz w:val="22"/>
         </w:rPr>
         <w:t xml:space="preserve">• </w:t>
       </w:r>
       <w:r>
+        <w:rPr>
+          <w:sz w:val="22"/>
+        </w:rPr>
         <w:t>Revisar dependencias npm transitivas en una rama separada de mantenimiento, sin mezclarlo con Fase 11.</w:t>
       </w:r>
     </w:p>
@@ -3169,12 +3233,18 @@
         <w:pStyle w:val="Heading1"/>
       </w:pPr>
       <w:r>
+        <w:rPr>
+          <w:sz w:val="22"/>
+        </w:rPr>
         <w:t>7. Decisión de control</w:t>
       </w:r>
     </w:p>
     <w:p>
       <w:r>
-        <w:t>Con base en las pruebas ejecutadas y la evidencia técnica registrada, la Fase 11 se considera técnicamente validada y lista para aprobación formal. El cierre definitivo debe quedar confirmado por Javier Mejía antes de avanzar con nuevos alcances o con la construcción del tablero ejecutivo consolidado.</w:t>
+        <w:rPr>
+          <w:sz w:val="22"/>
+        </w:rPr>
+        <w:t>Con base en las pruebas ejecutadas y la evidencia técnica registrada, la Fase 11 queda aprobada y cerrada formalmente. Cualquier alcance nuevo deberá gestionarse como continuidad planificada, mantenimiento controlado o fase posterior según el plan vigente.</w:t>
       </w:r>
     </w:p>
     <w:p>
@@ -3182,6 +3252,9 @@
         <w:pStyle w:val="Heading1"/>
       </w:pPr>
       <w:r>
+        <w:rPr>
+          <w:sz w:val="22"/>
+        </w:rPr>
         <w:t>8. Archivos de evidencia</w:t>
       </w:r>
     </w:p>
@@ -3410,6 +3483,33 @@
       </w:tr>
     </w:tbl>
     <w:p/>
+    <w:p>
+      <w:pPr>
+        <w:pStyle w:val="Heading1"/>
+      </w:pPr>
+      <w:r>
+        <w:rPr>
+          <w:sz w:val="22"/>
+        </w:rPr>
+        <w:t>9. Cierre formal de Fase 11</w:t>
+      </w:r>
+    </w:p>
+    <w:p>
+      <w:r>
+        <w:rPr>
+          <w:sz w:val="22"/>
+        </w:rPr>
+        <w:t>Javier Mejía aprueba formalmente el cierre de la Fase 11 el 20/07/2026. La fase queda cerrada a nivel documental y técnico con evidencia de pruebas backend, frontend, build, E2E y controles funcionales registrados.</w:t>
+      </w:r>
+    </w:p>
+    <w:p>
+      <w:r>
+        <w:rPr>
+          <w:sz w:val="22"/>
+        </w:rPr>
+        <w:t>La continuidad del proyecto deberá respetar las reglas ya aprobadas: permisos por módulo, cálculo en backend, separación entre Monitoreo de Listas y Matrices de Riesgos, sin escritura hacia DNP y sin uso de CONTROL_ALMACEN.PROVEEDOR.</w:t>
+      </w:r>
+    </w:p>
     <w:sectPr>
       <w:headerReference w:type="default" r:id="rId9"/>
       <w:footerReference w:type="default" r:id="rId10"/>

</xml_diff>